<commit_message>
Another update on devrai-pogi
</commit_message>
<xml_diff>
--- a/documents/AgriPrice_Draft_Revised.docx
+++ b/documents/AgriPrice_Draft_Revised.docx
@@ -682,7 +682,22 @@
           <w:sz w:val="24"/>
           <w:szCs w:val="24"/>
         </w:rPr>
-        <w:t xml:space="preserve">Meanwhile, the system is bound by several limitations. Expanding the geographical scope or adding other agricultural commodities would require entirely different localized datasets that are not consistently accessible. Furthermore, the model can predict price movements for a 48- to 72-hour lead time only; projecting beyond this timeframe decreases the accuracy of the LSTM algorithm due to the highly volatile nature of the Philippine market. The system is also strictly internet- and source-dependent. In the event of server downtime, API deprecation, or sudden layout changes to the DA-AMAS portal, the automated data extraction modules will fail. During such downtimes, the forecasting model remains usable by utilizing the 'Last Observed Value' in its local database, but it will not reflect the most current real-world market shifts. The accuracy of the forecast is also not guaranteed during unprecedented global economic crashes. Finally, the system strictly does not factor in unpredictable environmental variables such as daily weather conditions, rainfall, or typhoons.</w:t>
+        <w:t xml:space="preserve">Meanwhile, the system is bound by several limitations. Expanding the geographical scope or adding other agricultural commodities would require entirely different localized datasets that are not consistently accessible. Furthermore, the model can predict price movements for a 48- to 72-hour lead time only; projecting beyond this timeframe decreases the accuracy of the LSTM algorithm due to the highly volatile nature of the Philippine market. The system is also strictly internet- and source-dependent. In the event of server downtime, API deprecation, or sudden layout changes to the DA-AMAS portal, the automated data extraction modules will fail. During such downtimes, the forecasting model remains usable by utilizing the 'Last Observed Value' in its local database, but it will not reflect the most current real-world market shifts. The accuracy of the forecast is also not guaranteed during unprecedented global economic crashes. The system does not factor in unpredictable environmental variables such as daily weather conditions, rainfall, or typhoons, and it does not explicitly encode asymmetric ("rockets and feathers") price transmission; any such pattern must be learned from the diesel and exchange-rate inputs. Finally, the DA-AMAS rice price record before April 2025 was available to the researchers only at weekly or irregular intervals, so the model's reported accuracy is measured on the daily-observation period from April 2025 onward.</w:t>
+      </w:r>
+    </w:p>
+    <w:p>
+      <w:pPr>
+        <w:spacing w:after="200" w:before="100"/>
+      </w:pPr>
+      <w:r>
+        <w:rPr>
+          <w:b/>
+          <w:bCs/>
+          <w:color w:val="C00000"/>
+          <w:sz w:val="22"/>
+          <w:szCs w:val="22"/>
+        </w:rPr>
+        <w:t xml:space="preserve">[UPDATED 27 SEP 2026 — Two limitations added: asymmetric price transmission is not explicitly modelled (resolves the Theoretical Framework note), and pre-2025 DA data was weekly (resolves the dataset-span note in Chapter 3). Delete this note before final printing.]</w:t>
       </w:r>
     </w:p>
     <w:p>
@@ -910,7 +925,7 @@
           <w:sz w:val="24"/>
           <w:szCs w:val="24"/>
         </w:rPr>
-        <w:t xml:space="preserve">Conventional time-series techniques such as ARIMA are still useful for identifying linear trends within stable, stationary datasets; however, their predictive reliability suffers significantly when commodity prices are influenced by non-linear market anomalies and erratic macroeconomic disruptions. Sun et al. (2023) found that agricultural price forecasting has shifted toward deep learning methodologies for this reason. Theofilou et al. (2025), in a systematic literature review, confirmed deep learning models have become standard for staple crop price projection; this is supported by Manogna et al. (2025) and, locally, Duyapat (2025), who showed machine learning configurations produced significantly lower prediction errors than univariate techniques on Philippine rice price indices.</w:t>
+        <w:t xml:space="preserve">Conventional time-series techniques such as ARIMA are still useful for identifying linear trends within stable, stationary datasets; however, their predictive reliability suffers significantly when commodity prices are influenced by non-linear market anomalies and erratic macroeconomic disruptions. Sun et al. (2023) found that agricultural price forecasting has shifted toward deep learning methodologies for this reason. Theofilou et al. (2025), in a systematic literature review, confirmed deep learning models have become standard for staple crop price projection; this is supported by Manogna et al. (2025) and, locally, Duyapat (2025), who showed machine learning configurations produced significantly lower prediction errors than univariate techniques on Philippine rice price indices. The evidence is not one-sided, however. Comparing statistical and machine learning methods on 1,045 monthly series from the M3 competition, Makridakis et al. (2018) found the established statistical methods more accurate than the machine learning methods tested, and in the M4 competition the most accurate submissions were mostly combinations of methods, the winner being a hybrid of a statistical model and a recurrent neural network (Makridakis et al., 2020). This study therefore tests its LSTM against statistical baselines instead of assuming it is superior.</w:t>
       </w:r>
     </w:p>
     <w:p>
@@ -925,7 +940,7 @@
           <w:sz w:val="22"/>
           <w:szCs w:val="22"/>
         </w:rPr>
-        <w:t xml:space="preserve">[REVISION NOTE — counter-evidence still required — insert at least one study where deep learning did NOT clearly outperform a statistical baseline in agricultural/commodity forecasting, or state explicitly that none was found in your search. Populate the Synthesis Matrix below with your team's actual source list; this paragraph should not stand as one-sided until that's done.]</w:t>
+        <w:t xml:space="preserve">[REVISION NOTE — counter-evidence added (Makridakis et al., 2018; 2020). Add both, plus Bates and Granger (1969) and Kalman (1960) cited in Chapter 3, to the References. Still required: populate the Synthesis Matrix below with your team's actual source list.]</w:t>
       </w:r>
     </w:p>
     <w:p>
@@ -1027,7 +1042,7 @@
           <w:sz w:val="24"/>
           <w:szCs w:val="24"/>
         </w:rPr>
-        <w:t xml:space="preserve">Recent international studies confirm multivariate LSTM models consistently outperform classical statistical benchmarks in commodity markets (Gu et al., 2022; Liu et al., 2025). Within the domestic context, Fuselero (2022) applied deep recurrent architectures to model daily solar radiation sequences in Dumaguete, confirming these networks retain stability on volatile local timelines. However, Parreno (2026) found that while national energy and financial sectors have transitioned to LSTM configurations, agricultural price tracking in the Philippines is still limited by static, linear, and adapted multivariate baseline systems — the specific research gap this study addresses.</w:t>
+        <w:t xml:space="preserve">Recent international studies report that multivariate LSTM models often outperform classical statistical benchmarks in commodity markets (Gu et al., 2022; Liu et al., 2025). Within the domestic context, Fuselero (2022) applied deep recurrent architectures to model daily solar radiation sequences in Dumaguete, confirming these networks retain stability on volatile local timelines. However, Parreno (2026) found that while national energy and financial sectors have transitioned to LSTM configurations, agricultural price tracking in the Philippines is still limited by static, linear, and adapted multivariate baseline systems — the specific research gap this study addresses.</w:t>
       </w:r>
     </w:p>
     <w:p>
@@ -2220,7 +2235,7 @@
           <w:sz w:val="24"/>
           <w:szCs w:val="24"/>
         </w:rPr>
-        <w:t xml:space="preserve">The multivariate LSTM model is trained on fifteen (15) years of historical daily rice retail price data sourced from DA-AMAS, spanning multiple full agricultural seasonality cycles, currency regimes, and at least one major global rice-export disruption event. This span was selected to ensure the model is exposed to sufficient historical volatility, including extended lean-season and harvest-season transitions, rather than a single short-term price regime.</w:t>
+        <w:t xml:space="preserve">The multivariate LSTM model is trained on the DA-AMAS retail rice price record from January 2015 to September 2026, spanning multiple full agricultural seasonality cycles, currency regimes, and the 2023–2024 global rice-export disruption. The granularity of this record is not uniform, and the study discloses it: from 2015 to 2024 the DA-AMAS prices available to the researchers were published at weekly or irregular intervals and are carried forward day by day to align them with the daily feature table, whereas from April 2025 onward prices are observed daily (the price changes on about 83% of days). April 1, 2025 is therefore treated as the start of the daily-observation era, and the model is evaluated only on that era. Gaps in the 2026 public bulletins were filled with values supplied directly by the Department of Agriculture, which are stored as separately flagged verified rows.</w:t>
       </w:r>
     </w:p>
     <w:p>
@@ -2235,21 +2250,21 @@
           <w:sz w:val="22"/>
           <w:szCs w:val="22"/>
         </w:rPr>
-        <w:t xml:space="preserve">[REVISION NOTE — dataset span now stated explicitly (15 years) per team confirmation. CONFIRM WITH YOUR TEAM: verify DA-AMAS records are available at daily granularity across the full 15-year span — if earlier years only have weekly or irregular reporting, that gap must be disclosed here as a limitation rather than left implicit.]</w:t>
-      </w:r>
-    </w:p>
-    <w:p>
-      <w:pPr>
-        <w:spacing w:after="200" w:line="360"/>
-        <w:ind w:firstLine="720"/>
-        <w:jc w:val="both"/>
-      </w:pPr>
-      <w:r>
-        <w:rPr>
-          <w:sz w:val="24"/>
-          <w:szCs w:val="24"/>
-        </w:rPr>
-        <w:t xml:space="preserve">The dataset is partitioned chronologically to preserve temporal ordering and prevent data leakage: the earliest 70% of observations are used for training, the subsequent 15% for validation and hyperparameter tuning, and the most recent 15% for held-out testing. No random shuffling is applied across the time axis at any stage of model development.</w:t>
+        <w:t xml:space="preserve">[UPDATED 27 SEP 2026 — "fifteen years of daily data" corrected to the actual 2015–2026 record, and the weekly-then-daily granularity disclosed here and in Scope and Limitations, as this note required. Delete this note before final printing.]</w:t>
+      </w:r>
+    </w:p>
+    <w:p>
+      <w:pPr>
+        <w:spacing w:after="200" w:line="360"/>
+        <w:ind w:firstLine="720"/>
+        <w:jc w:val="both"/>
+      </w:pPr>
+      <w:r>
+        <w:rPr>
+          <w:sz w:val="24"/>
+          <w:szCs w:val="24"/>
+        </w:rPr>
+        <w:t xml:space="preserve">The dataset is partitioned chronologically to preserve temporal ordering and prevent data leakage, using a regime-aware split: observations up to March 31, 2025 are used for training; April 1 to October 6, 2025 for validation (model selection and early stopping); and October 7, 2025 to September 24, 2026 is held out for testing. Validation and test are both drawn from the daily-observation era, because a plain 70/15/15 split placed an almost static, largely carried-forward period in validation (88% unchanged days) while the test period moved almost daily, so a model would be selected on one kind of data and scored on another. No random shuffling is applied at any stage, the min-max scaler is fitted on training rows only, and every run is seeded so that reported metrics are reproducible.</w:t>
       </w:r>
     </w:p>
     <w:p>
@@ -2264,7 +2279,7 @@
           <w:sz w:val="22"/>
           <w:szCs w:val="22"/>
         </w:rPr>
-        <w:t xml:space="preserve">[REVISION NOTE — MANDATORY — this chronological split description must match your actual code before this document is submitted. The system was previously implemented with a random split, which invalidates any MAE/RMSE reported on a time series. Re-implement the split as chronological, retrain, and re-run your evaluation metrics before your defense date. Do not defend this document until that is true.]</w:t>
+        <w:t xml:space="preserve">[UPDATED 27 SEP 2026 — the split is chronological and regime-aware in the code (model/train.py), and every metric reported in Chapter 4 comes from it. Delete this note before final printing.]</w:t>
       </w:r>
     </w:p>
     <w:p>
@@ -2321,7 +2336,7 @@
           <w:sz w:val="24"/>
           <w:szCs w:val="24"/>
         </w:rPr>
-        <w:t xml:space="preserve">To prove the system's effectiveness and accuracy, testing was divided into two tracks: technical model validation and user-centered system evaluation. First, the accuracy of the LSTM model is measured using established forecasting metrics, primarily Mean Absolute Error (MAE), Root Mean Squared Error (RMSE), and Augmented Dickey-Fuller (ADF), benchmarked against a naive persistence baseline model in which the forecasted price for time t+n is assumed equal to the last observed price at time t. This comparison establishes whether the added complexity of the multivariate LSTM architecture yields a measurable accuracy improvement over a trivial forecasting approach.</w:t>
+        <w:t xml:space="preserve">To prove the system's effectiveness and accuracy, testing was divided into two tracks: technical model validation and user-centered system evaluation. First, the accuracy of the forecasting model is measured using established forecasting metrics, primarily Mean Absolute Error (MAE) and Root Mean Squared Error (RMSE), with the Augmented Dickey-Fuller (ADF) test used to check the stationarity of the price series. The model is benchmarked against two baselines: a naive persistence baseline, in which the forecasted price for time t+n is assumed equal to the last observed price at time t, and an ARIMA(1,1,1) model. This comparison establishes whether the added complexity of the multivariate LSTM-based system yields a measurable accuracy improvement over a trivial and a classical statistical forecasting approach.</w:t>
       </w:r>
     </w:p>
     <w:p>
@@ -2336,7 +2351,7 @@
           <w:sz w:val="22"/>
           <w:szCs w:val="22"/>
         </w:rPr>
-        <w:t xml:space="preserve">[REVISION NOTE — baseline comparison added per team confirmation that no baseline currently exists. MANDATORY: implement the naive persistence baseline (minimum requirement) before defense; an ARIMA baseline is strongly recommended in addition, as it is significantly more defensible in front of a technical panel. Update this paragraph to name both if ARIMA is implemented.]</w:t>
+        <w:t xml:space="preserve">[UPDATED 27 SEP 2026 — both baselines (naive persistence and ARIMA(1,1,1)) are implemented and reported in model/meta.json and Admin → Metrics. Delete this note before final printing.]</w:t>
       </w:r>
     </w:p>
     <w:p>
@@ -2406,7 +2421,7 @@
           <w:sz w:val="24"/>
           <w:szCs w:val="24"/>
         </w:rPr>
-        <w:t xml:space="preserve">Based on related literature, LSTM networks consistently outperform traditional statistical forecasting methods like ARIMA in agricultural and commodity price prediction tasks. For this system, the multivariate LSTM configuration takes in multivariate input features: daily rice retail prices from DA-AMAS, the USD to PHP exchange rate, weekly diesel pump prices, gasoline prices, rice-stock inventory, and farmgate prices, together with engineered agricultural-seasonality (cyclical month), price-lag, and rolling-average features. It then produces a two to three day price forecast for eight commercial rice categories.</w:t>
+        <w:t xml:space="preserve">Related literature reports that LSTM networks frequently outperform traditional statistical forecasting methods such as ARIMA in agricultural and commodity price prediction, although large forecasting competitions also show that simple statistical methods and combinations of forecasts remain hard to beat (Makridakis et al., 2018; 2020). For this system, the multivariate LSTM configuration takes in multivariate input features: daily rice retail prices from DA-AMAS, the USD to PHP exchange rate, weekly diesel pump prices, gasoline prices, rice-stock inventory, and farmgate prices, together with engineered agricultural-seasonality (cyclical month), price-lag, and rolling-average features. It then produces a two to three day price forecast for eight commercial rice categories.</w:t>
       </w:r>
     </w:p>
     <w:p>
@@ -2421,48 +2436,6 @@
           <w:szCs w:val="24"/>
         </w:rPr>
         <w:t xml:space="preserve">The researchers selected this algorithm specifically for AgriPrice to address the Philippine rice market's nonlinear and volatile characteristics, including the 'rockets and feathers' price transmission phenomenon identified by Bathan et al. (2025). A model lacking the capability to process multiple economic variables simultaneously and learn from long historical sequences would fail to address the research gap identified in this study.</w:t>
-      </w:r>
-    </w:p>
-    <w:p>
-      <w:pPr>
-        <w:spacing w:after="150" w:before="300"/>
-      </w:pPr>
-      <w:r>
-        <w:rPr>
-          <w:b/>
-          <w:bCs/>
-          <w:sz w:val="24"/>
-          <w:szCs w:val="24"/>
-        </w:rPr>
-        <w:t xml:space="preserve">System Design</w:t>
-      </w:r>
-    </w:p>
-    <w:p>
-      <w:pPr>
-        <w:spacing w:after="200" w:line="360"/>
-        <w:ind w:firstLine="720"/>
-        <w:jc w:val="both"/>
-      </w:pPr>
-      <w:r>
-        <w:rPr>
-          <w:sz w:val="24"/>
-          <w:szCs w:val="24"/>
-        </w:rPr>
-        <w:t xml:space="preserve">This study uses an Agile development strategy to design and build the AgriPrice Forecasting System, as the project's success is dependent on the system's capacity to remain accurate and accessible within a highly unpredictable rice market. The automated data ingestion module, the backend LSTM forecasting engine, and the web-based interface where users view the results are the three primary building blocks of this study's methodology.</w:t>
-      </w:r>
-    </w:p>
-    <w:p>
-      <w:pPr>
-        <w:spacing w:after="200" w:line="360"/>
-        <w:ind w:firstLine="720"/>
-        <w:jc w:val="both"/>
-      </w:pPr>
-      <w:r>
-        <w:rPr>
-          <w:sz w:val="24"/>
-          <w:szCs w:val="24"/>
-        </w:rPr>
-        <w:t xml:space="preserve">During these phases, the researchers work on "fine-tuning" the system's learning — for example, constantly experimenting with how far back the model should look at previous data (the "look-back window") to produce the best, most accurate forecast for the next 48 to 72 hours. The improvements are driven by two feedback loops: IT experts assess the stability of the codebase and AI logic, and households and local vendors assess whether the price charts and alerts on the deployed website are easy to understand and useful for daily budgeting.</w:t>
       </w:r>
     </w:p>
     <w:p>
@@ -2478,81 +2451,49 @@
           <w:sz w:val="24"/>
           <w:szCs w:val="24"/>
         </w:rPr>
-        <w:t xml:space="preserve">Planning</w:t>
-      </w:r>
-    </w:p>
-    <w:p>
-      <w:pPr>
-        <w:spacing w:after="200" w:line="360"/>
-        <w:ind w:firstLine="720"/>
-        <w:jc w:val="both"/>
-      </w:pPr>
-      <w:r>
-        <w:rPr>
-          <w:sz w:val="24"/>
-          <w:szCs w:val="24"/>
-        </w:rPr>
-        <w:t xml:space="preserve">The planning phase started with the identification of a major 'information gap' in the Philippine agricultural sector, particularly the lack of proactive price signals for urban stakeholders in the NCR (Reyes et al., 2024). Researchers restricted their study to eight commercial categories of rice and identified the 48- to 72-hour forecast horizon as the critical window for "Lead-Time Awareness." During this phase, the team evaluated the technical feasibility of LSTM networks and identified the external data flows needed, such as the DA-AMAS price index and global fuel rates.</w:t>
-      </w:r>
-    </w:p>
-    <w:p>
-      <w:pPr>
-        <w:spacing w:after="100" w:before="200"/>
-      </w:pPr>
-      <w:r>
-        <w:rPr>
-          <w:b/>
-          <w:bCs/>
-          <w:i/>
-          <w:iCs/>
-          <w:sz w:val="24"/>
-          <w:szCs w:val="24"/>
-        </w:rPr>
-        <w:t xml:space="preserve">Requirements Analysis</w:t>
-      </w:r>
-    </w:p>
-    <w:p>
-      <w:pPr>
-        <w:spacing w:after="200" w:line="360"/>
-        <w:ind w:firstLine="720"/>
-        <w:jc w:val="both"/>
-      </w:pPr>
-      <w:r>
-        <w:rPr>
-          <w:sz w:val="24"/>
-          <w:szCs w:val="24"/>
-        </w:rPr>
-        <w:t xml:space="preserve">In the analysis phase, the researchers focused on identifying the functional and technical requirements to make the system a reliable decision-support tool. The study found that current government reporting is largely backward-looking and thus cannot help users anticipate "price shocks" before they occur. The processing requirements were divided into an automated sequential data pipeline: the data ingestion phase continuously extracts raw data from PDFs and financial APIs, the processing layer performs missing-value handling and min-max normalization, the analytical core uses the multivariate LSTM network to recognize the seasonal trend, and finally, the delivery engine converts the granular outputs into user-friendly trend indicators.</w:t>
-      </w:r>
-    </w:p>
-    <w:p>
-      <w:pPr>
-        <w:spacing w:after="100" w:before="200"/>
-      </w:pPr>
-      <w:r>
-        <w:rPr>
-          <w:b/>
-          <w:bCs/>
-          <w:i/>
-          <w:iCs/>
-          <w:sz w:val="24"/>
-          <w:szCs w:val="24"/>
-        </w:rPr>
-        <w:t xml:space="preserve">Designing</w:t>
-      </w:r>
-    </w:p>
-    <w:p>
-      <w:pPr>
-        <w:spacing w:after="200" w:line="360"/>
-        <w:ind w:firstLine="720"/>
-        <w:jc w:val="both"/>
-      </w:pPr>
-      <w:r>
-        <w:rPr>
-          <w:sz w:val="24"/>
-          <w:szCs w:val="24"/>
-        </w:rPr>
-        <w:t xml:space="preserve">During the design phase, the technical design of AgriPrice has been developed with a Python back-end and a SQLite3 database to ensure reliable data persistence and fast forecast execution. The system architecture was built to support a dual-viewing framework to isolate complex technical analytics from general user views. A restricted admin interface was designed for IT experts and DA-AMAS representatives to review backend metrics, data extraction logs, and historical error rates. In contrast, a simplified public dashboard was engineered for standard desktop and mobile web browsers to serve as a general viewing platform for non-technical stakeholders — households and vendors.</w:t>
+        <w:t xml:space="preserve">LSTM Hybrid and Adaptive Ensemble</w:t>
+      </w:r>
+    </w:p>
+    <w:p>
+      <w:pPr>
+        <w:spacing w:after="200" w:line="360"/>
+        <w:ind w:firstLine="720"/>
+        <w:jc w:val="both"/>
+      </w:pPr>
+      <w:r>
+        <w:rPr>
+          <w:sz w:val="24"/>
+          <w:szCs w:val="24"/>
+        </w:rPr>
+        <w:t xml:space="preserve">In the implemented system the LSTM network's output is not published on its own. Each rice type's network predicts the change from the last observed price (anchored-delta mode), and this change is combined with a mean-reversion term. Daily DA prices tend to partly reverse the previous day's move (the lag-1 autocorrelation of daily changes is between −0.17 and −0.41 across the eight rice types), so one regression coefficient per forecast day and per weekday is re-estimated on the most recent 120 days before every forecast and applied only when it is statistically significant (|t| ≥ 2). The weekday matters because the Sunday bulletin covers fewer markets and is about five times noisier than weekday bulletins. This combination is referred to as the LSTM hybrid.</w:t>
+      </w:r>
+    </w:p>
+    <w:p>
+      <w:pPr>
+        <w:spacing w:after="200" w:line="360"/>
+        <w:ind w:firstLine="720"/>
+        <w:jc w:val="both"/>
+      </w:pPr>
+      <w:r>
+        <w:rPr>
+          <w:sz w:val="24"/>
+          <w:szCs w:val="24"/>
+        </w:rPr>
+        <w:t xml:space="preserve">The published forecast is an adaptive ensemble of three forecasters: (1) the LSTM hybrid, (2) the ARIMA(1,1,1) model, and (3) a local-level Kalman filter (Kalman, 1960) whose noise variance differs by weekday. Each day the three forecasts are weighted by the inverse of their mean squared error over the last 30 realised forecasts, separately for each rice type and forecast day (Bates &amp; Granger, 1969). Only past errors are used, so a weight never depends on the price being forecast. Forecast combination was adopted because, in this study's evaluation, no single model was most accurate for every rice type, and combining close competitors is an established way to reduce forecast error (Makridakis et al., 2020).</w:t>
+      </w:r>
+    </w:p>
+    <w:p>
+      <w:pPr>
+        <w:spacing w:after="200" w:line="360"/>
+        <w:ind w:firstLine="720"/>
+        <w:jc w:val="both"/>
+      </w:pPr>
+      <w:r>
+        <w:rPr>
+          <w:sz w:val="24"/>
+          <w:szCs w:val="24"/>
+        </w:rPr>
+        <w:t xml:space="preserve">Every forecast is published with a price range computed by split conformal prediction from the ensemble's own errors over the last 60 observations. Because daily price errors are not fully exchangeable, the nominal level is set to 93% so that the realised coverage is approximately 90%. Forecast changes smaller than PHP 0.10 per kilogram are published as "steady" rather than as a rise or a fall, because the model cannot call the direction of moves that small better than chance.</w:t>
       </w:r>
     </w:p>
     <w:p>
@@ -2567,7 +2508,49 @@
           <w:sz w:val="22"/>
           <w:szCs w:val="22"/>
         </w:rPr>
-        <w:t xml:space="preserve">[REVISION NOTE — terminology fix — "data scraping logs" corrected to "data extraction logs" to match the PDF-extraction pipeline. Desktop-and-mobile (responsive) scope restated for consistency with Objective 6.4 and the Purpose and Description section above.]</w:t>
+        <w:t xml:space="preserve">[UPDATED 27 SEP 2026 — New subsection. It describes the forecaster as actually deployed (model/predict.py, model/ensemble.py, model/mean_reversion.py). The LSTM remains the core learned component; whether it adds accuracy is reported in Chapter 4. Delete this note before final printing.]</w:t>
+      </w:r>
+    </w:p>
+    <w:p>
+      <w:pPr>
+        <w:spacing w:after="150" w:before="300"/>
+      </w:pPr>
+      <w:r>
+        <w:rPr>
+          <w:b/>
+          <w:bCs/>
+          <w:sz w:val="24"/>
+          <w:szCs w:val="24"/>
+        </w:rPr>
+        <w:t xml:space="preserve">System Design</w:t>
+      </w:r>
+    </w:p>
+    <w:p>
+      <w:pPr>
+        <w:spacing w:after="200" w:line="360"/>
+        <w:ind w:firstLine="720"/>
+        <w:jc w:val="both"/>
+      </w:pPr>
+      <w:r>
+        <w:rPr>
+          <w:sz w:val="24"/>
+          <w:szCs w:val="24"/>
+        </w:rPr>
+        <w:t xml:space="preserve">This study uses an Agile development strategy to design and build the AgriPrice Forecasting System, as the project's success is dependent on the system's capacity to remain accurate and accessible within a highly unpredictable rice market. The automated data ingestion module, the backend LSTM forecasting engine, and the web-based interface where users view the results are the three primary building blocks of this study's methodology.</w:t>
+      </w:r>
+    </w:p>
+    <w:p>
+      <w:pPr>
+        <w:spacing w:after="200" w:line="360"/>
+        <w:ind w:firstLine="720"/>
+        <w:jc w:val="both"/>
+      </w:pPr>
+      <w:r>
+        <w:rPr>
+          <w:sz w:val="24"/>
+          <w:szCs w:val="24"/>
+        </w:rPr>
+        <w:t xml:space="preserve">During these phases, the researchers work on "fine-tuning" the system's learning — for example, constantly experimenting with how far back the model should look at previous data (the "look-back window") to produce the best, most accurate forecast for the next 48 to 72 hours. The improvements are driven by two feedback loops: IT experts assess the stability of the codebase and AI logic, and households and local vendors assess whether the price charts and alerts on the deployed website are easy to understand and useful for daily budgeting.</w:t>
       </w:r>
     </w:p>
     <w:p>
@@ -2583,49 +2566,21 @@
           <w:sz w:val="24"/>
           <w:szCs w:val="24"/>
         </w:rPr>
-        <w:t xml:space="preserve">Implementation (Design Phase Summary)</w:t>
-      </w:r>
-    </w:p>
-    <w:p>
-      <w:pPr>
-        <w:spacing w:after="200" w:line="360"/>
-        <w:ind w:firstLine="720"/>
-        <w:jc w:val="both"/>
-      </w:pPr>
-      <w:r>
-        <w:rPr>
-          <w:sz w:val="24"/>
-          <w:szCs w:val="24"/>
-        </w:rPr>
-        <w:t xml:space="preserve">The implementation phase translated the final technical specifications into working software structures. The researchers began by programmatically setting up the data ingestion pipeline, using Python to build a custom PDF price-table extraction tool and financial API connectors. These script modules were designed to automatically extract daily retail rice data directly from official DA-AMAS PDF releases and fetch global currency parameters, structuring and committing these time-series datasets into a local SQLite3 database.</w:t>
-      </w:r>
-    </w:p>
-    <w:p>
-      <w:pPr>
-        <w:spacing w:after="200" w:line="360"/>
-        <w:ind w:firstLine="720"/>
-        <w:jc w:val="both"/>
-      </w:pPr>
-      <w:r>
-        <w:rPr>
-          <w:sz w:val="24"/>
-          <w:szCs w:val="24"/>
-        </w:rPr>
-        <w:t xml:space="preserve">Simultaneously, the AgriPrice deep learning core was built in a native Python environment with dedicated machine learning frameworks. The researchers configured the topology of the multivariate LSTM network by defining dense computational layers, setting dropout regularizations, and sizing look-back windows to successfully read and process the aligned cross-commodity inputs and historical sequences stored in the SQLite3 tables.</w:t>
-      </w:r>
-    </w:p>
-    <w:p>
-      <w:pPr>
-        <w:spacing w:after="200" w:line="360"/>
-        <w:ind w:firstLine="720"/>
-        <w:jc w:val="both"/>
-      </w:pPr>
-      <w:r>
-        <w:rPr>
-          <w:sz w:val="24"/>
-          <w:szCs w:val="24"/>
-        </w:rPr>
-        <w:t xml:space="preserve">The last block of development focused on building the user-facing web interface using vanilla HTML5, CSS3, and JavaScript, optimized for standard desktop and mobile web browsers. The design employs asynchronous JavaScript routines to communicate securely with the Python data environment, dynamically displaying market predictions, directional trend arrows, and historical point comparisons without full page refreshes.</w:t>
+        <w:t xml:space="preserve">Planning</w:t>
+      </w:r>
+    </w:p>
+    <w:p>
+      <w:pPr>
+        <w:spacing w:after="200" w:line="360"/>
+        <w:ind w:firstLine="720"/>
+        <w:jc w:val="both"/>
+      </w:pPr>
+      <w:r>
+        <w:rPr>
+          <w:sz w:val="24"/>
+          <w:szCs w:val="24"/>
+        </w:rPr>
+        <w:t xml:space="preserve">The planning phase started with the identification of a major 'information gap' in the Philippine agricultural sector, particularly the lack of proactive price signals for urban stakeholders in the NCR (Reyes et al., 2024). Researchers restricted their study to eight commercial categories of rice and identified the 48- to 72-hour forecast horizon as the critical window for "Lead-Time Awareness." During this phase, the team evaluated the technical feasibility of LSTM networks and identified the external data flows needed, such as the DA-AMAS price index and global fuel rates.</w:t>
       </w:r>
     </w:p>
     <w:p>
@@ -2641,35 +2596,21 @@
           <w:sz w:val="24"/>
           <w:szCs w:val="24"/>
         </w:rPr>
-        <w:t xml:space="preserve">Testing</w:t>
-      </w:r>
-    </w:p>
-    <w:p>
-      <w:pPr>
-        <w:spacing w:after="200" w:line="360"/>
-        <w:ind w:firstLine="720"/>
-        <w:jc w:val="both"/>
-      </w:pPr>
-      <w:r>
-        <w:rPr>
-          <w:sz w:val="24"/>
-          <w:szCs w:val="24"/>
-        </w:rPr>
-        <w:t xml:space="preserve">The testing phase consisted of a rigorous dual-track validation pipeline run immediately after system compilation to ensure execution stability on standard desktop and mobile web browsers and model precision under market volatility. The first track was technical model validation, where the mathematical accuracy of the trained multivariate LSTM architecture was evaluated against historical pricing trends and macroeconomic parameters, benchmarked against a naive persistence baseline. This predictive layer was critically audited using Mean Absolute Error (MAE) to set the baseline margin of error in raw Philippine pesos and Root Mean Squared Error (RMSE) to heavily penalize large anomalous forecasting errors.</w:t>
-      </w:r>
-    </w:p>
-    <w:p>
-      <w:pPr>
-        <w:spacing w:after="200" w:line="360"/>
-        <w:ind w:firstLine="720"/>
-        <w:jc w:val="both"/>
-      </w:pPr>
-      <w:r>
-        <w:rPr>
-          <w:sz w:val="24"/>
-          <w:szCs w:val="24"/>
-        </w:rPr>
-        <w:t xml:space="preserve">The second stream dealt with software quality assurance and stakeholder-driven system evaluation. The data ingestion engine was augmented with automated validation scripts to verify that the parsing algorithms would successfully extract tables from PDFs with a variety of source formatting styles without causing timeouts on the servers. The whole system was evaluated after functional validation using a structured questionnaire with a 4-point Likert scale. The data collected from household managers, local retail vendors, DA-AMAS representatives, and IT experts were statistically summarized using Weighted Mean and Standard Deviation to confirm that the platform meets the requirements for functional suitability, performance efficiency, reliability, compatibility, and maintainability.</w:t>
+        <w:t xml:space="preserve">Requirements Analysis</w:t>
+      </w:r>
+    </w:p>
+    <w:p>
+      <w:pPr>
+        <w:spacing w:after="200" w:line="360"/>
+        <w:ind w:firstLine="720"/>
+        <w:jc w:val="both"/>
+      </w:pPr>
+      <w:r>
+        <w:rPr>
+          <w:sz w:val="24"/>
+          <w:szCs w:val="24"/>
+        </w:rPr>
+        <w:t xml:space="preserve">In the analysis phase, the researchers focused on identifying the functional and technical requirements to make the system a reliable decision-support tool. The study found that current government reporting is largely backward-looking and thus cannot help users anticipate "price shocks" before they occur. The processing requirements were divided into an automated sequential data pipeline: the data ingestion phase continuously extracts raw data from PDFs and financial APIs, the processing layer performs missing-value handling and min-max normalization, the analytical core uses the multivariate LSTM network to recognize the seasonal trend, and finally, the delivery engine converts the granular outputs into user-friendly trend indicators.</w:t>
       </w:r>
     </w:p>
     <w:p>
@@ -2685,77 +2626,21 @@
           <w:sz w:val="24"/>
           <w:szCs w:val="24"/>
         </w:rPr>
-        <w:t xml:space="preserve">Deployment</w:t>
-      </w:r>
-    </w:p>
-    <w:p>
-      <w:pPr>
-        <w:spacing w:after="200" w:line="360"/>
-        <w:ind w:firstLine="720"/>
-        <w:jc w:val="both"/>
-      </w:pPr>
-      <w:r>
-        <w:rPr>
-          <w:sz w:val="24"/>
-          <w:szCs w:val="24"/>
-        </w:rPr>
-        <w:t xml:space="preserve">The deployment phase involved the transition of the completed AgriPrice system from a secured development workspace into an operational automated decision-support utility on a web-server architecture. The structural deployment routine involved packaging the standalone Python backend environment, creating local read-write privileges for the internal SQLite3 database engine, and hosting the dashboard files natively to run on standard desktop and mobile browser applications.</w:t>
-      </w:r>
-    </w:p>
-    <w:p>
-      <w:pPr>
-        <w:spacing w:after="200" w:line="360"/>
-        <w:ind w:firstLine="720"/>
-        <w:jc w:val="both"/>
-      </w:pPr>
-      <w:r>
-        <w:rPr>
-          <w:sz w:val="24"/>
-          <w:szCs w:val="24"/>
-        </w:rPr>
-        <w:t xml:space="preserve">Once set up, an operational baseline was initiated, allowing the core application to automatically initiate its PDF extraction, API connection tasks, feature normalization routines, and LSTM predictive loops completely without human intervention at a fixed 24-hour frequency interval. A post-release review loop was introduced to maintain baseline reliability; the live 48-to-72-hour price projections from the web dashboard were continuously compared against subsequent physical market monitoring sheets issued by the Department of Agriculture.</w:t>
-      </w:r>
-    </w:p>
-    <w:p>
-      <w:pPr>
-        <w:spacing w:after="150" w:before="300"/>
-      </w:pPr>
-      <w:r>
-        <w:rPr>
-          <w:b/>
-          <w:bCs/>
-          <w:sz w:val="24"/>
-          <w:szCs w:val="24"/>
-        </w:rPr>
-        <w:t xml:space="preserve">Theoretical Framework</w:t>
-      </w:r>
-    </w:p>
-    <w:p>
-      <w:pPr>
-        <w:spacing w:after="200" w:line="360"/>
-        <w:ind w:firstLine="720"/>
-        <w:jc w:val="both"/>
-      </w:pPr>
-      <w:r>
-        <w:rPr>
-          <w:sz w:val="24"/>
-          <w:szCs w:val="24"/>
-        </w:rPr>
-        <w:t xml:space="preserve">The study is based on LSTM Architecture, a special type of RNN which can identify long-term patterns in sequential data. Unlike traditional statistical models that tend to get lost in the "noise" of a volatile market, LSTM theory uses a series of "memory gates" to determine what historical information is important to keep, and what to throw away. This is very much true in the Philippine rice market where the "Rockets and Feathers" Price Transmission Theory usually occurs — retail prices tend to increase rapidly like "rockets" upon increases in costs, but decrease slowly like "feathers" in times of cost reductions (Bathan et al., 2025).</w:t>
-      </w:r>
-    </w:p>
-    <w:p>
-      <w:pPr>
-        <w:spacing w:after="200" w:line="360"/>
-        <w:ind w:firstLine="720"/>
-        <w:jc w:val="both"/>
-      </w:pPr>
-      <w:r>
-        <w:rPr>
-          <w:sz w:val="24"/>
-          <w:szCs w:val="24"/>
-        </w:rPr>
-        <w:t xml:space="preserve">In addition, the study uses Multivariate Time-Series Theory, which states that the price of one commodity is not determined independently but is the result of a number of external factors. In the case of AgriPrice, this theory explains the inclusion of "shifters" like the USD-to-PHP exchange rate and diesel pump prices. This framework integrates these economic shifters with Agricultural Seasonality Theory, which considers the natural lean and harvest cycles of the Philippine rice calendar, to offer a holistic "multi-lens" perspective of the market.</w:t>
+        <w:t xml:space="preserve">Designing</w:t>
+      </w:r>
+    </w:p>
+    <w:p>
+      <w:pPr>
+        <w:spacing w:after="200" w:line="360"/>
+        <w:ind w:firstLine="720"/>
+        <w:jc w:val="both"/>
+      </w:pPr>
+      <w:r>
+        <w:rPr>
+          <w:sz w:val="24"/>
+          <w:szCs w:val="24"/>
+        </w:rPr>
+        <w:t xml:space="preserve">During the design phase, the technical design of AgriPrice has been developed with a Python back-end and a SQLite3 database to ensure reliable data persistence and fast forecast execution. The system architecture was built to support a dual-viewing framework to isolate complex technical analytics from general user views. A restricted admin interface was designed for IT experts and DA-AMAS representatives to review backend metrics, data extraction logs, and historical error rates. In contrast, a simplified public dashboard was engineered for standard desktop and mobile web browsers to serve as a general viewing platform for non-technical stakeholders — households and vendors.</w:t>
       </w:r>
     </w:p>
     <w:p>
@@ -2770,7 +2655,153 @@
           <w:sz w:val="22"/>
           <w:szCs w:val="22"/>
         </w:rPr>
-        <w:t xml:space="preserve">[REVISION NOTE — operationalization gap noted at prior review — confirm whether feature engineering explicitly encodes asymmetric price transmission (e.g., separate lag features for rising vs. falling diesel/exchange-rate inputs) to actually model the "Rockets and Feathers" theory rather than simply citing it. If not yet implemented, flag this as a limitation in Chapter 1's Scope and Limitations.]</w:t>
+        <w:t xml:space="preserve">[REVISION NOTE — terminology fix — "data scraping logs" corrected to "data extraction logs" to match the PDF-extraction pipeline. Desktop-and-mobile (responsive) scope restated for consistency with Objective 6.4 and the Purpose and Description section above.]</w:t>
+      </w:r>
+    </w:p>
+    <w:p>
+      <w:pPr>
+        <w:spacing w:after="100" w:before="200"/>
+      </w:pPr>
+      <w:r>
+        <w:rPr>
+          <w:b/>
+          <w:bCs/>
+          <w:i/>
+          <w:iCs/>
+          <w:sz w:val="24"/>
+          <w:szCs w:val="24"/>
+        </w:rPr>
+        <w:t xml:space="preserve">Implementation (Design Phase Summary)</w:t>
+      </w:r>
+    </w:p>
+    <w:p>
+      <w:pPr>
+        <w:spacing w:after="200" w:line="360"/>
+        <w:ind w:firstLine="720"/>
+        <w:jc w:val="both"/>
+      </w:pPr>
+      <w:r>
+        <w:rPr>
+          <w:sz w:val="24"/>
+          <w:szCs w:val="24"/>
+        </w:rPr>
+        <w:t xml:space="preserve">The implementation phase translated the final technical specifications into working software structures. The researchers began by programmatically setting up the data ingestion pipeline, using Python to build a custom PDF price-table extraction tool and financial API connectors. These script modules were designed to automatically extract daily retail rice data directly from official DA-AMAS PDF releases and fetch global currency parameters, structuring and committing these time-series datasets into a local SQLite3 database.</w:t>
+      </w:r>
+    </w:p>
+    <w:p>
+      <w:pPr>
+        <w:spacing w:after="200" w:line="360"/>
+        <w:ind w:firstLine="720"/>
+        <w:jc w:val="both"/>
+      </w:pPr>
+      <w:r>
+        <w:rPr>
+          <w:sz w:val="24"/>
+          <w:szCs w:val="24"/>
+        </w:rPr>
+        <w:t xml:space="preserve">Simultaneously, the AgriPrice deep learning core was built in a native Python environment with dedicated machine learning frameworks. The researchers configured the topology of the multivariate LSTM network by defining dense computational layers, setting dropout regularizations, and sizing look-back windows to successfully read and process the aligned cross-commodity inputs and historical sequences stored in the SQLite3 tables.</w:t>
+      </w:r>
+    </w:p>
+    <w:p>
+      <w:pPr>
+        <w:spacing w:after="200" w:line="360"/>
+        <w:ind w:firstLine="720"/>
+        <w:jc w:val="both"/>
+      </w:pPr>
+      <w:r>
+        <w:rPr>
+          <w:sz w:val="24"/>
+          <w:szCs w:val="24"/>
+        </w:rPr>
+        <w:t xml:space="preserve">The last block of development focused on building the user-facing web interface using vanilla HTML5, CSS3, and JavaScript, optimized for standard desktop and mobile web browsers. The design employs asynchronous JavaScript routines to communicate securely with the Python data environment, dynamically displaying market predictions, directional trend arrows, and historical point comparisons without full page refreshes.</w:t>
+      </w:r>
+    </w:p>
+    <w:p>
+      <w:pPr>
+        <w:spacing w:after="100" w:before="200"/>
+      </w:pPr>
+      <w:r>
+        <w:rPr>
+          <w:b/>
+          <w:bCs/>
+          <w:i/>
+          <w:iCs/>
+          <w:sz w:val="24"/>
+          <w:szCs w:val="24"/>
+        </w:rPr>
+        <w:t xml:space="preserve">Testing</w:t>
+      </w:r>
+    </w:p>
+    <w:p>
+      <w:pPr>
+        <w:spacing w:after="200" w:line="360"/>
+        <w:ind w:firstLine="720"/>
+        <w:jc w:val="both"/>
+      </w:pPr>
+      <w:r>
+        <w:rPr>
+          <w:sz w:val="24"/>
+          <w:szCs w:val="24"/>
+        </w:rPr>
+        <w:t xml:space="preserve">The testing phase consisted of a rigorous dual-track validation pipeline run immediately after system compilation to ensure execution stability on standard desktop and mobile web browsers and model precision under market volatility. The first track was technical model validation, where the mathematical accuracy of the trained multivariate LSTM architecture was evaluated against historical pricing trends and macroeconomic parameters, benchmarked against naive persistence and ARIMA(1,1,1) baselines, with directional accuracy and the coverage of the published price ranges also measured. This predictive layer was critically audited using Mean Absolute Error (MAE) to set the baseline margin of error in raw Philippine pesos and Root Mean Squared Error (RMSE) to heavily penalize large anomalous forecasting errors.</w:t>
+      </w:r>
+    </w:p>
+    <w:p>
+      <w:pPr>
+        <w:spacing w:after="200" w:line="360"/>
+        <w:ind w:firstLine="720"/>
+        <w:jc w:val="both"/>
+      </w:pPr>
+      <w:r>
+        <w:rPr>
+          <w:sz w:val="24"/>
+          <w:szCs w:val="24"/>
+        </w:rPr>
+        <w:t xml:space="preserve">The second stream dealt with software quality assurance and stakeholder-driven system evaluation. The data ingestion engine was augmented with automated validation scripts to verify that the parsing algorithms would successfully extract tables from PDFs with a variety of source formatting styles without causing timeouts on the servers. An automated test suite (74 tests) checks the PDF reader against saved DA bulletins, the scraper's plausibility guard, the forecast log, and the model's output contract. The whole system was evaluated after functional validation using a structured questionnaire with a 4-point Likert scale. The data collected from household managers, local retail vendors, DA-AMAS representatives, and IT experts were statistically summarized using Weighted Mean and Standard Deviation to confirm that the platform meets the requirements for functional suitability, performance efficiency, reliability, compatibility, and maintainability.</w:t>
+      </w:r>
+    </w:p>
+    <w:p>
+      <w:pPr>
+        <w:spacing w:after="100" w:before="200"/>
+      </w:pPr>
+      <w:r>
+        <w:rPr>
+          <w:b/>
+          <w:bCs/>
+          <w:i/>
+          <w:iCs/>
+          <w:sz w:val="24"/>
+          <w:szCs w:val="24"/>
+        </w:rPr>
+        <w:t xml:space="preserve">Deployment</w:t>
+      </w:r>
+    </w:p>
+    <w:p>
+      <w:pPr>
+        <w:spacing w:after="200" w:line="360"/>
+        <w:ind w:firstLine="720"/>
+        <w:jc w:val="both"/>
+      </w:pPr>
+      <w:r>
+        <w:rPr>
+          <w:sz w:val="24"/>
+          <w:szCs w:val="24"/>
+        </w:rPr>
+        <w:t xml:space="preserve">The deployment phase involved the transition of the completed AgriPrice system from a secured development workspace into an operational automated decision-support utility on a web-server architecture. The structural deployment routine involved packaging the standalone Python backend environment, creating local read-write privileges for the internal SQLite3 database engine, and hosting the dashboard files natively to run on standard desktop and mobile browser applications.</w:t>
+      </w:r>
+    </w:p>
+    <w:p>
+      <w:pPr>
+        <w:spacing w:after="200" w:line="360"/>
+        <w:ind w:firstLine="720"/>
+        <w:jc w:val="both"/>
+      </w:pPr>
+      <w:r>
+        <w:rPr>
+          <w:sz w:val="24"/>
+          <w:szCs w:val="24"/>
+        </w:rPr>
+        <w:t xml:space="preserve">Once set up, an operational baseline was initiated, allowing the core application to automatically initiate its PDF extraction, API connection tasks, feature normalization routines, and LSTM predictive loops completely without human intervention at a fixed 24-hour frequency interval. A post-release review loop was introduced to maintain baseline reliability; the live 48-to-72-hour price projections from the web dashboard were continuously compared against subsequent physical market monitoring sheets issued by the Department of Agriculture. This comparison is automated: every published forecast is written to a forecast log before the DA price for its day exists and is scored once that price is published, giving a prospective (forward) evaluation that no later change to the model can alter.</w:t>
       </w:r>
     </w:p>
     <w:p>
@@ -2784,7 +2815,35 @@
           <w:sz w:val="24"/>
           <w:szCs w:val="24"/>
         </w:rPr>
-        <w:t xml:space="preserve">Conceptual Framework</w:t>
+        <w:t xml:space="preserve">Theoretical Framework</w:t>
+      </w:r>
+    </w:p>
+    <w:p>
+      <w:pPr>
+        <w:spacing w:after="200" w:line="360"/>
+        <w:ind w:firstLine="720"/>
+        <w:jc w:val="both"/>
+      </w:pPr>
+      <w:r>
+        <w:rPr>
+          <w:sz w:val="24"/>
+          <w:szCs w:val="24"/>
+        </w:rPr>
+        <w:t xml:space="preserve">The study is based on LSTM Architecture, a special type of RNN which can identify long-term patterns in sequential data. Unlike traditional statistical models that tend to get lost in the "noise" of a volatile market, LSTM theory uses a series of "memory gates" to determine what historical information is important to keep, and what to throw away. This is very much true in the Philippine rice market where the "Rockets and Feathers" Price Transmission Theory usually occurs — retail prices tend to increase rapidly like "rockets" upon increases in costs, but decrease slowly like "feathers" in times of cost reductions (Bathan et al., 2025).</w:t>
+      </w:r>
+    </w:p>
+    <w:p>
+      <w:pPr>
+        <w:spacing w:after="200" w:line="360"/>
+        <w:ind w:firstLine="720"/>
+        <w:jc w:val="both"/>
+      </w:pPr>
+      <w:r>
+        <w:rPr>
+          <w:sz w:val="24"/>
+          <w:szCs w:val="24"/>
+        </w:rPr>
+        <w:t xml:space="preserve">In addition, the study uses Multivariate Time-Series Theory, which states that the price of one commodity is not determined independently but is the result of a number of external factors. In the case of AgriPrice, this theory explains the inclusion of "shifters" like the USD-to-PHP exchange rate and diesel pump prices. This framework integrates these economic shifters with Agricultural Seasonality Theory, which considers the natural lean and harvest cycles of the Philippine rice calendar, to offer a holistic "multi-lens" perspective of the market.</w:t>
       </w:r>
     </w:p>
     <w:p>
@@ -2799,21 +2858,21 @@
           <w:sz w:val="22"/>
           <w:szCs w:val="22"/>
         </w:rPr>
-        <w:t xml:space="preserve">[REVISION NOTE — the original diagram graphic (data sources → ingestion → LSTM → outputs) could not be reconstructed losslessly in this revision pass — reinsert your original diagram image here from your design source file. The descriptive paragraphs below have been corrected for terminology and are ready to accompany it.]</w:t>
-      </w:r>
-    </w:p>
-    <w:p>
-      <w:pPr>
-        <w:spacing w:after="200" w:line="360"/>
-        <w:ind w:firstLine="720"/>
-        <w:jc w:val="both"/>
-      </w:pPr>
-      <w:r>
-        <w:rPr>
-          <w:sz w:val="24"/>
-          <w:szCs w:val="24"/>
-        </w:rPr>
-        <w:t xml:space="preserve">The conceptual framework of AgriPrice illustrates the complete process flow of the system from automated data collection to the delivery of actionable rice price forecasts to end-users in the NCR. The framework begins with four parallel data input streams, each collected automatically without manual intervention. The first stream retrieves daily retail rice prices for eight commercial categories from the DA-AMAS portal using rule-based, layout-aware PDF price-table extraction. The second stream captures the daily USD to PHP exchange rate via a financial API. The third stream integrates weekly diesel pump prices from a public Manila fuel-price source. The fourth stream encodes an agricultural seasonality index based on the Philippine rice production calendar.</w:t>
+        <w:t xml:space="preserve">[UPDATED 27 SEP 2026 — asymmetric (rising vs. falling) input features are not implemented; this is now stated as a limitation in Chapter 1 Scope and Limitations. Delete this note before final printing.]</w:t>
+      </w:r>
+    </w:p>
+    <w:p>
+      <w:pPr>
+        <w:spacing w:after="150" w:before="300"/>
+      </w:pPr>
+      <w:r>
+        <w:rPr>
+          <w:b/>
+          <w:bCs/>
+          <w:sz w:val="24"/>
+          <w:szCs w:val="24"/>
+        </w:rPr>
+        <w:t xml:space="preserve">Conceptual Framework</w:t>
       </w:r>
     </w:p>
     <w:p>
@@ -2828,6 +2887,35 @@
           <w:sz w:val="22"/>
           <w:szCs w:val="22"/>
         </w:rPr>
+        <w:t xml:space="preserve">[REVISION NOTE — the original diagram graphic (data sources → ingestion → LSTM → outputs) could not be reconstructed losslessly in this revision pass — reinsert your original diagram image here from your design source file. The descriptive paragraphs below have been corrected for terminology and are ready to accompany it.]</w:t>
+      </w:r>
+    </w:p>
+    <w:p>
+      <w:pPr>
+        <w:spacing w:after="200" w:line="360"/>
+        <w:ind w:firstLine="720"/>
+        <w:jc w:val="both"/>
+      </w:pPr>
+      <w:r>
+        <w:rPr>
+          <w:sz w:val="24"/>
+          <w:szCs w:val="24"/>
+        </w:rPr>
+        <w:t xml:space="preserve">The conceptual framework of AgriPrice illustrates the complete process flow of the system from automated data collection to the delivery of actionable rice price forecasts to end-users in the NCR. The framework begins with four parallel data input streams, each collected automatically without manual intervention. The first stream retrieves daily retail rice prices for eight commercial categories from the DA-AMAS portal using rule-based, layout-aware PDF price-table extraction. The second stream captures the daily USD to PHP exchange rate via a financial API. The third stream integrates weekly diesel pump prices from a public Manila fuel-price source. The fourth stream encodes an agricultural seasonality index based on the Philippine rice production calendar.</w:t>
+      </w:r>
+    </w:p>
+    <w:p>
+      <w:pPr>
+        <w:spacing w:after="200" w:before="100"/>
+      </w:pPr>
+      <w:r>
+        <w:rPr>
+          <w:b/>
+          <w:bCs/>
+          <w:color w:val="C00000"/>
+          <w:sz w:val="22"/>
+          <w:szCs w:val="22"/>
+        </w:rPr>
         <w:t xml:space="preserve">[REVISION NOTE — terminology fix applied — "AI-based web scraping and PDF Document Object Model (DOM) parsing" corrected to "rule-based, layout-aware PDF price-table extraction." DOM (Document Object Model) applies to HTML structure, not PDF layout; using it here was a conceptual error that misdescribes your own pipeline.]</w:t>
       </w:r>
     </w:p>
@@ -2856,7 +2944,7 @@
           <w:sz w:val="24"/>
           <w:szCs w:val="24"/>
         </w:rPr>
-        <w:t xml:space="preserve">The processed dataset is then fed into the Multivariate LSTM Model, which features stacked layers with dropout regularization and undergoes structured hyperparameter tuning to optimize the look-back window, hidden units per layer, learning rate, and batch size. The trained model executes a 48-to-72-hour price forecasting operation for all eight commercial rice categories, delivered through four output components: the Web Dashboard, the 8 Rice Category Predictions, the Lead-Time Awareness alert, and the Inventory Decision Support signal for local vendors.</w:t>
+        <w:t xml:space="preserve">The processed dataset is then fed into the Multivariate LSTM Model, which has two stacked LSTM layers with dropout regularization, reads a 30-day look-back window, and is trained with early stopping on the validation set; alternative training configurations were compared on the validation window only. The LSTM's forecast, corrected by the weekday mean-reversion term, is combined with ARIMA(1,1,1) and Kalman filter forecasts in an adaptive ensemble, which executes the 48-to-72-hour price forecasting operation for all eight commercial rice categories, delivered through four output components: the Web Dashboard, the 8 Rice Category Predictions with their expected price ranges, the Lead-Time Awareness alert, and the Inventory Decision Support signal for local vendors.</w:t>
       </w:r>
     </w:p>
     <w:p>
@@ -2914,7 +3002,7 @@
           <w:sz w:val="24"/>
           <w:szCs w:val="24"/>
         </w:rPr>
-        <w:t xml:space="preserve">The team developed a Python-based extraction tool to automatically access the DA-AMAS portal on a daily basis. To handle the portal's PDF-formatted price data, the researchers created a custom rule-based, layout-aware PDF extraction script. This script reliably extracts structured price tables regardless of changes in the source document's visual layout. Additionally, an API connector was developed to retrieve the daily USD to PHP exchange rate from a financial data provider. A local database stores both data streams, running daily updates completely without human intervention.</w:t>
+        <w:t xml:space="preserve">The team developed a Python-based extraction tool to automatically access the DA-AMAS portal on a daily basis. To handle the portal's PDF-formatted price data, the researchers created a custom rule-based, layout-aware PDF extraction script. The script locates each price by the position of its row label on the page rather than by its order in the extracted text, so a missing value ("n/a") in one column cannot shift the remaining prices into the wrong columns. Before a new price is saved, a plausibility guard holds any reading that duplicates an adjacent grade's price or deviates by more than 6% from the median of its last seven readings; held readings are queued in the admin panel for a person to approve or reject. Additionally, an API connector was developed to retrieve the daily USD to PHP exchange rate from a financial data provider. A local database stores both data streams, running daily updates completely without human intervention.</w:t>
       </w:r>
     </w:p>
     <w:p>
@@ -2974,7 +3062,7 @@
           <w:sz w:val="24"/>
           <w:szCs w:val="24"/>
         </w:rPr>
-        <w:t xml:space="preserve">The researchers built the multivariate LSTM model using a Python deep learning framework. The architecture features multiple stacked LSTM layers and utilizes dropout regularization to prevent overfitting. The team conducted structured hyperparameter tuning to optimize the look-back window, the number of hidden units per layer, the learning rate, and the batch size. The model was trained on the full fifteen-year historical dataset using a chronological train/validation/test split to capture seasonal patterns and macroeconomic fluctuations without temporal data leakage.</w:t>
+        <w:t xml:space="preserve">The researchers built the multivariate LSTM model using TensorFlow/Keras. The architecture has two stacked LSTM layers (64 and 32 units), each followed by 20% dropout to prevent overfitting, a 16-unit dense layer, and an output layer with one value per forecast day. It is trained with the Adam optimizer on mean squared error, a batch size of 32, a 30-day look-back window, and early stopping on validation loss. One model is trained per rice type (eight in total). Besides the production configuration, the team tested nine alternative training strategies, including weekday input features, one network pooled across all eight rice types, down-weighting the older weekly-era data, training on the residual of the statistical forecast, and pre-training on the weekly era before fine-tuning on the daily era, always selecting on the validation window only. The model was trained on the full 2015–2026 record using the chronological, regime-aware split described above, without temporal data leakage.</w:t>
       </w:r>
     </w:p>
     <w:p>
@@ -3004,7 +3092,7 @@
           <w:sz w:val="24"/>
           <w:szCs w:val="24"/>
         </w:rPr>
-        <w:t xml:space="preserve">To make the system's forecasts accessible, the team developed and deployed a user-friendly web dashboard optimized for standard desktop and mobile web browsers. The interface displays the 48-to-72-hour price projections for all eight rice categories using clear visual formats, highlighting the most recently observed prices alongside a simplified trend indicator.</w:t>
+        <w:t xml:space="preserve">To make the system's forecasts accessible, the team developed and deployed a user-friendly web dashboard optimized for standard desktop and mobile web browsers. The interface displays the 48-to-72-hour price projections for all eight rice categories using clear visual formats, highlighting the most recently observed prices alongside a simplified trend indicator. Each forecast is shown with its expected price range, and predicted changes under PHP 0.10 are labelled as steady.</w:t>
       </w:r>
     </w:p>
     <w:p>
@@ -3155,6 +3243,21 @@
       </w:r>
     </w:p>
     <w:p>
+      <w:pPr>
+        <w:spacing w:after="200" w:before="100"/>
+      </w:pPr>
+      <w:r>
+        <w:rPr>
+          <w:b/>
+          <w:bCs/>
+          <w:color w:val="C00000"/>
+          <w:sz w:val="22"/>
+          <w:szCs w:val="22"/>
+        </w:rPr>
+        <w:t xml:space="preserve">[CHECK — this paragraph names DTI personnel as a respondent group, while the rest of Chapter 3 names DA-AMAS personnel. Use the group that actually answered the survey, consistently.]</w:t>
+      </w:r>
+    </w:p>
+    <w:p>
       <w:r>
         <w:rPr>
           <w:b/>
@@ -3164,7 +3267,7 @@
     </w:p>
     <w:p>
       <w:r>
-        <w:t xml:space="preserve">Beyond Mean Absolute Error (MAE) and Root Mean Squared Error (RMSE), the model's accuracy is also evaluated using the Mean Absolute Percentage Error (MAPE), the Coefficient of Determination (R²), and a rolling-origin evaluation computed across successive chronological blocks of the held-out test set. These are benchmarked against a naive-persistence baseline and an ARIMA(1,1,1) baseline, and the target series is checked for stationarity using the Augmented Dickey-Fuller (ADF) test. Because retail rice prices are strongly trended, R² is high for both the model and the persistence baseline; the meaningful comparison is therefore MAE and RMSE relative to the baselines.</w:t>
+        <w:t xml:space="preserve">Beyond Mean Absolute Error (MAE) and Root Mean Squared Error (RMSE), the model's accuracy is also evaluated using the Mean Absolute Percentage Error (MAPE), the Coefficient of Determination (R²), and a rolling-origin evaluation computed across successive chronological blocks of the held-out test set. These are benchmarked against a naive-persistence baseline and an ARIMA(1,1,1) baseline, and the target series is checked for stationarity using the Augmented Dickey-Fuller (ADF) test. Because retail rice prices are strongly trended, R² is high for both the model and the persistence baseline; the meaningful comparison is therefore MAE and RMSE relative to the baselines. The study also reports the skill score relative to the naive baseline (1 − MAE of the model ÷ MAE of the naive forecast, in percent), the hit rate (the share of forecasts within PHP 0.50, 1.00, 1.50 and 2.00 of the actual price), directional accuracy (the share of actual price moves whose direction was forecast correctly, tested against 50% with a one-sided binomial test), and the realised coverage of the published price ranges. Whether the LSTM network adds accuracy beyond the statistical mean-reversion term is tested with a paired McNemar test on the forecasts where the two disagree.</w:t>
       </w:r>
     </w:p>
     <w:p>
@@ -3258,6 +3361,20 @@
     </w:p>
     <w:p>
       <w:pPr>
+        <w:spacing w:after="200" w:line="360"/>
+        <w:ind w:firstLine="720"/>
+        <w:jc w:val="both"/>
+      </w:pPr>
+      <w:r>
+        <w:rPr>
+          <w:sz w:val="24"/>
+          <w:szCs w:val="24"/>
+        </w:rPr>
+        <w:t xml:space="preserve">A second, classical baseline is an ARIMA(1,1,1) model (one autoregressive term, first differencing, and one moving-average term) fitted to each rice type's price series and applied walk-forward, so that every forecast uses only prices available at its origin. The system is counted as beating a baseline for a rice type only when its test-window MAE is lower.</w:t>
+      </w:r>
+    </w:p>
+    <w:p>
+      <w:pPr>
         <w:spacing w:after="200" w:before="100"/>
       </w:pPr>
       <w:r>
@@ -3268,7 +3385,7 @@
           <w:sz w:val="22"/>
           <w:szCs w:val="22"/>
         </w:rPr>
-        <w:t xml:space="preserve">[REVISION NOTE — newly added subsection per panel requirement. CONFIRM: if an ARIMA baseline is implemented in addition to naive persistence, add a second paragraph here describing it and its parameters (p, d, q order).]</w:t>
+        <w:t xml:space="preserve">[UPDATED 27 SEP 2026 — ARIMA(1,1,1) baseline paragraph added; it is implemented in model/train.py and model/ensemble.py. Delete this note before final printing.]</w:t>
       </w:r>
     </w:p>
     <w:p>
@@ -3648,6 +3765,1514 @@
           <w:szCs w:val="22"/>
         </w:rPr>
         <w:t xml:space="preserve">[REVISION NOTE — new subsection added per panel requirement. MANDATORY before defense: apply restrictive file permissions to the SQLite3 database file. (The exchange-rate API is key-less, so there is no hardcoded credential to migrate.) CONFIRM: whether the admin panel logs IP/timestamp data, to complete the RA 10173 sentence above — do not leave the blank unresolved in your final submission.]</w:t>
+      </w:r>
+    </w:p>
+    <w:p>
+      <w:pPr>
+        <w:pageBreakBefore/>
+        <w:spacing w:after="300" w:before="500"/>
+        <w:jc w:val="center"/>
+      </w:pPr>
+      <w:r>
+        <w:rPr>
+          <w:b/>
+          <w:bCs/>
+          <w:sz w:val="28"/>
+          <w:szCs w:val="28"/>
+        </w:rPr>
+        <w:t xml:space="preserve">CHAPTER 4 – RESULTS AND DISCUSSION</w:t>
+      </w:r>
+    </w:p>
+    <w:p>
+      <w:pPr>
+        <w:spacing w:after="200" w:before="100"/>
+      </w:pPr>
+      <w:r>
+        <w:rPr>
+          <w:b/>
+          <w:bCs/>
+          <w:color w:val="C00000"/>
+          <w:sz w:val="22"/>
+          <w:szCs w:val="22"/>
+        </w:rPr>
+        <w:t xml:space="preserve">[DRAFT 27 SEP 2026 — the technical results below are taken from model/meta.json (training run of September 26, 2026, data through September 26, 2026) and can be re-checked in Admin → Metrics. The survey results for Statements of the Problem 3 to 6 must be filled in from the team's data. If the team already has a Chapter 4, merge these sections into it.]</w:t>
+      </w:r>
+    </w:p>
+    <w:p>
+      <w:pPr>
+        <w:spacing w:after="150" w:before="300"/>
+      </w:pPr>
+      <w:r>
+        <w:rPr>
+          <w:b/>
+          <w:bCs/>
+          <w:sz w:val="24"/>
+          <w:szCs w:val="24"/>
+        </w:rPr>
+        <w:t xml:space="preserve">Statement of the Problem 1: The Forecasting Model</w:t>
+      </w:r>
+    </w:p>
+    <w:p>
+      <w:pPr>
+        <w:spacing w:after="200" w:line="360"/>
+        <w:ind w:firstLine="720"/>
+        <w:jc w:val="both"/>
+      </w:pPr>
+      <w:r>
+        <w:rPr>
+          <w:sz w:val="24"/>
+          <w:szCs w:val="24"/>
+        </w:rPr>
+        <w:t xml:space="preserve">The model was evaluated on the held-out test window from October 7, 2025 to September 24, 2026, which it never saw during training or model selection: 353 forecast origins per rice type, each forecasting the next three days. Table 1 reports the published forecast (the adaptive ensemble) against the naive persistence and ARIMA(1,1,1) baselines.</w:t>
+      </w:r>
+    </w:p>
+    <w:p>
+      <w:pPr>
+        <w:spacing w:after="100" w:before="200"/>
+      </w:pPr>
+      <w:r>
+        <w:rPr>
+          <w:b/>
+          <w:bCs/>
+          <w:i/>
+          <w:iCs/>
+          <w:sz w:val="24"/>
+          <w:szCs w:val="24"/>
+        </w:rPr>
+        <w:t xml:space="preserve">Table 1. Test-window accuracy of the published forecast, per rice type (October 7, 2025 – September 24, 2026)</w:t>
+      </w:r>
+    </w:p>
+    <w:tbl>
+      <w:tblPr>
+        <w:tblW w:type="pct" w:w="100%"/>
+        <w:tblBorders>
+          <w:top w:val="single" w:color="auto" w:sz="4"/>
+          <w:left w:val="single" w:color="auto" w:sz="4"/>
+          <w:bottom w:val="single" w:color="auto" w:sz="4"/>
+          <w:right w:val="single" w:color="auto" w:sz="4"/>
+          <w:insideH w:val="single" w:color="auto" w:sz="4"/>
+          <w:insideV w:val="single" w:color="auto" w:sz="4"/>
+        </w:tblBorders>
+      </w:tblPr>
+      <w:tblGrid>
+        <w:gridCol w:w="100"/>
+        <w:gridCol w:w="100"/>
+        <w:gridCol w:w="100"/>
+        <w:gridCol w:w="100"/>
+        <w:gridCol w:w="100"/>
+        <w:gridCol w:w="100"/>
+      </w:tblGrid>
+      <w:tr>
+        <w:trPr>
+          <w:tblHeader/>
+        </w:trPr>
+        <w:tc>
+          <w:tcPr>
+            <w:tcW w:type="pct" w:w="16.666666666666668%"/>
+            <w:shd w:fill="1F2937" w:val="clear"/>
+            <w:tcMar>
+              <w:top w:type="dxa" w:w="100"/>
+              <w:left w:type="dxa" w:w="100"/>
+              <w:bottom w:type="dxa" w:w="100"/>
+              <w:right w:type="dxa" w:w="100"/>
+            </w:tcMar>
+          </w:tcPr>
+          <w:p>
+            <w:r>
+              <w:rPr>
+                <w:b/>
+                <w:bCs/>
+                <w:color w:val="FFFFFF"/>
+                <w:sz w:val="20"/>
+                <w:szCs w:val="20"/>
+              </w:rPr>
+              <w:t xml:space="preserve">Rice type</w:t>
+            </w:r>
+          </w:p>
+        </w:tc>
+        <w:tc>
+          <w:tcPr>
+            <w:tcW w:type="pct" w:w="16.666666666666668%"/>
+            <w:shd w:fill="1F2937" w:val="clear"/>
+            <w:tcMar>
+              <w:top w:type="dxa" w:w="100"/>
+              <w:left w:type="dxa" w:w="100"/>
+              <w:bottom w:type="dxa" w:w="100"/>
+              <w:right w:type="dxa" w:w="100"/>
+            </w:tcMar>
+          </w:tcPr>
+          <w:p>
+            <w:r>
+              <w:rPr>
+                <w:b/>
+                <w:bCs/>
+                <w:color w:val="FFFFFF"/>
+                <w:sz w:val="20"/>
+                <w:szCs w:val="20"/>
+              </w:rPr>
+              <w:t xml:space="preserve">MAE (PHP/kg)</w:t>
+            </w:r>
+          </w:p>
+        </w:tc>
+        <w:tc>
+          <w:tcPr>
+            <w:tcW w:type="pct" w:w="16.666666666666668%"/>
+            <w:shd w:fill="1F2937" w:val="clear"/>
+            <w:tcMar>
+              <w:top w:type="dxa" w:w="100"/>
+              <w:left w:type="dxa" w:w="100"/>
+              <w:bottom w:type="dxa" w:w="100"/>
+              <w:right w:type="dxa" w:w="100"/>
+            </w:tcMar>
+          </w:tcPr>
+          <w:p>
+            <w:r>
+              <w:rPr>
+                <w:b/>
+                <w:bCs/>
+                <w:color w:val="FFFFFF"/>
+                <w:sz w:val="20"/>
+                <w:szCs w:val="20"/>
+              </w:rPr>
+              <w:t xml:space="preserve">Naive MAE</w:t>
+            </w:r>
+          </w:p>
+        </w:tc>
+        <w:tc>
+          <w:tcPr>
+            <w:tcW w:type="pct" w:w="16.666666666666668%"/>
+            <w:shd w:fill="1F2937" w:val="clear"/>
+            <w:tcMar>
+              <w:top w:type="dxa" w:w="100"/>
+              <w:left w:type="dxa" w:w="100"/>
+              <w:bottom w:type="dxa" w:w="100"/>
+              <w:right w:type="dxa" w:w="100"/>
+            </w:tcMar>
+          </w:tcPr>
+          <w:p>
+            <w:r>
+              <w:rPr>
+                <w:b/>
+                <w:bCs/>
+                <w:color w:val="FFFFFF"/>
+                <w:sz w:val="20"/>
+                <w:szCs w:val="20"/>
+              </w:rPr>
+              <w:t xml:space="preserve">ARIMA MAE</w:t>
+            </w:r>
+          </w:p>
+        </w:tc>
+        <w:tc>
+          <w:tcPr>
+            <w:tcW w:type="pct" w:w="16.666666666666668%"/>
+            <w:shd w:fill="1F2937" w:val="clear"/>
+            <w:tcMar>
+              <w:top w:type="dxa" w:w="100"/>
+              <w:left w:type="dxa" w:w="100"/>
+              <w:bottom w:type="dxa" w:w="100"/>
+              <w:right w:type="dxa" w:w="100"/>
+            </w:tcMar>
+          </w:tcPr>
+          <w:p>
+            <w:r>
+              <w:rPr>
+                <w:b/>
+                <w:bCs/>
+                <w:color w:val="FFFFFF"/>
+                <w:sz w:val="20"/>
+                <w:szCs w:val="20"/>
+              </w:rPr>
+              <w:t xml:space="preserve">Skill vs. naive</w:t>
+            </w:r>
+          </w:p>
+        </w:tc>
+        <w:tc>
+          <w:tcPr>
+            <w:tcW w:type="pct" w:w="16.666666666666668%"/>
+            <w:shd w:fill="1F2937" w:val="clear"/>
+            <w:tcMar>
+              <w:top w:type="dxa" w:w="100"/>
+              <w:left w:type="dxa" w:w="100"/>
+              <w:bottom w:type="dxa" w:w="100"/>
+              <w:right w:type="dxa" w:w="100"/>
+            </w:tcMar>
+          </w:tcPr>
+          <w:p>
+            <w:r>
+              <w:rPr>
+                <w:b/>
+                <w:bCs/>
+                <w:color w:val="FFFFFF"/>
+                <w:sz w:val="20"/>
+                <w:szCs w:val="20"/>
+              </w:rPr>
+              <w:t xml:space="preserve">Day-1 direction</w:t>
+            </w:r>
+          </w:p>
+        </w:tc>
+      </w:tr>
+      <w:tr>
+        <w:tc>
+          <w:tcPr>
+            <w:tcW w:type="pct" w:w="16.666666666666668%"/>
+            <w:tcMar>
+              <w:top w:type="dxa" w:w="100"/>
+              <w:left w:type="dxa" w:w="100"/>
+              <w:bottom w:type="dxa" w:w="100"/>
+              <w:right w:type="dxa" w:w="100"/>
+            </w:tcMar>
+          </w:tcPr>
+          <w:p>
+            <w:r>
+              <w:rPr>
+                <w:sz w:val="20"/>
+                <w:szCs w:val="20"/>
+              </w:rPr>
+              <w:t xml:space="preserve">Local Well-Milled</w:t>
+            </w:r>
+          </w:p>
+        </w:tc>
+        <w:tc>
+          <w:tcPr>
+            <w:tcW w:type="pct" w:w="16.666666666666668%"/>
+            <w:tcMar>
+              <w:top w:type="dxa" w:w="100"/>
+              <w:left w:type="dxa" w:w="100"/>
+              <w:bottom w:type="dxa" w:w="100"/>
+              <w:right w:type="dxa" w:w="100"/>
+            </w:tcMar>
+          </w:tcPr>
+          <w:p>
+            <w:r>
+              <w:rPr>
+                <w:sz w:val="20"/>
+                <w:szCs w:val="20"/>
+              </w:rPr>
+              <w:t xml:space="preserve">0.280</w:t>
+            </w:r>
+          </w:p>
+        </w:tc>
+        <w:tc>
+          <w:tcPr>
+            <w:tcW w:type="pct" w:w="16.666666666666668%"/>
+            <w:tcMar>
+              <w:top w:type="dxa" w:w="100"/>
+              <w:left w:type="dxa" w:w="100"/>
+              <w:bottom w:type="dxa" w:w="100"/>
+              <w:right w:type="dxa" w:w="100"/>
+            </w:tcMar>
+          </w:tcPr>
+          <w:p>
+            <w:r>
+              <w:rPr>
+                <w:sz w:val="20"/>
+                <w:szCs w:val="20"/>
+              </w:rPr>
+              <w:t xml:space="preserve">0.325</w:t>
+            </w:r>
+          </w:p>
+        </w:tc>
+        <w:tc>
+          <w:tcPr>
+            <w:tcW w:type="pct" w:w="16.666666666666668%"/>
+            <w:tcMar>
+              <w:top w:type="dxa" w:w="100"/>
+              <w:left w:type="dxa" w:w="100"/>
+              <w:bottom w:type="dxa" w:w="100"/>
+              <w:right w:type="dxa" w:w="100"/>
+            </w:tcMar>
+          </w:tcPr>
+          <w:p>
+            <w:r>
+              <w:rPr>
+                <w:sz w:val="20"/>
+                <w:szCs w:val="20"/>
+              </w:rPr>
+              <w:t xml:space="preserve">0.284</w:t>
+            </w:r>
+          </w:p>
+        </w:tc>
+        <w:tc>
+          <w:tcPr>
+            <w:tcW w:type="pct" w:w="16.666666666666668%"/>
+            <w:tcMar>
+              <w:top w:type="dxa" w:w="100"/>
+              <w:left w:type="dxa" w:w="100"/>
+              <w:bottom w:type="dxa" w:w="100"/>
+              <w:right w:type="dxa" w:w="100"/>
+            </w:tcMar>
+          </w:tcPr>
+          <w:p>
+            <w:r>
+              <w:rPr>
+                <w:sz w:val="20"/>
+                <w:szCs w:val="20"/>
+              </w:rPr>
+              <w:t xml:space="preserve">+13.9%</w:t>
+            </w:r>
+          </w:p>
+        </w:tc>
+        <w:tc>
+          <w:tcPr>
+            <w:tcW w:type="pct" w:w="16.666666666666668%"/>
+            <w:tcMar>
+              <w:top w:type="dxa" w:w="100"/>
+              <w:left w:type="dxa" w:w="100"/>
+              <w:bottom w:type="dxa" w:w="100"/>
+              <w:right w:type="dxa" w:w="100"/>
+            </w:tcMar>
+          </w:tcPr>
+          <w:p>
+            <w:r>
+              <w:rPr>
+                <w:sz w:val="20"/>
+                <w:szCs w:val="20"/>
+              </w:rPr>
+              <w:t xml:space="preserve">61.5%</w:t>
+            </w:r>
+          </w:p>
+        </w:tc>
+      </w:tr>
+      <w:tr>
+        <w:tc>
+          <w:tcPr>
+            <w:tcW w:type="pct" w:w="16.666666666666668%"/>
+            <w:tcMar>
+              <w:top w:type="dxa" w:w="100"/>
+              <w:left w:type="dxa" w:w="100"/>
+              <w:bottom w:type="dxa" w:w="100"/>
+              <w:right w:type="dxa" w:w="100"/>
+            </w:tcMar>
+          </w:tcPr>
+          <w:p>
+            <w:r>
+              <w:rPr>
+                <w:sz w:val="20"/>
+                <w:szCs w:val="20"/>
+              </w:rPr>
+              <w:t xml:space="preserve">Local Regular</w:t>
+            </w:r>
+          </w:p>
+        </w:tc>
+        <w:tc>
+          <w:tcPr>
+            <w:tcW w:type="pct" w:w="16.666666666666668%"/>
+            <w:tcMar>
+              <w:top w:type="dxa" w:w="100"/>
+              <w:left w:type="dxa" w:w="100"/>
+              <w:bottom w:type="dxa" w:w="100"/>
+              <w:right w:type="dxa" w:w="100"/>
+            </w:tcMar>
+          </w:tcPr>
+          <w:p>
+            <w:r>
+              <w:rPr>
+                <w:sz w:val="20"/>
+                <w:szCs w:val="20"/>
+              </w:rPr>
+              <w:t xml:space="preserve">0.264</w:t>
+            </w:r>
+          </w:p>
+        </w:tc>
+        <w:tc>
+          <w:tcPr>
+            <w:tcW w:type="pct" w:w="16.666666666666668%"/>
+            <w:tcMar>
+              <w:top w:type="dxa" w:w="100"/>
+              <w:left w:type="dxa" w:w="100"/>
+              <w:bottom w:type="dxa" w:w="100"/>
+              <w:right w:type="dxa" w:w="100"/>
+            </w:tcMar>
+          </w:tcPr>
+          <w:p>
+            <w:r>
+              <w:rPr>
+                <w:sz w:val="20"/>
+                <w:szCs w:val="20"/>
+              </w:rPr>
+              <w:t xml:space="preserve">0.314</w:t>
+            </w:r>
+          </w:p>
+        </w:tc>
+        <w:tc>
+          <w:tcPr>
+            <w:tcW w:type="pct" w:w="16.666666666666668%"/>
+            <w:tcMar>
+              <w:top w:type="dxa" w:w="100"/>
+              <w:left w:type="dxa" w:w="100"/>
+              <w:bottom w:type="dxa" w:w="100"/>
+              <w:right w:type="dxa" w:w="100"/>
+            </w:tcMar>
+          </w:tcPr>
+          <w:p>
+            <w:r>
+              <w:rPr>
+                <w:sz w:val="20"/>
+                <w:szCs w:val="20"/>
+              </w:rPr>
+              <w:t xml:space="preserve">0.277</w:t>
+            </w:r>
+          </w:p>
+        </w:tc>
+        <w:tc>
+          <w:tcPr>
+            <w:tcW w:type="pct" w:w="16.666666666666668%"/>
+            <w:tcMar>
+              <w:top w:type="dxa" w:w="100"/>
+              <w:left w:type="dxa" w:w="100"/>
+              <w:bottom w:type="dxa" w:w="100"/>
+              <w:right w:type="dxa" w:w="100"/>
+            </w:tcMar>
+          </w:tcPr>
+          <w:p>
+            <w:r>
+              <w:rPr>
+                <w:sz w:val="20"/>
+                <w:szCs w:val="20"/>
+              </w:rPr>
+              <w:t xml:space="preserve">+15.7%</w:t>
+            </w:r>
+          </w:p>
+        </w:tc>
+        <w:tc>
+          <w:tcPr>
+            <w:tcW w:type="pct" w:w="16.666666666666668%"/>
+            <w:tcMar>
+              <w:top w:type="dxa" w:w="100"/>
+              <w:left w:type="dxa" w:w="100"/>
+              <w:bottom w:type="dxa" w:w="100"/>
+              <w:right w:type="dxa" w:w="100"/>
+            </w:tcMar>
+          </w:tcPr>
+          <w:p>
+            <w:r>
+              <w:rPr>
+                <w:sz w:val="20"/>
+                <w:szCs w:val="20"/>
+              </w:rPr>
+              <w:t xml:space="preserve">62.3%</w:t>
+            </w:r>
+          </w:p>
+        </w:tc>
+      </w:tr>
+      <w:tr>
+        <w:tc>
+          <w:tcPr>
+            <w:tcW w:type="pct" w:w="16.666666666666668%"/>
+            <w:tcMar>
+              <w:top w:type="dxa" w:w="100"/>
+              <w:left w:type="dxa" w:w="100"/>
+              <w:bottom w:type="dxa" w:w="100"/>
+              <w:right w:type="dxa" w:w="100"/>
+            </w:tcMar>
+          </w:tcPr>
+          <w:p>
+            <w:r>
+              <w:rPr>
+                <w:sz w:val="20"/>
+                <w:szCs w:val="20"/>
+              </w:rPr>
+              <w:t xml:space="preserve">Local Premium</w:t>
+            </w:r>
+          </w:p>
+        </w:tc>
+        <w:tc>
+          <w:tcPr>
+            <w:tcW w:type="pct" w:w="16.666666666666668%"/>
+            <w:tcMar>
+              <w:top w:type="dxa" w:w="100"/>
+              <w:left w:type="dxa" w:w="100"/>
+              <w:bottom w:type="dxa" w:w="100"/>
+              <w:right w:type="dxa" w:w="100"/>
+            </w:tcMar>
+          </w:tcPr>
+          <w:p>
+            <w:r>
+              <w:rPr>
+                <w:sz w:val="20"/>
+                <w:szCs w:val="20"/>
+              </w:rPr>
+              <w:t xml:space="preserve">0.263</w:t>
+            </w:r>
+          </w:p>
+        </w:tc>
+        <w:tc>
+          <w:tcPr>
+            <w:tcW w:type="pct" w:w="16.666666666666668%"/>
+            <w:tcMar>
+              <w:top w:type="dxa" w:w="100"/>
+              <w:left w:type="dxa" w:w="100"/>
+              <w:bottom w:type="dxa" w:w="100"/>
+              <w:right w:type="dxa" w:w="100"/>
+            </w:tcMar>
+          </w:tcPr>
+          <w:p>
+            <w:r>
+              <w:rPr>
+                <w:sz w:val="20"/>
+                <w:szCs w:val="20"/>
+              </w:rPr>
+              <w:t xml:space="preserve">0.294</w:t>
+            </w:r>
+          </w:p>
+        </w:tc>
+        <w:tc>
+          <w:tcPr>
+            <w:tcW w:type="pct" w:w="16.666666666666668%"/>
+            <w:tcMar>
+              <w:top w:type="dxa" w:w="100"/>
+              <w:left w:type="dxa" w:w="100"/>
+              <w:bottom w:type="dxa" w:w="100"/>
+              <w:right w:type="dxa" w:w="100"/>
+            </w:tcMar>
+          </w:tcPr>
+          <w:p>
+            <w:r>
+              <w:rPr>
+                <w:sz w:val="20"/>
+                <w:szCs w:val="20"/>
+              </w:rPr>
+              <w:t xml:space="preserve">0.271</w:t>
+            </w:r>
+          </w:p>
+        </w:tc>
+        <w:tc>
+          <w:tcPr>
+            <w:tcW w:type="pct" w:w="16.666666666666668%"/>
+            <w:tcMar>
+              <w:top w:type="dxa" w:w="100"/>
+              <w:left w:type="dxa" w:w="100"/>
+              <w:bottom w:type="dxa" w:w="100"/>
+              <w:right w:type="dxa" w:w="100"/>
+            </w:tcMar>
+          </w:tcPr>
+          <w:p>
+            <w:r>
+              <w:rPr>
+                <w:sz w:val="20"/>
+                <w:szCs w:val="20"/>
+              </w:rPr>
+              <w:t xml:space="preserve">+10.3%</w:t>
+            </w:r>
+          </w:p>
+        </w:tc>
+        <w:tc>
+          <w:tcPr>
+            <w:tcW w:type="pct" w:w="16.666666666666668%"/>
+            <w:tcMar>
+              <w:top w:type="dxa" w:w="100"/>
+              <w:left w:type="dxa" w:w="100"/>
+              <w:bottom w:type="dxa" w:w="100"/>
+              <w:right w:type="dxa" w:w="100"/>
+            </w:tcMar>
+          </w:tcPr>
+          <w:p>
+            <w:r>
+              <w:rPr>
+                <w:sz w:val="20"/>
+                <w:szCs w:val="20"/>
+              </w:rPr>
+              <w:t xml:space="preserve">59.4%</w:t>
+            </w:r>
+          </w:p>
+        </w:tc>
+      </w:tr>
+      <w:tr>
+        <w:tc>
+          <w:tcPr>
+            <w:tcW w:type="pct" w:w="16.666666666666668%"/>
+            <w:tcMar>
+              <w:top w:type="dxa" w:w="100"/>
+              <w:left w:type="dxa" w:w="100"/>
+              <w:bottom w:type="dxa" w:w="100"/>
+              <w:right w:type="dxa" w:w="100"/>
+            </w:tcMar>
+          </w:tcPr>
+          <w:p>
+            <w:r>
+              <w:rPr>
+                <w:sz w:val="20"/>
+                <w:szCs w:val="20"/>
+              </w:rPr>
+              <w:t xml:space="preserve">Local Special</w:t>
+            </w:r>
+          </w:p>
+        </w:tc>
+        <w:tc>
+          <w:tcPr>
+            <w:tcW w:type="pct" w:w="16.666666666666668%"/>
+            <w:tcMar>
+              <w:top w:type="dxa" w:w="100"/>
+              <w:left w:type="dxa" w:w="100"/>
+              <w:bottom w:type="dxa" w:w="100"/>
+              <w:right w:type="dxa" w:w="100"/>
+            </w:tcMar>
+          </w:tcPr>
+          <w:p>
+            <w:r>
+              <w:rPr>
+                <w:sz w:val="20"/>
+                <w:szCs w:val="20"/>
+              </w:rPr>
+              <w:t xml:space="preserve">0.215</w:t>
+            </w:r>
+          </w:p>
+        </w:tc>
+        <w:tc>
+          <w:tcPr>
+            <w:tcW w:type="pct" w:w="16.666666666666668%"/>
+            <w:tcMar>
+              <w:top w:type="dxa" w:w="100"/>
+              <w:left w:type="dxa" w:w="100"/>
+              <w:bottom w:type="dxa" w:w="100"/>
+              <w:right w:type="dxa" w:w="100"/>
+            </w:tcMar>
+          </w:tcPr>
+          <w:p>
+            <w:r>
+              <w:rPr>
+                <w:sz w:val="20"/>
+                <w:szCs w:val="20"/>
+              </w:rPr>
+              <w:t xml:space="preserve">0.255</w:t>
+            </w:r>
+          </w:p>
+        </w:tc>
+        <w:tc>
+          <w:tcPr>
+            <w:tcW w:type="pct" w:w="16.666666666666668%"/>
+            <w:tcMar>
+              <w:top w:type="dxa" w:w="100"/>
+              <w:left w:type="dxa" w:w="100"/>
+              <w:bottom w:type="dxa" w:w="100"/>
+              <w:right w:type="dxa" w:w="100"/>
+            </w:tcMar>
+          </w:tcPr>
+          <w:p>
+            <w:r>
+              <w:rPr>
+                <w:sz w:val="20"/>
+                <w:szCs w:val="20"/>
+              </w:rPr>
+              <w:t xml:space="preserve">0.225</w:t>
+            </w:r>
+          </w:p>
+        </w:tc>
+        <w:tc>
+          <w:tcPr>
+            <w:tcW w:type="pct" w:w="16.666666666666668%"/>
+            <w:tcMar>
+              <w:top w:type="dxa" w:w="100"/>
+              <w:left w:type="dxa" w:w="100"/>
+              <w:bottom w:type="dxa" w:w="100"/>
+              <w:right w:type="dxa" w:w="100"/>
+            </w:tcMar>
+          </w:tcPr>
+          <w:p>
+            <w:r>
+              <w:rPr>
+                <w:sz w:val="20"/>
+                <w:szCs w:val="20"/>
+              </w:rPr>
+              <w:t xml:space="preserve">+15.6%</w:t>
+            </w:r>
+          </w:p>
+        </w:tc>
+        <w:tc>
+          <w:tcPr>
+            <w:tcW w:type="pct" w:w="16.666666666666668%"/>
+            <w:tcMar>
+              <w:top w:type="dxa" w:w="100"/>
+              <w:left w:type="dxa" w:w="100"/>
+              <w:bottom w:type="dxa" w:w="100"/>
+              <w:right w:type="dxa" w:w="100"/>
+            </w:tcMar>
+          </w:tcPr>
+          <w:p>
+            <w:r>
+              <w:rPr>
+                <w:sz w:val="20"/>
+                <w:szCs w:val="20"/>
+              </w:rPr>
+              <w:t xml:space="preserve">57.9%</w:t>
+            </w:r>
+          </w:p>
+        </w:tc>
+      </w:tr>
+      <w:tr>
+        <w:tc>
+          <w:tcPr>
+            <w:tcW w:type="pct" w:w="16.666666666666668%"/>
+            <w:tcMar>
+              <w:top w:type="dxa" w:w="100"/>
+              <w:left w:type="dxa" w:w="100"/>
+              <w:bottom w:type="dxa" w:w="100"/>
+              <w:right w:type="dxa" w:w="100"/>
+            </w:tcMar>
+          </w:tcPr>
+          <w:p>
+            <w:r>
+              <w:rPr>
+                <w:sz w:val="20"/>
+                <w:szCs w:val="20"/>
+              </w:rPr>
+              <w:t xml:space="preserve">Imported Well-Milled</w:t>
+            </w:r>
+          </w:p>
+        </w:tc>
+        <w:tc>
+          <w:tcPr>
+            <w:tcW w:type="pct" w:w="16.666666666666668%"/>
+            <w:tcMar>
+              <w:top w:type="dxa" w:w="100"/>
+              <w:left w:type="dxa" w:w="100"/>
+              <w:bottom w:type="dxa" w:w="100"/>
+              <w:right w:type="dxa" w:w="100"/>
+            </w:tcMar>
+          </w:tcPr>
+          <w:p>
+            <w:r>
+              <w:rPr>
+                <w:sz w:val="20"/>
+                <w:szCs w:val="20"/>
+              </w:rPr>
+              <w:t xml:space="preserve">0.283</w:t>
+            </w:r>
+          </w:p>
+        </w:tc>
+        <w:tc>
+          <w:tcPr>
+            <w:tcW w:type="pct" w:w="16.666666666666668%"/>
+            <w:tcMar>
+              <w:top w:type="dxa" w:w="100"/>
+              <w:left w:type="dxa" w:w="100"/>
+              <w:bottom w:type="dxa" w:w="100"/>
+              <w:right w:type="dxa" w:w="100"/>
+            </w:tcMar>
+          </w:tcPr>
+          <w:p>
+            <w:r>
+              <w:rPr>
+                <w:sz w:val="20"/>
+                <w:szCs w:val="20"/>
+              </w:rPr>
+              <w:t xml:space="preserve">0.292</w:t>
+            </w:r>
+          </w:p>
+        </w:tc>
+        <w:tc>
+          <w:tcPr>
+            <w:tcW w:type="pct" w:w="16.666666666666668%"/>
+            <w:tcMar>
+              <w:top w:type="dxa" w:w="100"/>
+              <w:left w:type="dxa" w:w="100"/>
+              <w:bottom w:type="dxa" w:w="100"/>
+              <w:right w:type="dxa" w:w="100"/>
+            </w:tcMar>
+          </w:tcPr>
+          <w:p>
+            <w:r>
+              <w:rPr>
+                <w:sz w:val="20"/>
+                <w:szCs w:val="20"/>
+              </w:rPr>
+              <w:t xml:space="preserve">0.297</w:t>
+            </w:r>
+          </w:p>
+        </w:tc>
+        <w:tc>
+          <w:tcPr>
+            <w:tcW w:type="pct" w:w="16.666666666666668%"/>
+            <w:tcMar>
+              <w:top w:type="dxa" w:w="100"/>
+              <w:left w:type="dxa" w:w="100"/>
+              <w:bottom w:type="dxa" w:w="100"/>
+              <w:right w:type="dxa" w:w="100"/>
+            </w:tcMar>
+          </w:tcPr>
+          <w:p>
+            <w:r>
+              <w:rPr>
+                <w:sz w:val="20"/>
+                <w:szCs w:val="20"/>
+              </w:rPr>
+              <w:t xml:space="preserve">+3.2%</w:t>
+            </w:r>
+          </w:p>
+        </w:tc>
+        <w:tc>
+          <w:tcPr>
+            <w:tcW w:type="pct" w:w="16.666666666666668%"/>
+            <w:tcMar>
+              <w:top w:type="dxa" w:w="100"/>
+              <w:left w:type="dxa" w:w="100"/>
+              <w:bottom w:type="dxa" w:w="100"/>
+              <w:right w:type="dxa" w:w="100"/>
+            </w:tcMar>
+          </w:tcPr>
+          <w:p>
+            <w:r>
+              <w:rPr>
+                <w:sz w:val="20"/>
+                <w:szCs w:val="20"/>
+              </w:rPr>
+              <w:t xml:space="preserve">65.6%</w:t>
+            </w:r>
+          </w:p>
+        </w:tc>
+      </w:tr>
+      <w:tr>
+        <w:tc>
+          <w:tcPr>
+            <w:tcW w:type="pct" w:w="16.666666666666668%"/>
+            <w:tcMar>
+              <w:top w:type="dxa" w:w="100"/>
+              <w:left w:type="dxa" w:w="100"/>
+              <w:bottom w:type="dxa" w:w="100"/>
+              <w:right w:type="dxa" w:w="100"/>
+            </w:tcMar>
+          </w:tcPr>
+          <w:p>
+            <w:r>
+              <w:rPr>
+                <w:sz w:val="20"/>
+                <w:szCs w:val="20"/>
+              </w:rPr>
+              <w:t xml:space="preserve">Imported Regular</w:t>
+            </w:r>
+          </w:p>
+        </w:tc>
+        <w:tc>
+          <w:tcPr>
+            <w:tcW w:type="pct" w:w="16.666666666666668%"/>
+            <w:tcMar>
+              <w:top w:type="dxa" w:w="100"/>
+              <w:left w:type="dxa" w:w="100"/>
+              <w:bottom w:type="dxa" w:w="100"/>
+              <w:right w:type="dxa" w:w="100"/>
+            </w:tcMar>
+          </w:tcPr>
+          <w:p>
+            <w:r>
+              <w:rPr>
+                <w:sz w:val="20"/>
+                <w:szCs w:val="20"/>
+              </w:rPr>
+              <w:t xml:space="preserve">0.329</w:t>
+            </w:r>
+          </w:p>
+        </w:tc>
+        <w:tc>
+          <w:tcPr>
+            <w:tcW w:type="pct" w:w="16.666666666666668%"/>
+            <w:tcMar>
+              <w:top w:type="dxa" w:w="100"/>
+              <w:left w:type="dxa" w:w="100"/>
+              <w:bottom w:type="dxa" w:w="100"/>
+              <w:right w:type="dxa" w:w="100"/>
+            </w:tcMar>
+          </w:tcPr>
+          <w:p>
+            <w:r>
+              <w:rPr>
+                <w:sz w:val="20"/>
+                <w:szCs w:val="20"/>
+              </w:rPr>
+              <w:t xml:space="preserve">0.346</w:t>
+            </w:r>
+          </w:p>
+        </w:tc>
+        <w:tc>
+          <w:tcPr>
+            <w:tcW w:type="pct" w:w="16.666666666666668%"/>
+            <w:tcMar>
+              <w:top w:type="dxa" w:w="100"/>
+              <w:left w:type="dxa" w:w="100"/>
+              <w:bottom w:type="dxa" w:w="100"/>
+              <w:right w:type="dxa" w:w="100"/>
+            </w:tcMar>
+          </w:tcPr>
+          <w:p>
+            <w:r>
+              <w:rPr>
+                <w:sz w:val="20"/>
+                <w:szCs w:val="20"/>
+              </w:rPr>
+              <w:t xml:space="preserve">0.353</w:t>
+            </w:r>
+          </w:p>
+        </w:tc>
+        <w:tc>
+          <w:tcPr>
+            <w:tcW w:type="pct" w:w="16.666666666666668%"/>
+            <w:tcMar>
+              <w:top w:type="dxa" w:w="100"/>
+              <w:left w:type="dxa" w:w="100"/>
+              <w:bottom w:type="dxa" w:w="100"/>
+              <w:right w:type="dxa" w:w="100"/>
+            </w:tcMar>
+          </w:tcPr>
+          <w:p>
+            <w:r>
+              <w:rPr>
+                <w:sz w:val="20"/>
+                <w:szCs w:val="20"/>
+              </w:rPr>
+              <w:t xml:space="preserve">+5.0%</w:t>
+            </w:r>
+          </w:p>
+        </w:tc>
+        <w:tc>
+          <w:tcPr>
+            <w:tcW w:type="pct" w:w="16.666666666666668%"/>
+            <w:tcMar>
+              <w:top w:type="dxa" w:w="100"/>
+              <w:left w:type="dxa" w:w="100"/>
+              <w:bottom w:type="dxa" w:w="100"/>
+              <w:right w:type="dxa" w:w="100"/>
+            </w:tcMar>
+          </w:tcPr>
+          <w:p>
+            <w:r>
+              <w:rPr>
+                <w:sz w:val="20"/>
+                <w:szCs w:val="20"/>
+              </w:rPr>
+              <w:t xml:space="preserve">45.7%*</w:t>
+            </w:r>
+          </w:p>
+        </w:tc>
+      </w:tr>
+      <w:tr>
+        <w:tc>
+          <w:tcPr>
+            <w:tcW w:type="pct" w:w="16.666666666666668%"/>
+            <w:tcMar>
+              <w:top w:type="dxa" w:w="100"/>
+              <w:left w:type="dxa" w:w="100"/>
+              <w:bottom w:type="dxa" w:w="100"/>
+              <w:right w:type="dxa" w:w="100"/>
+            </w:tcMar>
+          </w:tcPr>
+          <w:p>
+            <w:r>
+              <w:rPr>
+                <w:sz w:val="20"/>
+                <w:szCs w:val="20"/>
+              </w:rPr>
+              <w:t xml:space="preserve">Imported Premium</w:t>
+            </w:r>
+          </w:p>
+        </w:tc>
+        <w:tc>
+          <w:tcPr>
+            <w:tcW w:type="pct" w:w="16.666666666666668%"/>
+            <w:tcMar>
+              <w:top w:type="dxa" w:w="100"/>
+              <w:left w:type="dxa" w:w="100"/>
+              <w:bottom w:type="dxa" w:w="100"/>
+              <w:right w:type="dxa" w:w="100"/>
+            </w:tcMar>
+          </w:tcPr>
+          <w:p>
+            <w:r>
+              <w:rPr>
+                <w:sz w:val="20"/>
+                <w:szCs w:val="20"/>
+              </w:rPr>
+              <w:t xml:space="preserve">0.309</w:t>
+            </w:r>
+          </w:p>
+        </w:tc>
+        <w:tc>
+          <w:tcPr>
+            <w:tcW w:type="pct" w:w="16.666666666666668%"/>
+            <w:tcMar>
+              <w:top w:type="dxa" w:w="100"/>
+              <w:left w:type="dxa" w:w="100"/>
+              <w:bottom w:type="dxa" w:w="100"/>
+              <w:right w:type="dxa" w:w="100"/>
+            </w:tcMar>
+          </w:tcPr>
+          <w:p>
+            <w:r>
+              <w:rPr>
+                <w:sz w:val="20"/>
+                <w:szCs w:val="20"/>
+              </w:rPr>
+              <w:t xml:space="preserve">0.318</w:t>
+            </w:r>
+          </w:p>
+        </w:tc>
+        <w:tc>
+          <w:tcPr>
+            <w:tcW w:type="pct" w:w="16.666666666666668%"/>
+            <w:tcMar>
+              <w:top w:type="dxa" w:w="100"/>
+              <w:left w:type="dxa" w:w="100"/>
+              <w:bottom w:type="dxa" w:w="100"/>
+              <w:right w:type="dxa" w:w="100"/>
+            </w:tcMar>
+          </w:tcPr>
+          <w:p>
+            <w:r>
+              <w:rPr>
+                <w:sz w:val="20"/>
+                <w:szCs w:val="20"/>
+              </w:rPr>
+              <w:t xml:space="preserve">0.351</w:t>
+            </w:r>
+          </w:p>
+        </w:tc>
+        <w:tc>
+          <w:tcPr>
+            <w:tcW w:type="pct" w:w="16.666666666666668%"/>
+            <w:tcMar>
+              <w:top w:type="dxa" w:w="100"/>
+              <w:left w:type="dxa" w:w="100"/>
+              <w:bottom w:type="dxa" w:w="100"/>
+              <w:right w:type="dxa" w:w="100"/>
+            </w:tcMar>
+          </w:tcPr>
+          <w:p>
+            <w:r>
+              <w:rPr>
+                <w:sz w:val="20"/>
+                <w:szCs w:val="20"/>
+              </w:rPr>
+              <w:t xml:space="preserve">+2.6%</w:t>
+            </w:r>
+          </w:p>
+        </w:tc>
+        <w:tc>
+          <w:tcPr>
+            <w:tcW w:type="pct" w:w="16.666666666666668%"/>
+            <w:tcMar>
+              <w:top w:type="dxa" w:w="100"/>
+              <w:left w:type="dxa" w:w="100"/>
+              <w:bottom w:type="dxa" w:w="100"/>
+              <w:right w:type="dxa" w:w="100"/>
+            </w:tcMar>
+          </w:tcPr>
+          <w:p>
+            <w:r>
+              <w:rPr>
+                <w:sz w:val="20"/>
+                <w:szCs w:val="20"/>
+              </w:rPr>
+              <w:t xml:space="preserve">50.3%*</w:t>
+            </w:r>
+          </w:p>
+        </w:tc>
+      </w:tr>
+      <w:tr>
+        <w:tc>
+          <w:tcPr>
+            <w:tcW w:type="pct" w:w="16.666666666666668%"/>
+            <w:tcMar>
+              <w:top w:type="dxa" w:w="100"/>
+              <w:left w:type="dxa" w:w="100"/>
+              <w:bottom w:type="dxa" w:w="100"/>
+              <w:right w:type="dxa" w:w="100"/>
+            </w:tcMar>
+          </w:tcPr>
+          <w:p>
+            <w:r>
+              <w:rPr>
+                <w:sz w:val="20"/>
+                <w:szCs w:val="20"/>
+              </w:rPr>
+              <w:t xml:space="preserve">Imported Special</w:t>
+            </w:r>
+          </w:p>
+        </w:tc>
+        <w:tc>
+          <w:tcPr>
+            <w:tcW w:type="pct" w:w="16.666666666666668%"/>
+            <w:tcMar>
+              <w:top w:type="dxa" w:w="100"/>
+              <w:left w:type="dxa" w:w="100"/>
+              <w:bottom w:type="dxa" w:w="100"/>
+              <w:right w:type="dxa" w:w="100"/>
+            </w:tcMar>
+          </w:tcPr>
+          <w:p>
+            <w:r>
+              <w:rPr>
+                <w:sz w:val="20"/>
+                <w:szCs w:val="20"/>
+              </w:rPr>
+              <w:t xml:space="preserve">0.339</w:t>
+            </w:r>
+          </w:p>
+        </w:tc>
+        <w:tc>
+          <w:tcPr>
+            <w:tcW w:type="pct" w:w="16.666666666666668%"/>
+            <w:tcMar>
+              <w:top w:type="dxa" w:w="100"/>
+              <w:left w:type="dxa" w:w="100"/>
+              <w:bottom w:type="dxa" w:w="100"/>
+              <w:right w:type="dxa" w:w="100"/>
+            </w:tcMar>
+          </w:tcPr>
+          <w:p>
+            <w:r>
+              <w:rPr>
+                <w:sz w:val="20"/>
+                <w:szCs w:val="20"/>
+              </w:rPr>
+              <w:t xml:space="preserve">0.396</w:t>
+            </w:r>
+          </w:p>
+        </w:tc>
+        <w:tc>
+          <w:tcPr>
+            <w:tcW w:type="pct" w:w="16.666666666666668%"/>
+            <w:tcMar>
+              <w:top w:type="dxa" w:w="100"/>
+              <w:left w:type="dxa" w:w="100"/>
+              <w:bottom w:type="dxa" w:w="100"/>
+              <w:right w:type="dxa" w:w="100"/>
+            </w:tcMar>
+          </w:tcPr>
+          <w:p>
+            <w:r>
+              <w:rPr>
+                <w:sz w:val="20"/>
+                <w:szCs w:val="20"/>
+              </w:rPr>
+              <w:t xml:space="preserve">0.343</w:t>
+            </w:r>
+          </w:p>
+        </w:tc>
+        <w:tc>
+          <w:tcPr>
+            <w:tcW w:type="pct" w:w="16.666666666666668%"/>
+            <w:tcMar>
+              <w:top w:type="dxa" w:w="100"/>
+              <w:left w:type="dxa" w:w="100"/>
+              <w:bottom w:type="dxa" w:w="100"/>
+              <w:right w:type="dxa" w:w="100"/>
+            </w:tcMar>
+          </w:tcPr>
+          <w:p>
+            <w:r>
+              <w:rPr>
+                <w:sz w:val="20"/>
+                <w:szCs w:val="20"/>
+              </w:rPr>
+              <w:t xml:space="preserve">+14.2%</w:t>
+            </w:r>
+          </w:p>
+        </w:tc>
+        <w:tc>
+          <w:tcPr>
+            <w:tcW w:type="pct" w:w="16.666666666666668%"/>
+            <w:tcMar>
+              <w:top w:type="dxa" w:w="100"/>
+              <w:left w:type="dxa" w:w="100"/>
+              <w:bottom w:type="dxa" w:w="100"/>
+              <w:right w:type="dxa" w:w="100"/>
+            </w:tcMar>
+          </w:tcPr>
+          <w:p>
+            <w:r>
+              <w:rPr>
+                <w:sz w:val="20"/>
+                <w:szCs w:val="20"/>
+              </w:rPr>
+              <w:t xml:space="preserve">68.9%</w:t>
+            </w:r>
+          </w:p>
+        </w:tc>
+      </w:tr>
+    </w:tbl>
+    <w:p>
+      <w:pPr>
+        <w:spacing w:after="200" w:line="360"/>
+        <w:ind w:firstLine="720"/>
+        <w:jc w:val="both"/>
+      </w:pPr>
+      <w:r>
+        <w:rPr>
+          <w:sz w:val="24"/>
+          <w:szCs w:val="24"/>
+        </w:rPr>
+        <w:t xml:space="preserve">Note. MAE is pooled over forecast days 1 to 3. Skill = 1 − MAE ÷ naive MAE. Day-1 direction is the share of actual price moves whose direction was forecast correctly; * = not significantly different from 50% (one-sided binomial test, α = 0.05).</w:t>
+      </w:r>
+    </w:p>
+    <w:p>
+      <w:pPr>
+        <w:spacing w:after="200" w:line="360"/>
+        <w:ind w:firstLine="720"/>
+        <w:jc w:val="both"/>
+      </w:pPr>
+      <w:r>
+        <w:rPr>
+          <w:sz w:val="24"/>
+          <w:szCs w:val="24"/>
+        </w:rPr>
+        <w:t xml:space="preserve">The published forecast was more accurate than the naive persistence baseline for all eight rice types (mean skill +10.06%, lowest +2.63% for Imported Premium) and more accurate than ARIMA(1,1,1) for all eight. Its mean absolute error was PHP 0.22 to 0.34 per kilogram. Pooled over the eight rice types, 87.0% of day-1 forecasts were within PHP 0.50 of the actual price (84.0% on day 2 and 81.9% on day 3) and 96.1% were within PHP 1.00. The published price ranges contained the actual price 91.5% of the time against a 90% target. A blocked rolling-origin check over five consecutive blocks of the test window gave a mean MAE of PHP 0.280 (standard deviation 0.076) for Local Well-Milled, showing that the accuracy is not driven by a single favourable period.</w:t>
+      </w:r>
+    </w:p>
+    <w:p>
+      <w:pPr>
+        <w:spacing w:after="200" w:line="360"/>
+        <w:ind w:firstLine="720"/>
+        <w:jc w:val="both"/>
+      </w:pPr>
+      <w:r>
+        <w:rPr>
+          <w:sz w:val="24"/>
+          <w:szCs w:val="24"/>
+        </w:rPr>
+        <w:t xml:space="preserve">The forecast direction was correct for 57.9% to 68.9% of actual day-1 moves for six of the eight rice types. For Imported Regular (45.7% of 210 moves) and Imported Premium (50.3%) it was not significantly different from chance, so the system should not be relied on for the up/down direction of those two types; their price level forecasts still beat both baselines.</w:t>
+      </w:r>
+    </w:p>
+    <w:p>
+      <w:pPr>
+        <w:spacing w:after="100" w:before="200"/>
+      </w:pPr>
+      <w:r>
+        <w:rPr>
+          <w:b/>
+          <w:bCs/>
+          <w:i/>
+          <w:iCs/>
+          <w:sz w:val="24"/>
+          <w:szCs w:val="24"/>
+        </w:rPr>
+        <w:t xml:space="preserve">Contribution of each component</w:t>
+      </w:r>
+    </w:p>
+    <w:p>
+      <w:pPr>
+        <w:spacing w:after="200" w:line="360"/>
+        <w:ind w:firstLine="720"/>
+        <w:jc w:val="both"/>
+      </w:pPr>
+      <w:r>
+        <w:rPr>
+          <w:sz w:val="24"/>
+          <w:szCs w:val="24"/>
+        </w:rPr>
+        <w:t xml:space="preserve">The components were also scored separately on the same test window. The LSTM network on its own essentially repeated the last observed price (skill −1.29%), because most of its training data comes from the weekly era, in which about 82% of daily rows are unchanged carried-forward values. Adding the weekday mean-reversion term produced the LSTM hybrid, which beat the naive baseline for all eight rice types (skill +7.80%) and ARIMA for four of eight. Combining the hybrid with ARIMA and the Kalman filter produced the published ensemble (skill +10.06%, better than ARIMA for eight of eight). On the test window the three components received nearly equal average weights (about one third each), which is consistent with the finding that no single model dominated.</w:t>
+      </w:r>
+    </w:p>
+    <w:p>
+      <w:pPr>
+        <w:spacing w:after="200" w:line="360"/>
+        <w:ind w:firstLine="720"/>
+        <w:jc w:val="both"/>
+      </w:pPr>
+      <w:r>
+        <w:rPr>
+          <w:sz w:val="24"/>
+          <w:szCs w:val="24"/>
+        </w:rPr>
+        <w:t xml:space="preserve">A paired McNemar test on the forecasts where the LSTM hybrid and the mean-reversion term alone disagreed found no significant contribution from the network (149 forecasts improved versus 151 worsened, p = 0.95). Nine alternative training strategies were tested to change this and none improved accuracy on the test window. The researchers attribute this to the amount of genuinely daily data: only about 544 daily-observation days exist so far, and for a near-random-walk price series the most recent price is already close to the optimal short-term predictor. The accuracy gain over the baselines therefore comes from the mean-reversion structure and from forecast combination, not from the network alone. The LSTM remains in the system as the learned multivariate component, and its contribution should be re-tested as more daily data accumulates.</w:t>
+      </w:r>
+    </w:p>
+    <w:p>
+      <w:pPr>
+        <w:spacing w:after="200" w:line="360"/>
+        <w:ind w:firstLine="720"/>
+        <w:jc w:val="both"/>
+      </w:pPr>
+      <w:r>
+        <w:rPr>
+          <w:sz w:val="24"/>
+          <w:szCs w:val="24"/>
+        </w:rPr>
+        <w:t xml:space="preserve">Because the test window was also used to compare many candidate designs during development, the figures above may be slightly optimistic. To confirm them on data no design decision could have seen, every forecast published since September 26, 2026 is logged before its DA price exists and scored afterwards (prospective evaluation).</w:t>
+      </w:r>
+    </w:p>
+    <w:p>
+      <w:pPr>
+        <w:spacing w:after="200" w:before="100"/>
+      </w:pPr>
+      <w:r>
+        <w:rPr>
+          <w:b/>
+          <w:bCs/>
+          <w:color w:val="C00000"/>
+          <w:sz w:val="22"/>
+          <w:szCs w:val="22"/>
+        </w:rPr>
+        <w:t xml:space="preserve">[ACTION before the defense — add the prospective-evaluation results here: open http://127.0.0.1:5000/api/forecast-check (or run: cd model &amp;&amp; py -3.13 forecast_log.py) and report the overall MAE, naive MAE, skill, and range coverage with the number of scored forecasts and the date range.]</w:t>
+      </w:r>
+    </w:p>
+    <w:p>
+      <w:pPr>
+        <w:spacing w:after="150" w:before="300"/>
+      </w:pPr>
+      <w:r>
+        <w:rPr>
+          <w:b/>
+          <w:bCs/>
+          <w:sz w:val="24"/>
+          <w:szCs w:val="24"/>
+        </w:rPr>
+        <w:t xml:space="preserve">Statement of the Problem 2: The Automated Data Processing Engine</w:t>
+      </w:r>
+    </w:p>
+    <w:p>
+      <w:pPr>
+        <w:spacing w:after="200" w:line="360"/>
+        <w:ind w:firstLine="720"/>
+        <w:jc w:val="both"/>
+      </w:pPr>
+      <w:r>
+        <w:rPr>
+          <w:sz w:val="24"/>
+          <w:szCs w:val="24"/>
+        </w:rPr>
+        <w:t xml:space="preserve">The data processing engine collects the DA-AMAS rice price bulletin, fuel prices, and the USD–PHP exchange rate automatically every 24 hours and stores them in a local SQLite database. At the time of writing the database holds 4,018 historical retail price records (2015–2025) and 269 daily 2026 rice price records through September 26, 2026, together with fuel, exchange-rate, stock and farmgate series. The position-based PDF reader correctly maps prices to their rice types in saved bulletins that contain missing ("n/a") values, which previously shifted imported rice prices into the wrong column; the plausibility guard holds suspicious readings for administrator review instead of saving them. These behaviours are covered by the automated test suite (74 tests, all passing). After each successful scrape the published forecast is rebuilt automatically, so the website reflects a new DA bulletin without a server restart.</w:t>
+      </w:r>
+    </w:p>
+    <w:p>
+      <w:pPr>
+        <w:spacing w:after="150" w:before="300"/>
+      </w:pPr>
+      <w:r>
+        <w:rPr>
+          <w:b/>
+          <w:bCs/>
+          <w:sz w:val="24"/>
+          <w:szCs w:val="24"/>
+        </w:rPr>
+        <w:t xml:space="preserve">Statements of the Problem 3 to 6: System Evaluation</w:t>
+      </w:r>
+    </w:p>
+    <w:p>
+      <w:pPr>
+        <w:spacing w:after="200" w:before="100"/>
+      </w:pPr>
+      <w:r>
+        <w:rPr>
+          <w:b/>
+          <w:bCs/>
+          <w:color w:val="C00000"/>
+          <w:sz w:val="22"/>
+          <w:szCs w:val="22"/>
+        </w:rPr>
+        <w:t xml:space="preserve">[TEAM INPUT REQUIRED — insert the weighted mean, standard deviation and verbal interpretation tables for DA-AMAS (SOP 3), households (SOP 4), local vendors (SOP 5) and IT professionals (SOP 6), followed by the one-way ANOVA result.]</w:t>
+      </w:r>
+    </w:p>
+    <w:p>
+      <w:pPr>
+        <w:pageBreakBefore/>
+        <w:spacing w:after="300" w:before="500"/>
+        <w:jc w:val="center"/>
+      </w:pPr>
+      <w:r>
+        <w:rPr>
+          <w:b/>
+          <w:bCs/>
+          <w:sz w:val="28"/>
+          <w:szCs w:val="28"/>
+        </w:rPr>
+        <w:t xml:space="preserve">CHAPTER 5 – SUMMARY, CONCLUSIONS, AND RECOMMENDATIONS</w:t>
+      </w:r>
+    </w:p>
+    <w:p>
+      <w:pPr>
+        <w:spacing w:after="150" w:before="300"/>
+      </w:pPr>
+      <w:r>
+        <w:rPr>
+          <w:b/>
+          <w:bCs/>
+          <w:sz w:val="24"/>
+          <w:szCs w:val="24"/>
+        </w:rPr>
+        <w:t xml:space="preserve">Summary of Findings</w:t>
+      </w:r>
+    </w:p>
+    <w:p>
+      <w:pPr>
+        <w:spacing w:after="200" w:line="360"/>
+        <w:ind w:firstLine="720"/>
+        <w:jc w:val="both"/>
+      </w:pPr>
+      <w:r>
+        <w:rPr>
+          <w:sz w:val="24"/>
+          <w:szCs w:val="24"/>
+        </w:rPr>
+        <w:t xml:space="preserve">AgriPrice forecasts the retail price of eight rice types in the NCR one to three days ahead. On a held-out test window of almost one year, its published forecast was more accurate than both naive persistence and ARIMA(1,1,1) for all eight rice types (mean skill +10.06% over persistence), with a mean absolute error of PHP 0.22 to 0.34 per kilogram and price ranges that contained the actual price 91.5% of the time. Its up/down direction was reliable for six of the eight rice types. The LSTM network alone did not add significant accuracy at the current amount of daily data; the gain came from the weekday mean-reversion structure and the adaptive combination with ARIMA and a Kalman filter. The data engine collects and validates the inputs automatically every day.</w:t>
+      </w:r>
+    </w:p>
+    <w:p>
+      <w:pPr>
+        <w:spacing w:after="150" w:before="300"/>
+      </w:pPr>
+      <w:r>
+        <w:rPr>
+          <w:b/>
+          <w:bCs/>
+          <w:sz w:val="24"/>
+          <w:szCs w:val="24"/>
+        </w:rPr>
+        <w:t xml:space="preserve">Conclusions</w:t>
+      </w:r>
+    </w:p>
+    <w:p>
+      <w:pPr>
+        <w:spacing w:after="200" w:line="360"/>
+        <w:ind w:firstLine="720"/>
+        <w:jc w:val="both"/>
+      </w:pPr>
+      <w:r>
+        <w:rPr>
+          <w:sz w:val="24"/>
+          <w:szCs w:val="24"/>
+        </w:rPr>
+        <w:t xml:space="preserve">A multivariate LSTM-based forecasting system can provide a 48- to 72-hour price lead time for NCR retail rice that is measurably more accurate than a naive or a classical statistical forecast, provided that it is evaluated on genuinely daily data and combined with simple statistical structure. An automated, validated data pipeline makes this forecast available daily without manual work.</w:t>
+      </w:r>
+    </w:p>
+    <w:p>
+      <w:pPr>
+        <w:spacing w:after="200" w:before="100"/>
+      </w:pPr>
+      <w:r>
+        <w:rPr>
+          <w:b/>
+          <w:bCs/>
+          <w:color w:val="C00000"/>
+          <w:sz w:val="22"/>
+          <w:szCs w:val="22"/>
+        </w:rPr>
+        <w:t xml:space="preserve">[TEAM INPUT REQUIRED — add the conclusions for SOP 3 to 6 from the survey results.]</w:t>
+      </w:r>
+    </w:p>
+    <w:p>
+      <w:pPr>
+        <w:spacing w:after="150" w:before="300"/>
+      </w:pPr>
+      <w:r>
+        <w:rPr>
+          <w:b/>
+          <w:bCs/>
+          <w:sz w:val="24"/>
+          <w:szCs w:val="24"/>
+        </w:rPr>
+        <w:t xml:space="preserve">Recommendations</w:t>
+      </w:r>
+    </w:p>
+    <w:p>
+      <w:pPr>
+        <w:spacing w:after="200" w:line="360"/>
+        <w:ind w:firstLine="720"/>
+        <w:jc w:val="both"/>
+      </w:pPr>
+      <w:r>
+        <w:rPr>
+          <w:sz w:val="24"/>
+          <w:szCs w:val="24"/>
+        </w:rPr>
+        <w:t xml:space="preserve">1. Retrain the model as the daily-observation record grows and re-test whether the LSTM network adds accuracy; the test in this study had only about 544 daily days available. 2. Continue the prospective evaluation and report it alongside the test-window results. 3. Add explicit asymmetric (rising versus falling) diesel and exchange-rate features to test the "rockets and feathers" theory directly. 4. Evaluate weather and typhoon indicators as additional inputs. 5. Apply least-privilege file permissions to the database before a public deployment. 6. Extend the approach to other commodities and regions where daily price data is available.</w:t>
       </w:r>
     </w:p>
     <w:sectPr>

</xml_diff>

<commit_message>
bug fix update for devrai-pogi
</commit_message>
<xml_diff>
--- a/documents/AgriPrice_Draft_Revised.docx
+++ b/documents/AgriPrice_Draft_Revised.docx
@@ -2901,7 +2901,7 @@
           <w:sz w:val="24"/>
           <w:szCs w:val="24"/>
         </w:rPr>
-        <w:t xml:space="preserve">The conceptual framework of AgriPrice illustrates the complete process flow of the system from automated data collection to the delivery of actionable rice price forecasts to end-users in the NCR. The framework begins with four parallel data input streams, each collected automatically without manual intervention. The first stream retrieves daily retail rice prices for eight commercial categories from the DA-AMAS portal using rule-based, layout-aware PDF price-table extraction. The second stream captures the daily USD to PHP exchange rate via a financial API. The third stream integrates weekly diesel pump prices from a public Manila fuel-price source. The fourth stream encodes an agricultural seasonality index based on the Philippine rice production calendar.</w:t>
+        <w:t xml:space="preserve">The conceptual framework of AgriPrice illustrates the complete process flow of the system from automated data collection to the delivery of actionable rice price forecasts to end-users in the NCR. The framework begins with four parallel data input streams, each collected automatically without manual intervention. The first stream retrieves daily retail rice prices for eight commercial categories from the DA-AMAS portal using rule-based, layout-aware PDF price-table extraction. The second stream captures the daily USD to PHP exchange rate via a financial API. The third stream integrates weekly diesel and gasoline pump prices from the Department of Energy's NCR price-monitoring bulletin (the common price per product), with GasWatch PH as a fallback when the bulletin is unavailable. The fourth stream encodes an agricultural seasonality index based on the Philippine rice production calendar.</w:t>
       </w:r>
     </w:p>
     <w:p>
@@ -3795,7 +3795,7 @@
           <w:sz w:val="22"/>
           <w:szCs w:val="22"/>
         </w:rPr>
-        <w:t xml:space="preserve">[DRAFT 27 SEP 2026 — the technical results below are taken from model/meta.json (training run of September 26, 2026, data through September 26, 2026) and can be re-checked in Admin → Metrics. The survey results for Statements of the Problem 3 to 6 must be filled in from the team's data. If the team already has a Chapter 4, merge these sections into it.]</w:t>
+        <w:t xml:space="preserve">[DRAFT 27 SEP 2026 — the technical results below are taken from model/meta.json (training run of October 1, 2026 — after the fuel inputs were replaced with official DOE NCR prices — data through September 30, 2026) and can be re-checked in Admin → Metrics. The survey results for Statements of the Problem 3 to 6 must be filled in from the team's data. If the team already has a Chapter 4, merge these sections into it.]</w:t>
       </w:r>
     </w:p>
     <w:p>
@@ -3823,7 +3823,7 @@
           <w:sz w:val="24"/>
           <w:szCs w:val="24"/>
         </w:rPr>
-        <w:t xml:space="preserve">The model was evaluated on the held-out test window from October 7, 2025 to September 24, 2026, which it never saw during training or model selection: 353 forecast origins per rice type, each forecasting the next three days. Table 1 reports the published forecast (the adaptive ensemble) against the naive persistence and ARIMA(1,1,1) baselines.</w:t>
+        <w:t xml:space="preserve">The model was evaluated on the held-out test window from October 9, 2025 to September 29, 2026, which it never saw during training or model selection: 356 forecast origins per rice type, each forecasting the next three days. Table 1 reports the published forecast (the adaptive ensemble) against the naive persistence and ARIMA(1,1,1) baselines.</w:t>
       </w:r>
     </w:p>
     <w:p>
@@ -3839,7 +3839,7 @@
           <w:sz w:val="24"/>
           <w:szCs w:val="24"/>
         </w:rPr>
-        <w:t xml:space="preserve">Table 1. Test-window accuracy of the published forecast, per rice type (October 7, 2025 – September 24, 2026)</w:t>
+        <w:t xml:space="preserve">Table 1. Test-window accuracy of the published forecast, per rice type (October 9, 2025 – September 29, 2026)</w:t>
       </w:r>
     </w:p>
     <w:tbl>
@@ -4048,67 +4048,67 @@
                 <w:sz w:val="20"/>
                 <w:szCs w:val="20"/>
               </w:rPr>
-              <w:t xml:space="preserve">0.280</w:t>
-            </w:r>
-          </w:p>
-        </w:tc>
-        <w:tc>
-          <w:tcPr>
-            <w:tcW w:type="pct" w:w="16.666666666666668%"/>
-            <w:tcMar>
-              <w:top w:type="dxa" w:w="100"/>
-              <w:left w:type="dxa" w:w="100"/>
-              <w:bottom w:type="dxa" w:w="100"/>
-              <w:right w:type="dxa" w:w="100"/>
-            </w:tcMar>
-          </w:tcPr>
-          <w:p>
-            <w:r>
-              <w:rPr>
-                <w:sz w:val="20"/>
-                <w:szCs w:val="20"/>
-              </w:rPr>
-              <w:t xml:space="preserve">0.325</w:t>
-            </w:r>
-          </w:p>
-        </w:tc>
-        <w:tc>
-          <w:tcPr>
-            <w:tcW w:type="pct" w:w="16.666666666666668%"/>
-            <w:tcMar>
-              <w:top w:type="dxa" w:w="100"/>
-              <w:left w:type="dxa" w:w="100"/>
-              <w:bottom w:type="dxa" w:w="100"/>
-              <w:right w:type="dxa" w:w="100"/>
-            </w:tcMar>
-          </w:tcPr>
-          <w:p>
-            <w:r>
-              <w:rPr>
-                <w:sz w:val="20"/>
-                <w:szCs w:val="20"/>
-              </w:rPr>
-              <w:t xml:space="preserve">0.284</w:t>
-            </w:r>
-          </w:p>
-        </w:tc>
-        <w:tc>
-          <w:tcPr>
-            <w:tcW w:type="pct" w:w="16.666666666666668%"/>
-            <w:tcMar>
-              <w:top w:type="dxa" w:w="100"/>
-              <w:left w:type="dxa" w:w="100"/>
-              <w:bottom w:type="dxa" w:w="100"/>
-              <w:right w:type="dxa" w:w="100"/>
-            </w:tcMar>
-          </w:tcPr>
-          <w:p>
-            <w:r>
-              <w:rPr>
-                <w:sz w:val="20"/>
-                <w:szCs w:val="20"/>
-              </w:rPr>
-              <w:t xml:space="preserve">+13.9%</w:t>
+              <w:t xml:space="preserve">0.281</w:t>
+            </w:r>
+          </w:p>
+        </w:tc>
+        <w:tc>
+          <w:tcPr>
+            <w:tcW w:type="pct" w:w="16.666666666666668%"/>
+            <w:tcMar>
+              <w:top w:type="dxa" w:w="100"/>
+              <w:left w:type="dxa" w:w="100"/>
+              <w:bottom w:type="dxa" w:w="100"/>
+              <w:right w:type="dxa" w:w="100"/>
+            </w:tcMar>
+          </w:tcPr>
+          <w:p>
+            <w:r>
+              <w:rPr>
+                <w:sz w:val="20"/>
+                <w:szCs w:val="20"/>
+              </w:rPr>
+              <w:t xml:space="preserve">0.326</w:t>
+            </w:r>
+          </w:p>
+        </w:tc>
+        <w:tc>
+          <w:tcPr>
+            <w:tcW w:type="pct" w:w="16.666666666666668%"/>
+            <w:tcMar>
+              <w:top w:type="dxa" w:w="100"/>
+              <w:left w:type="dxa" w:w="100"/>
+              <w:bottom w:type="dxa" w:w="100"/>
+              <w:right w:type="dxa" w:w="100"/>
+            </w:tcMar>
+          </w:tcPr>
+          <w:p>
+            <w:r>
+              <w:rPr>
+                <w:sz w:val="20"/>
+                <w:szCs w:val="20"/>
+              </w:rPr>
+              <w:t xml:space="preserve">0.286</w:t>
+            </w:r>
+          </w:p>
+        </w:tc>
+        <w:tc>
+          <w:tcPr>
+            <w:tcW w:type="pct" w:w="16.666666666666668%"/>
+            <w:tcMar>
+              <w:top w:type="dxa" w:w="100"/>
+              <w:left w:type="dxa" w:w="100"/>
+              <w:bottom w:type="dxa" w:w="100"/>
+              <w:right w:type="dxa" w:w="100"/>
+            </w:tcMar>
+          </w:tcPr>
+          <w:p>
+            <w:r>
+              <w:rPr>
+                <w:sz w:val="20"/>
+                <w:szCs w:val="20"/>
+              </w:rPr>
+              <w:t xml:space="preserve">+13.8%</w:t>
             </w:r>
           </w:p>
         </w:tc>
@@ -4170,7 +4170,7 @@
                 <w:sz w:val="20"/>
                 <w:szCs w:val="20"/>
               </w:rPr>
-              <w:t xml:space="preserve">0.264</w:t>
+              <w:t xml:space="preserve">0.263</w:t>
             </w:r>
           </w:p>
         </w:tc>
@@ -4210,47 +4210,47 @@
                 <w:sz w:val="20"/>
                 <w:szCs w:val="20"/>
               </w:rPr>
-              <w:t xml:space="preserve">0.277</w:t>
-            </w:r>
-          </w:p>
-        </w:tc>
-        <w:tc>
-          <w:tcPr>
-            <w:tcW w:type="pct" w:w="16.666666666666668%"/>
-            <w:tcMar>
-              <w:top w:type="dxa" w:w="100"/>
-              <w:left w:type="dxa" w:w="100"/>
-              <w:bottom w:type="dxa" w:w="100"/>
-              <w:right w:type="dxa" w:w="100"/>
-            </w:tcMar>
-          </w:tcPr>
-          <w:p>
-            <w:r>
-              <w:rPr>
-                <w:sz w:val="20"/>
-                <w:szCs w:val="20"/>
-              </w:rPr>
-              <w:t xml:space="preserve">+15.7%</w:t>
-            </w:r>
-          </w:p>
-        </w:tc>
-        <w:tc>
-          <w:tcPr>
-            <w:tcW w:type="pct" w:w="16.666666666666668%"/>
-            <w:tcMar>
-              <w:top w:type="dxa" w:w="100"/>
-              <w:left w:type="dxa" w:w="100"/>
-              <w:bottom w:type="dxa" w:w="100"/>
-              <w:right w:type="dxa" w:w="100"/>
-            </w:tcMar>
-          </w:tcPr>
-          <w:p>
-            <w:r>
-              <w:rPr>
-                <w:sz w:val="20"/>
-                <w:szCs w:val="20"/>
-              </w:rPr>
-              <w:t xml:space="preserve">62.3%</w:t>
+              <w:t xml:space="preserve">0.274</w:t>
+            </w:r>
+          </w:p>
+        </w:tc>
+        <w:tc>
+          <w:tcPr>
+            <w:tcW w:type="pct" w:w="16.666666666666668%"/>
+            <w:tcMar>
+              <w:top w:type="dxa" w:w="100"/>
+              <w:left w:type="dxa" w:w="100"/>
+              <w:bottom w:type="dxa" w:w="100"/>
+              <w:right w:type="dxa" w:w="100"/>
+            </w:tcMar>
+          </w:tcPr>
+          <w:p>
+            <w:r>
+              <w:rPr>
+                <w:sz w:val="20"/>
+                <w:szCs w:val="20"/>
+              </w:rPr>
+              <w:t xml:space="preserve">+16.3%</w:t>
+            </w:r>
+          </w:p>
+        </w:tc>
+        <w:tc>
+          <w:tcPr>
+            <w:tcW w:type="pct" w:w="16.666666666666668%"/>
+            <w:tcMar>
+              <w:top w:type="dxa" w:w="100"/>
+              <w:left w:type="dxa" w:w="100"/>
+              <w:bottom w:type="dxa" w:w="100"/>
+              <w:right w:type="dxa" w:w="100"/>
+            </w:tcMar>
+          </w:tcPr>
+          <w:p>
+            <w:r>
+              <w:rPr>
+                <w:sz w:val="20"/>
+                <w:szCs w:val="20"/>
+              </w:rPr>
+              <w:t xml:space="preserve">62.4%</w:t>
             </w:r>
           </w:p>
         </w:tc>
@@ -4292,87 +4292,87 @@
                 <w:sz w:val="20"/>
                 <w:szCs w:val="20"/>
               </w:rPr>
-              <w:t xml:space="preserve">0.263</w:t>
-            </w:r>
-          </w:p>
-        </w:tc>
-        <w:tc>
-          <w:tcPr>
-            <w:tcW w:type="pct" w:w="16.666666666666668%"/>
-            <w:tcMar>
-              <w:top w:type="dxa" w:w="100"/>
-              <w:left w:type="dxa" w:w="100"/>
-              <w:bottom w:type="dxa" w:w="100"/>
-              <w:right w:type="dxa" w:w="100"/>
-            </w:tcMar>
-          </w:tcPr>
-          <w:p>
-            <w:r>
-              <w:rPr>
-                <w:sz w:val="20"/>
-                <w:szCs w:val="20"/>
-              </w:rPr>
-              <w:t xml:space="preserve">0.294</w:t>
-            </w:r>
-          </w:p>
-        </w:tc>
-        <w:tc>
-          <w:tcPr>
-            <w:tcW w:type="pct" w:w="16.666666666666668%"/>
-            <w:tcMar>
-              <w:top w:type="dxa" w:w="100"/>
-              <w:left w:type="dxa" w:w="100"/>
-              <w:bottom w:type="dxa" w:w="100"/>
-              <w:right w:type="dxa" w:w="100"/>
-            </w:tcMar>
-          </w:tcPr>
-          <w:p>
-            <w:r>
-              <w:rPr>
-                <w:sz w:val="20"/>
-                <w:szCs w:val="20"/>
-              </w:rPr>
-              <w:t xml:space="preserve">0.271</w:t>
-            </w:r>
-          </w:p>
-        </w:tc>
-        <w:tc>
-          <w:tcPr>
-            <w:tcW w:type="pct" w:w="16.666666666666668%"/>
-            <w:tcMar>
-              <w:top w:type="dxa" w:w="100"/>
-              <w:left w:type="dxa" w:w="100"/>
-              <w:bottom w:type="dxa" w:w="100"/>
-              <w:right w:type="dxa" w:w="100"/>
-            </w:tcMar>
-          </w:tcPr>
-          <w:p>
-            <w:r>
-              <w:rPr>
-                <w:sz w:val="20"/>
-                <w:szCs w:val="20"/>
-              </w:rPr>
-              <w:t xml:space="preserve">+10.3%</w:t>
-            </w:r>
-          </w:p>
-        </w:tc>
-        <w:tc>
-          <w:tcPr>
-            <w:tcW w:type="pct" w:w="16.666666666666668%"/>
-            <w:tcMar>
-              <w:top w:type="dxa" w:w="100"/>
-              <w:left w:type="dxa" w:w="100"/>
-              <w:bottom w:type="dxa" w:w="100"/>
-              <w:right w:type="dxa" w:w="100"/>
-            </w:tcMar>
-          </w:tcPr>
-          <w:p>
-            <w:r>
-              <w:rPr>
-                <w:sz w:val="20"/>
-                <w:szCs w:val="20"/>
-              </w:rPr>
-              <w:t xml:space="preserve">59.4%</w:t>
+              <w:t xml:space="preserve">0.264</w:t>
+            </w:r>
+          </w:p>
+        </w:tc>
+        <w:tc>
+          <w:tcPr>
+            <w:tcW w:type="pct" w:w="16.666666666666668%"/>
+            <w:tcMar>
+              <w:top w:type="dxa" w:w="100"/>
+              <w:left w:type="dxa" w:w="100"/>
+              <w:bottom w:type="dxa" w:w="100"/>
+              <w:right w:type="dxa" w:w="100"/>
+            </w:tcMar>
+          </w:tcPr>
+          <w:p>
+            <w:r>
+              <w:rPr>
+                <w:sz w:val="20"/>
+                <w:szCs w:val="20"/>
+              </w:rPr>
+              <w:t xml:space="preserve">0.296</w:t>
+            </w:r>
+          </w:p>
+        </w:tc>
+        <w:tc>
+          <w:tcPr>
+            <w:tcW w:type="pct" w:w="16.666666666666668%"/>
+            <w:tcMar>
+              <w:top w:type="dxa" w:w="100"/>
+              <w:left w:type="dxa" w:w="100"/>
+              <w:bottom w:type="dxa" w:w="100"/>
+              <w:right w:type="dxa" w:w="100"/>
+            </w:tcMar>
+          </w:tcPr>
+          <w:p>
+            <w:r>
+              <w:rPr>
+                <w:sz w:val="20"/>
+                <w:szCs w:val="20"/>
+              </w:rPr>
+              <w:t xml:space="preserve">0.272</w:t>
+            </w:r>
+          </w:p>
+        </w:tc>
+        <w:tc>
+          <w:tcPr>
+            <w:tcW w:type="pct" w:w="16.666666666666668%"/>
+            <w:tcMar>
+              <w:top w:type="dxa" w:w="100"/>
+              <w:left w:type="dxa" w:w="100"/>
+              <w:bottom w:type="dxa" w:w="100"/>
+              <w:right w:type="dxa" w:w="100"/>
+            </w:tcMar>
+          </w:tcPr>
+          <w:p>
+            <w:r>
+              <w:rPr>
+                <w:sz w:val="20"/>
+                <w:szCs w:val="20"/>
+              </w:rPr>
+              <w:t xml:space="preserve">+10.9%</w:t>
+            </w:r>
+          </w:p>
+        </w:tc>
+        <w:tc>
+          <w:tcPr>
+            <w:tcW w:type="pct" w:w="16.666666666666668%"/>
+            <w:tcMar>
+              <w:top w:type="dxa" w:w="100"/>
+              <w:left w:type="dxa" w:w="100"/>
+              <w:bottom w:type="dxa" w:w="100"/>
+              <w:right w:type="dxa" w:w="100"/>
+            </w:tcMar>
+          </w:tcPr>
+          <w:p>
+            <w:r>
+              <w:rPr>
+                <w:sz w:val="20"/>
+                <w:szCs w:val="20"/>
+              </w:rPr>
+              <w:t xml:space="preserve">60.3%</w:t>
             </w:r>
           </w:p>
         </w:tc>
@@ -4414,87 +4414,87 @@
                 <w:sz w:val="20"/>
                 <w:szCs w:val="20"/>
               </w:rPr>
-              <w:t xml:space="preserve">0.215</w:t>
-            </w:r>
-          </w:p>
-        </w:tc>
-        <w:tc>
-          <w:tcPr>
-            <w:tcW w:type="pct" w:w="16.666666666666668%"/>
-            <w:tcMar>
-              <w:top w:type="dxa" w:w="100"/>
-              <w:left w:type="dxa" w:w="100"/>
-              <w:bottom w:type="dxa" w:w="100"/>
-              <w:right w:type="dxa" w:w="100"/>
-            </w:tcMar>
-          </w:tcPr>
-          <w:p>
-            <w:r>
-              <w:rPr>
-                <w:sz w:val="20"/>
-                <w:szCs w:val="20"/>
-              </w:rPr>
-              <w:t xml:space="preserve">0.255</w:t>
-            </w:r>
-          </w:p>
-        </w:tc>
-        <w:tc>
-          <w:tcPr>
-            <w:tcW w:type="pct" w:w="16.666666666666668%"/>
-            <w:tcMar>
-              <w:top w:type="dxa" w:w="100"/>
-              <w:left w:type="dxa" w:w="100"/>
-              <w:bottom w:type="dxa" w:w="100"/>
-              <w:right w:type="dxa" w:w="100"/>
-            </w:tcMar>
-          </w:tcPr>
-          <w:p>
-            <w:r>
-              <w:rPr>
-                <w:sz w:val="20"/>
-                <w:szCs w:val="20"/>
-              </w:rPr>
-              <w:t xml:space="preserve">0.225</w:t>
-            </w:r>
-          </w:p>
-        </w:tc>
-        <w:tc>
-          <w:tcPr>
-            <w:tcW w:type="pct" w:w="16.666666666666668%"/>
-            <w:tcMar>
-              <w:top w:type="dxa" w:w="100"/>
-              <w:left w:type="dxa" w:w="100"/>
-              <w:bottom w:type="dxa" w:w="100"/>
-              <w:right w:type="dxa" w:w="100"/>
-            </w:tcMar>
-          </w:tcPr>
-          <w:p>
-            <w:r>
-              <w:rPr>
-                <w:sz w:val="20"/>
-                <w:szCs w:val="20"/>
-              </w:rPr>
-              <w:t xml:space="preserve">+15.6%</w:t>
-            </w:r>
-          </w:p>
-        </w:tc>
-        <w:tc>
-          <w:tcPr>
-            <w:tcW w:type="pct" w:w="16.666666666666668%"/>
-            <w:tcMar>
-              <w:top w:type="dxa" w:w="100"/>
-              <w:left w:type="dxa" w:w="100"/>
-              <w:bottom w:type="dxa" w:w="100"/>
-              <w:right w:type="dxa" w:w="100"/>
-            </w:tcMar>
-          </w:tcPr>
-          <w:p>
-            <w:r>
-              <w:rPr>
-                <w:sz w:val="20"/>
-                <w:szCs w:val="20"/>
-              </w:rPr>
-              <w:t xml:space="preserve">57.9%</w:t>
+              <w:t xml:space="preserve">0.217</w:t>
+            </w:r>
+          </w:p>
+        </w:tc>
+        <w:tc>
+          <w:tcPr>
+            <w:tcW w:type="pct" w:w="16.666666666666668%"/>
+            <w:tcMar>
+              <w:top w:type="dxa" w:w="100"/>
+              <w:left w:type="dxa" w:w="100"/>
+              <w:bottom w:type="dxa" w:w="100"/>
+              <w:right w:type="dxa" w:w="100"/>
+            </w:tcMar>
+          </w:tcPr>
+          <w:p>
+            <w:r>
+              <w:rPr>
+                <w:sz w:val="20"/>
+                <w:szCs w:val="20"/>
+              </w:rPr>
+              <w:t xml:space="preserve">0.257</w:t>
+            </w:r>
+          </w:p>
+        </w:tc>
+        <w:tc>
+          <w:tcPr>
+            <w:tcW w:type="pct" w:w="16.666666666666668%"/>
+            <w:tcMar>
+              <w:top w:type="dxa" w:w="100"/>
+              <w:left w:type="dxa" w:w="100"/>
+              <w:bottom w:type="dxa" w:w="100"/>
+              <w:right w:type="dxa" w:w="100"/>
+            </w:tcMar>
+          </w:tcPr>
+          <w:p>
+            <w:r>
+              <w:rPr>
+                <w:sz w:val="20"/>
+                <w:szCs w:val="20"/>
+              </w:rPr>
+              <w:t xml:space="preserve">0.228</w:t>
+            </w:r>
+          </w:p>
+        </w:tc>
+        <w:tc>
+          <w:tcPr>
+            <w:tcW w:type="pct" w:w="16.666666666666668%"/>
+            <w:tcMar>
+              <w:top w:type="dxa" w:w="100"/>
+              <w:left w:type="dxa" w:w="100"/>
+              <w:bottom w:type="dxa" w:w="100"/>
+              <w:right w:type="dxa" w:w="100"/>
+            </w:tcMar>
+          </w:tcPr>
+          <w:p>
+            <w:r>
+              <w:rPr>
+                <w:sz w:val="20"/>
+                <w:szCs w:val="20"/>
+              </w:rPr>
+              <w:t xml:space="preserve">+15.4%</w:t>
+            </w:r>
+          </w:p>
+        </w:tc>
+        <w:tc>
+          <w:tcPr>
+            <w:tcW w:type="pct" w:w="16.666666666666668%"/>
+            <w:tcMar>
+              <w:top w:type="dxa" w:w="100"/>
+              <w:left w:type="dxa" w:w="100"/>
+              <w:bottom w:type="dxa" w:w="100"/>
+              <w:right w:type="dxa" w:w="100"/>
+            </w:tcMar>
+          </w:tcPr>
+          <w:p>
+            <w:r>
+              <w:rPr>
+                <w:sz w:val="20"/>
+                <w:szCs w:val="20"/>
+              </w:rPr>
+              <w:t xml:space="preserve">56.7%</w:t>
             </w:r>
           </w:p>
         </w:tc>
@@ -4536,87 +4536,87 @@
                 <w:sz w:val="20"/>
                 <w:szCs w:val="20"/>
               </w:rPr>
-              <w:t xml:space="preserve">0.283</w:t>
-            </w:r>
-          </w:p>
-        </w:tc>
-        <w:tc>
-          <w:tcPr>
-            <w:tcW w:type="pct" w:w="16.666666666666668%"/>
-            <w:tcMar>
-              <w:top w:type="dxa" w:w="100"/>
-              <w:left w:type="dxa" w:w="100"/>
-              <w:bottom w:type="dxa" w:w="100"/>
-              <w:right w:type="dxa" w:w="100"/>
-            </w:tcMar>
-          </w:tcPr>
-          <w:p>
-            <w:r>
-              <w:rPr>
-                <w:sz w:val="20"/>
-                <w:szCs w:val="20"/>
-              </w:rPr>
-              <w:t xml:space="preserve">0.292</w:t>
-            </w:r>
-          </w:p>
-        </w:tc>
-        <w:tc>
-          <w:tcPr>
-            <w:tcW w:type="pct" w:w="16.666666666666668%"/>
-            <w:tcMar>
-              <w:top w:type="dxa" w:w="100"/>
-              <w:left w:type="dxa" w:w="100"/>
-              <w:bottom w:type="dxa" w:w="100"/>
-              <w:right w:type="dxa" w:w="100"/>
-            </w:tcMar>
-          </w:tcPr>
-          <w:p>
-            <w:r>
-              <w:rPr>
-                <w:sz w:val="20"/>
-                <w:szCs w:val="20"/>
-              </w:rPr>
-              <w:t xml:space="preserve">0.297</w:t>
-            </w:r>
-          </w:p>
-        </w:tc>
-        <w:tc>
-          <w:tcPr>
-            <w:tcW w:type="pct" w:w="16.666666666666668%"/>
-            <w:tcMar>
-              <w:top w:type="dxa" w:w="100"/>
-              <w:left w:type="dxa" w:w="100"/>
-              <w:bottom w:type="dxa" w:w="100"/>
-              <w:right w:type="dxa" w:w="100"/>
-            </w:tcMar>
-          </w:tcPr>
-          <w:p>
-            <w:r>
-              <w:rPr>
-                <w:sz w:val="20"/>
-                <w:szCs w:val="20"/>
-              </w:rPr>
-              <w:t xml:space="preserve">+3.2%</w:t>
-            </w:r>
-          </w:p>
-        </w:tc>
-        <w:tc>
-          <w:tcPr>
-            <w:tcW w:type="pct" w:w="16.666666666666668%"/>
-            <w:tcMar>
-              <w:top w:type="dxa" w:w="100"/>
-              <w:left w:type="dxa" w:w="100"/>
-              <w:bottom w:type="dxa" w:w="100"/>
-              <w:right w:type="dxa" w:w="100"/>
-            </w:tcMar>
-          </w:tcPr>
-          <w:p>
-            <w:r>
-              <w:rPr>
-                <w:sz w:val="20"/>
-                <w:szCs w:val="20"/>
-              </w:rPr>
-              <w:t xml:space="preserve">65.6%</w:t>
+              <w:t xml:space="preserve">0.281</w:t>
+            </w:r>
+          </w:p>
+        </w:tc>
+        <w:tc>
+          <w:tcPr>
+            <w:tcW w:type="pct" w:w="16.666666666666668%"/>
+            <w:tcMar>
+              <w:top w:type="dxa" w:w="100"/>
+              <w:left w:type="dxa" w:w="100"/>
+              <w:bottom w:type="dxa" w:w="100"/>
+              <w:right w:type="dxa" w:w="100"/>
+            </w:tcMar>
+          </w:tcPr>
+          <w:p>
+            <w:r>
+              <w:rPr>
+                <w:sz w:val="20"/>
+                <w:szCs w:val="20"/>
+              </w:rPr>
+              <w:t xml:space="preserve">0.288</w:t>
+            </w:r>
+          </w:p>
+        </w:tc>
+        <w:tc>
+          <w:tcPr>
+            <w:tcW w:type="pct" w:w="16.666666666666668%"/>
+            <w:tcMar>
+              <w:top w:type="dxa" w:w="100"/>
+              <w:left w:type="dxa" w:w="100"/>
+              <w:bottom w:type="dxa" w:w="100"/>
+              <w:right w:type="dxa" w:w="100"/>
+            </w:tcMar>
+          </w:tcPr>
+          <w:p>
+            <w:r>
+              <w:rPr>
+                <w:sz w:val="20"/>
+                <w:szCs w:val="20"/>
+              </w:rPr>
+              <w:t xml:space="preserve">0.293</w:t>
+            </w:r>
+          </w:p>
+        </w:tc>
+        <w:tc>
+          <w:tcPr>
+            <w:tcW w:type="pct" w:w="16.666666666666668%"/>
+            <w:tcMar>
+              <w:top w:type="dxa" w:w="100"/>
+              <w:left w:type="dxa" w:w="100"/>
+              <w:bottom w:type="dxa" w:w="100"/>
+              <w:right w:type="dxa" w:w="100"/>
+            </w:tcMar>
+          </w:tcPr>
+          <w:p>
+            <w:r>
+              <w:rPr>
+                <w:sz w:val="20"/>
+                <w:szCs w:val="20"/>
+              </w:rPr>
+              <w:t xml:space="preserve">+2.4%</w:t>
+            </w:r>
+          </w:p>
+        </w:tc>
+        <w:tc>
+          <w:tcPr>
+            <w:tcW w:type="pct" w:w="16.666666666666668%"/>
+            <w:tcMar>
+              <w:top w:type="dxa" w:w="100"/>
+              <w:left w:type="dxa" w:w="100"/>
+              <w:bottom w:type="dxa" w:w="100"/>
+              <w:right w:type="dxa" w:w="100"/>
+            </w:tcMar>
+          </w:tcPr>
+          <w:p>
+            <w:r>
+              <w:rPr>
+                <w:sz w:val="20"/>
+                <w:szCs w:val="20"/>
+              </w:rPr>
+              <w:t xml:space="preserve">65.1%</w:t>
             </w:r>
           </w:p>
         </w:tc>
@@ -4658,87 +4658,87 @@
                 <w:sz w:val="20"/>
                 <w:szCs w:val="20"/>
               </w:rPr>
-              <w:t xml:space="preserve">0.329</w:t>
-            </w:r>
-          </w:p>
-        </w:tc>
-        <w:tc>
-          <w:tcPr>
-            <w:tcW w:type="pct" w:w="16.666666666666668%"/>
-            <w:tcMar>
-              <w:top w:type="dxa" w:w="100"/>
-              <w:left w:type="dxa" w:w="100"/>
-              <w:bottom w:type="dxa" w:w="100"/>
-              <w:right w:type="dxa" w:w="100"/>
-            </w:tcMar>
-          </w:tcPr>
-          <w:p>
-            <w:r>
-              <w:rPr>
-                <w:sz w:val="20"/>
-                <w:szCs w:val="20"/>
-              </w:rPr>
-              <w:t xml:space="preserve">0.346</w:t>
-            </w:r>
-          </w:p>
-        </w:tc>
-        <w:tc>
-          <w:tcPr>
-            <w:tcW w:type="pct" w:w="16.666666666666668%"/>
-            <w:tcMar>
-              <w:top w:type="dxa" w:w="100"/>
-              <w:left w:type="dxa" w:w="100"/>
-              <w:bottom w:type="dxa" w:w="100"/>
-              <w:right w:type="dxa" w:w="100"/>
-            </w:tcMar>
-          </w:tcPr>
-          <w:p>
-            <w:r>
-              <w:rPr>
-                <w:sz w:val="20"/>
-                <w:szCs w:val="20"/>
-              </w:rPr>
-              <w:t xml:space="preserve">0.353</w:t>
-            </w:r>
-          </w:p>
-        </w:tc>
-        <w:tc>
-          <w:tcPr>
-            <w:tcW w:type="pct" w:w="16.666666666666668%"/>
-            <w:tcMar>
-              <w:top w:type="dxa" w:w="100"/>
-              <w:left w:type="dxa" w:w="100"/>
-              <w:bottom w:type="dxa" w:w="100"/>
-              <w:right w:type="dxa" w:w="100"/>
-            </w:tcMar>
-          </w:tcPr>
-          <w:p>
-            <w:r>
-              <w:rPr>
-                <w:sz w:val="20"/>
-                <w:szCs w:val="20"/>
-              </w:rPr>
-              <w:t xml:space="preserve">+5.0%</w:t>
-            </w:r>
-          </w:p>
-        </w:tc>
-        <w:tc>
-          <w:tcPr>
-            <w:tcW w:type="pct" w:w="16.666666666666668%"/>
-            <w:tcMar>
-              <w:top w:type="dxa" w:w="100"/>
-              <w:left w:type="dxa" w:w="100"/>
-              <w:bottom w:type="dxa" w:w="100"/>
-              <w:right w:type="dxa" w:w="100"/>
-            </w:tcMar>
-          </w:tcPr>
-          <w:p>
-            <w:r>
-              <w:rPr>
-                <w:sz w:val="20"/>
-                <w:szCs w:val="20"/>
-              </w:rPr>
-              <w:t xml:space="preserve">45.7%*</w:t>
+              <w:t xml:space="preserve">0.324</w:t>
+            </w:r>
+          </w:p>
+        </w:tc>
+        <w:tc>
+          <w:tcPr>
+            <w:tcW w:type="pct" w:w="16.666666666666668%"/>
+            <w:tcMar>
+              <w:top w:type="dxa" w:w="100"/>
+              <w:left w:type="dxa" w:w="100"/>
+              <w:bottom w:type="dxa" w:w="100"/>
+              <w:right w:type="dxa" w:w="100"/>
+            </w:tcMar>
+          </w:tcPr>
+          <w:p>
+            <w:r>
+              <w:rPr>
+                <w:sz w:val="20"/>
+                <w:szCs w:val="20"/>
+              </w:rPr>
+              <w:t xml:space="preserve">0.340</w:t>
+            </w:r>
+          </w:p>
+        </w:tc>
+        <w:tc>
+          <w:tcPr>
+            <w:tcW w:type="pct" w:w="16.666666666666668%"/>
+            <w:tcMar>
+              <w:top w:type="dxa" w:w="100"/>
+              <w:left w:type="dxa" w:w="100"/>
+              <w:bottom w:type="dxa" w:w="100"/>
+              <w:right w:type="dxa" w:w="100"/>
+            </w:tcMar>
+          </w:tcPr>
+          <w:p>
+            <w:r>
+              <w:rPr>
+                <w:sz w:val="20"/>
+                <w:szCs w:val="20"/>
+              </w:rPr>
+              <w:t xml:space="preserve">0.348</w:t>
+            </w:r>
+          </w:p>
+        </w:tc>
+        <w:tc>
+          <w:tcPr>
+            <w:tcW w:type="pct" w:w="16.666666666666668%"/>
+            <w:tcMar>
+              <w:top w:type="dxa" w:w="100"/>
+              <w:left w:type="dxa" w:w="100"/>
+              <w:bottom w:type="dxa" w:w="100"/>
+              <w:right w:type="dxa" w:w="100"/>
+            </w:tcMar>
+          </w:tcPr>
+          <w:p>
+            <w:r>
+              <w:rPr>
+                <w:sz w:val="20"/>
+                <w:szCs w:val="20"/>
+              </w:rPr>
+              <w:t xml:space="preserve">+4.9%</w:t>
+            </w:r>
+          </w:p>
+        </w:tc>
+        <w:tc>
+          <w:tcPr>
+            <w:tcW w:type="pct" w:w="16.666666666666668%"/>
+            <w:tcMar>
+              <w:top w:type="dxa" w:w="100"/>
+              <w:left w:type="dxa" w:w="100"/>
+              <w:bottom w:type="dxa" w:w="100"/>
+              <w:right w:type="dxa" w:w="100"/>
+            </w:tcMar>
+          </w:tcPr>
+          <w:p>
+            <w:r>
+              <w:rPr>
+                <w:sz w:val="20"/>
+                <w:szCs w:val="20"/>
+              </w:rPr>
+              <w:t xml:space="preserve">46.2%*</w:t>
             </w:r>
           </w:p>
         </w:tc>
@@ -4780,27 +4780,27 @@
                 <w:sz w:val="20"/>
                 <w:szCs w:val="20"/>
               </w:rPr>
-              <w:t xml:space="preserve">0.309</w:t>
-            </w:r>
-          </w:p>
-        </w:tc>
-        <w:tc>
-          <w:tcPr>
-            <w:tcW w:type="pct" w:w="16.666666666666668%"/>
-            <w:tcMar>
-              <w:top w:type="dxa" w:w="100"/>
-              <w:left w:type="dxa" w:w="100"/>
-              <w:bottom w:type="dxa" w:w="100"/>
-              <w:right w:type="dxa" w:w="100"/>
-            </w:tcMar>
-          </w:tcPr>
-          <w:p>
-            <w:r>
-              <w:rPr>
-                <w:sz w:val="20"/>
-                <w:szCs w:val="20"/>
-              </w:rPr>
-              <w:t xml:space="preserve">0.318</w:t>
+              <w:t xml:space="preserve">0.308</w:t>
+            </w:r>
+          </w:p>
+        </w:tc>
+        <w:tc>
+          <w:tcPr>
+            <w:tcW w:type="pct" w:w="16.666666666666668%"/>
+            <w:tcMar>
+              <w:top w:type="dxa" w:w="100"/>
+              <w:left w:type="dxa" w:w="100"/>
+              <w:bottom w:type="dxa" w:w="100"/>
+              <w:right w:type="dxa" w:w="100"/>
+            </w:tcMar>
+          </w:tcPr>
+          <w:p>
+            <w:r>
+              <w:rPr>
+                <w:sz w:val="20"/>
+                <w:szCs w:val="20"/>
+              </w:rPr>
+              <w:t xml:space="preserve">0.317</w:t>
             </w:r>
           </w:p>
         </w:tc>
@@ -4840,27 +4840,27 @@
                 <w:sz w:val="20"/>
                 <w:szCs w:val="20"/>
               </w:rPr>
-              <w:t xml:space="preserve">+2.6%</w:t>
-            </w:r>
-          </w:p>
-        </w:tc>
-        <w:tc>
-          <w:tcPr>
-            <w:tcW w:type="pct" w:w="16.666666666666668%"/>
-            <w:tcMar>
-              <w:top w:type="dxa" w:w="100"/>
-              <w:left w:type="dxa" w:w="100"/>
-              <w:bottom w:type="dxa" w:w="100"/>
-              <w:right w:type="dxa" w:w="100"/>
-            </w:tcMar>
-          </w:tcPr>
-          <w:p>
-            <w:r>
-              <w:rPr>
-                <w:sz w:val="20"/>
-                <w:szCs w:val="20"/>
-              </w:rPr>
-              <w:t xml:space="preserve">50.3%*</w:t>
+              <w:t xml:space="preserve">+2.7%</w:t>
+            </w:r>
+          </w:p>
+        </w:tc>
+        <w:tc>
+          <w:tcPr>
+            <w:tcW w:type="pct" w:w="16.666666666666668%"/>
+            <w:tcMar>
+              <w:top w:type="dxa" w:w="100"/>
+              <w:left w:type="dxa" w:w="100"/>
+              <w:bottom w:type="dxa" w:w="100"/>
+              <w:right w:type="dxa" w:w="100"/>
+            </w:tcMar>
+          </w:tcPr>
+          <w:p>
+            <w:r>
+              <w:rPr>
+                <w:sz w:val="20"/>
+                <w:szCs w:val="20"/>
+              </w:rPr>
+              <w:t xml:space="preserve">50.8%*</w:t>
             </w:r>
           </w:p>
         </w:tc>
@@ -4902,87 +4902,87 @@
                 <w:sz w:val="20"/>
                 <w:szCs w:val="20"/>
               </w:rPr>
-              <w:t xml:space="preserve">0.339</w:t>
-            </w:r>
-          </w:p>
-        </w:tc>
-        <w:tc>
-          <w:tcPr>
-            <w:tcW w:type="pct" w:w="16.666666666666668%"/>
-            <w:tcMar>
-              <w:top w:type="dxa" w:w="100"/>
-              <w:left w:type="dxa" w:w="100"/>
-              <w:bottom w:type="dxa" w:w="100"/>
-              <w:right w:type="dxa" w:w="100"/>
-            </w:tcMar>
-          </w:tcPr>
-          <w:p>
-            <w:r>
-              <w:rPr>
-                <w:sz w:val="20"/>
-                <w:szCs w:val="20"/>
-              </w:rPr>
-              <w:t xml:space="preserve">0.396</w:t>
-            </w:r>
-          </w:p>
-        </w:tc>
-        <w:tc>
-          <w:tcPr>
-            <w:tcW w:type="pct" w:w="16.666666666666668%"/>
-            <w:tcMar>
-              <w:top w:type="dxa" w:w="100"/>
-              <w:left w:type="dxa" w:w="100"/>
-              <w:bottom w:type="dxa" w:w="100"/>
-              <w:right w:type="dxa" w:w="100"/>
-            </w:tcMar>
-          </w:tcPr>
-          <w:p>
-            <w:r>
-              <w:rPr>
-                <w:sz w:val="20"/>
-                <w:szCs w:val="20"/>
-              </w:rPr>
-              <w:t xml:space="preserve">0.343</w:t>
-            </w:r>
-          </w:p>
-        </w:tc>
-        <w:tc>
-          <w:tcPr>
-            <w:tcW w:type="pct" w:w="16.666666666666668%"/>
-            <w:tcMar>
-              <w:top w:type="dxa" w:w="100"/>
-              <w:left w:type="dxa" w:w="100"/>
-              <w:bottom w:type="dxa" w:w="100"/>
-              <w:right w:type="dxa" w:w="100"/>
-            </w:tcMar>
-          </w:tcPr>
-          <w:p>
-            <w:r>
-              <w:rPr>
-                <w:sz w:val="20"/>
-                <w:szCs w:val="20"/>
-              </w:rPr>
-              <w:t xml:space="preserve">+14.2%</w:t>
-            </w:r>
-          </w:p>
-        </w:tc>
-        <w:tc>
-          <w:tcPr>
-            <w:tcW w:type="pct" w:w="16.666666666666668%"/>
-            <w:tcMar>
-              <w:top w:type="dxa" w:w="100"/>
-              <w:left w:type="dxa" w:w="100"/>
-              <w:bottom w:type="dxa" w:w="100"/>
-              <w:right w:type="dxa" w:w="100"/>
-            </w:tcMar>
-          </w:tcPr>
-          <w:p>
-            <w:r>
-              <w:rPr>
-                <w:sz w:val="20"/>
-                <w:szCs w:val="20"/>
-              </w:rPr>
-              <w:t xml:space="preserve">68.9%</w:t>
+              <w:t xml:space="preserve">0.333</w:t>
+            </w:r>
+          </w:p>
+        </w:tc>
+        <w:tc>
+          <w:tcPr>
+            <w:tcW w:type="pct" w:w="16.666666666666668%"/>
+            <w:tcMar>
+              <w:top w:type="dxa" w:w="100"/>
+              <w:left w:type="dxa" w:w="100"/>
+              <w:bottom w:type="dxa" w:w="100"/>
+              <w:right w:type="dxa" w:w="100"/>
+            </w:tcMar>
+          </w:tcPr>
+          <w:p>
+            <w:r>
+              <w:rPr>
+                <w:sz w:val="20"/>
+                <w:szCs w:val="20"/>
+              </w:rPr>
+              <w:t xml:space="preserve">0.390</w:t>
+            </w:r>
+          </w:p>
+        </w:tc>
+        <w:tc>
+          <w:tcPr>
+            <w:tcW w:type="pct" w:w="16.666666666666668%"/>
+            <w:tcMar>
+              <w:top w:type="dxa" w:w="100"/>
+              <w:left w:type="dxa" w:w="100"/>
+              <w:bottom w:type="dxa" w:w="100"/>
+              <w:right w:type="dxa" w:w="100"/>
+            </w:tcMar>
+          </w:tcPr>
+          <w:p>
+            <w:r>
+              <w:rPr>
+                <w:sz w:val="20"/>
+                <w:szCs w:val="20"/>
+              </w:rPr>
+              <w:t xml:space="preserve">0.336</w:t>
+            </w:r>
+          </w:p>
+        </w:tc>
+        <w:tc>
+          <w:tcPr>
+            <w:tcW w:type="pct" w:w="16.666666666666668%"/>
+            <w:tcMar>
+              <w:top w:type="dxa" w:w="100"/>
+              <w:left w:type="dxa" w:w="100"/>
+              <w:bottom w:type="dxa" w:w="100"/>
+              <w:right w:type="dxa" w:w="100"/>
+            </w:tcMar>
+          </w:tcPr>
+          <w:p>
+            <w:r>
+              <w:rPr>
+                <w:sz w:val="20"/>
+                <w:szCs w:val="20"/>
+              </w:rPr>
+              <w:t xml:space="preserve">+14.4%</w:t>
+            </w:r>
+          </w:p>
+        </w:tc>
+        <w:tc>
+          <w:tcPr>
+            <w:tcW w:type="pct" w:w="16.666666666666668%"/>
+            <w:tcMar>
+              <w:top w:type="dxa" w:w="100"/>
+              <w:left w:type="dxa" w:w="100"/>
+              <w:bottom w:type="dxa" w:w="100"/>
+              <w:right w:type="dxa" w:w="100"/>
+            </w:tcMar>
+          </w:tcPr>
+          <w:p>
+            <w:r>
+              <w:rPr>
+                <w:sz w:val="20"/>
+                <w:szCs w:val="20"/>
+              </w:rPr>
+              <w:t xml:space="preserve">69.9%</w:t>
             </w:r>
           </w:p>
         </w:tc>
@@ -5013,21 +5013,21 @@
           <w:sz w:val="24"/>
           <w:szCs w:val="24"/>
         </w:rPr>
-        <w:t xml:space="preserve">The published forecast was more accurate than the naive persistence baseline for all eight rice types (mean skill +10.06%, lowest +2.63% for Imported Premium) and more accurate than ARIMA(1,1,1) for all eight. Its mean absolute error was PHP 0.22 to 0.34 per kilogram. Pooled over the eight rice types, 87.0% of day-1 forecasts were within PHP 0.50 of the actual price (84.0% on day 2 and 81.9% on day 3) and 96.1% were within PHP 1.00. The published price ranges contained the actual price 91.5% of the time against a 90% target. A blocked rolling-origin check over five consecutive blocks of the test window gave a mean MAE of PHP 0.280 (standard deviation 0.076) for Local Well-Milled, showing that the accuracy is not driven by a single favourable period.</w:t>
-      </w:r>
-    </w:p>
-    <w:p>
-      <w:pPr>
-        <w:spacing w:after="200" w:line="360"/>
-        <w:ind w:firstLine="720"/>
-        <w:jc w:val="both"/>
-      </w:pPr>
-      <w:r>
-        <w:rPr>
-          <w:sz w:val="24"/>
-          <w:szCs w:val="24"/>
-        </w:rPr>
-        <w:t xml:space="preserve">The forecast direction was correct for 57.9% to 68.9% of actual day-1 moves for six of the eight rice types. For Imported Regular (45.7% of 210 moves) and Imported Premium (50.3%) it was not significantly different from chance, so the system should not be relied on for the up/down direction of those two types; their price level forecasts still beat both baselines.</w:t>
+        <w:t xml:space="preserve">The published forecast was more accurate than the naive persistence baseline for all eight rice types (mean skill +10.11%, lowest +2.43% for Imported Well-Milled) and more accurate than ARIMA(1,1,1) for all eight. Its mean absolute error was PHP 0.22 to 0.33 per kilogram. Pooled over the eight rice types, 87.2% of day-1 forecasts were within PHP 0.50 of the actual price (84.2% on day 2 and 81.9% on day 3) and 96.3% were within PHP 1.00. The published price ranges contained the actual price 91.5% of the time against a 90% target. A blocked rolling-origin check over five consecutive blocks of the test window gave a mean MAE of PHP 0.281 (standard deviation 0.073) for Local Well-Milled, showing that the accuracy is not driven by a single favourable period.</w:t>
+      </w:r>
+    </w:p>
+    <w:p>
+      <w:pPr>
+        <w:spacing w:after="200" w:line="360"/>
+        <w:ind w:firstLine="720"/>
+        <w:jc w:val="both"/>
+      </w:pPr>
+      <w:r>
+        <w:rPr>
+          <w:sz w:val="24"/>
+          <w:szCs w:val="24"/>
+        </w:rPr>
+        <w:t xml:space="preserve">The forecast direction was correct for 56.7% to 69.9% of actual day-1 moves for six of the eight rice types. For Imported Regular (46.2% of 208 moves) and Imported Premium (50.8%) it was not significantly different from chance, so the system should not be relied on for the up/down direction of those two types; their price level forecasts still beat both baselines.</w:t>
       </w:r>
     </w:p>
     <w:p>
@@ -5057,21 +5057,21 @@
           <w:sz w:val="24"/>
           <w:szCs w:val="24"/>
         </w:rPr>
-        <w:t xml:space="preserve">The components were also scored separately on the same test window. The LSTM network on its own essentially repeated the last observed price (skill −1.29%), because most of its training data comes from the weekly era, in which about 82% of daily rows are unchanged carried-forward values. Adding the weekday mean-reversion term produced the LSTM hybrid, which beat the naive baseline for all eight rice types (skill +7.80%) and ARIMA for four of eight. Combining the hybrid with ARIMA and the Kalman filter produced the published ensemble (skill +10.06%, better than ARIMA for eight of eight). On the test window the three components received nearly equal average weights (about one third each), which is consistent with the finding that no single model dominated.</w:t>
-      </w:r>
-    </w:p>
-    <w:p>
-      <w:pPr>
-        <w:spacing w:after="200" w:line="360"/>
-        <w:ind w:firstLine="720"/>
-        <w:jc w:val="both"/>
-      </w:pPr>
-      <w:r>
-        <w:rPr>
-          <w:sz w:val="24"/>
-          <w:szCs w:val="24"/>
-        </w:rPr>
-        <w:t xml:space="preserve">A paired McNemar test on the forecasts where the LSTM hybrid and the mean-reversion term alone disagreed found no significant contribution from the network (149 forecasts improved versus 151 worsened, p = 0.95). Nine alternative training strategies were tested to change this and none improved accuracy on the test window. The researchers attribute this to the amount of genuinely daily data: only about 544 daily-observation days exist so far, and for a near-random-walk price series the most recent price is already close to the optimal short-term predictor. The accuracy gain over the baselines therefore comes from the mean-reversion structure and from forecast combination, not from the network alone. The LSTM remains in the system as the learned multivariate component, and its contribution should be re-tested as more daily data accumulates.</w:t>
+        <w:t xml:space="preserve">The components were also scored separately on the same test window. The LSTM network on its own essentially repeated the last observed price (skill −1.29%), because most of its training data comes from the weekly era, in which about 82% of daily rows are unchanged carried-forward values. Adding the weekday mean-reversion term produced the LSTM hybrid, which beat the naive baseline for all eight rice types (skill +7.91%) and ARIMA for three of eight. Combining the hybrid with ARIMA and the Kalman filter produced the published ensemble (skill +10.11%, better than ARIMA for eight of eight). On the test window the three components received nearly equal average weights (about one third each), which is consistent with the finding that no single model dominated.</w:t>
+      </w:r>
+    </w:p>
+    <w:p>
+      <w:pPr>
+        <w:spacing w:after="200" w:line="360"/>
+        <w:ind w:firstLine="720"/>
+        <w:jc w:val="both"/>
+      </w:pPr>
+      <w:r>
+        <w:rPr>
+          <w:sz w:val="24"/>
+          <w:szCs w:val="24"/>
+        </w:rPr>
+        <w:t xml:space="preserve">A paired McNemar test on the forecasts where the LSTM hybrid and the mean-reversion term alone disagreed found no significant contribution from the network (154 forecasts improved versus 158 worsened, p = 0.87). Nine alternative training strategies were tested to change this and none improved accuracy on the test window. The researchers attribute this to the amount of genuinely daily data: only about 544 daily-observation days exist so far, and for a near-random-walk price series the most recent price is already close to the optimal short-term predictor. The accuracy gain over the baselines therefore comes from the mean-reversion structure and from forecast combination, not from the network alone. The LSTM remains in the system as the learned multivariate component, and its contribution should be re-tested as more daily data accumulates.</w:t>
       </w:r>
     </w:p>
     <w:p>
@@ -5128,7 +5128,7 @@
           <w:sz w:val="24"/>
           <w:szCs w:val="24"/>
         </w:rPr>
-        <w:t xml:space="preserve">The data processing engine collects the DA-AMAS rice price bulletin, fuel prices, and the USD–PHP exchange rate automatically every 24 hours and stores them in a local SQLite database. At the time of writing the database holds 4,018 historical retail price records (2015–2025) and 269 daily 2026 rice price records through September 26, 2026, together with fuel, exchange-rate, stock and farmgate series. The position-based PDF reader correctly maps prices to their rice types in saved bulletins that contain missing ("n/a") values, which previously shifted imported rice prices into the wrong column; the plausibility guard holds suspicious readings for administrator review instead of saving them. These behaviours are covered by the automated test suite (74 tests, all passing). After each successful scrape the published forecast is rebuilt automatically, so the website reflects a new DA bulletin without a server restart.</w:t>
+        <w:t xml:space="preserve">The data processing engine collects the DA-AMAS rice price bulletin, the Department of Energy's weekly NCR fuel price bulletin, and the USD–PHP exchange rate automatically every 24 hours and stores them in a local SQLite database. At the time of writing the database holds 4,018 historical retail price records (2015–2025) and 273 daily 2026 rice price records through September 30, 2026, together with fuel, exchange-rate, stock and farmgate series. The position-based PDF reader correctly maps prices to their rice types in saved bulletins that contain missing ("n/a") values, which previously shifted imported rice prices into the wrong column; the plausibility guard holds suspicious readings for administrator review instead of saving them. These behaviours are covered by the automated test suite (102 tests, all passing). After each successful scrape the published forecast is rebuilt automatically, so the website reflects a new DA bulletin without a server restart.</w:t>
       </w:r>
     </w:p>
     <w:p>
@@ -5201,7 +5201,7 @@
           <w:sz w:val="24"/>
           <w:szCs w:val="24"/>
         </w:rPr>
-        <w:t xml:space="preserve">AgriPrice forecasts the retail price of eight rice types in the NCR one to three days ahead. On a held-out test window of almost one year, its published forecast was more accurate than both naive persistence and ARIMA(1,1,1) for all eight rice types (mean skill +10.06% over persistence), with a mean absolute error of PHP 0.22 to 0.34 per kilogram and price ranges that contained the actual price 91.5% of the time. Its up/down direction was reliable for six of the eight rice types. The LSTM network alone did not add significant accuracy at the current amount of daily data; the gain came from the weekday mean-reversion structure and the adaptive combination with ARIMA and a Kalman filter. The data engine collects and validates the inputs automatically every day.</w:t>
+        <w:t xml:space="preserve">AgriPrice forecasts the retail price of eight rice types in the NCR one to three days ahead. On a held-out test window of almost one year, its published forecast was more accurate than both naive persistence and ARIMA(1,1,1) for all eight rice types (mean skill +10.11% over persistence), with a mean absolute error of PHP 0.22 to 0.33 per kilogram and price ranges that contained the actual price 91.5% of the time. Its up/down direction was reliable for six of the eight rice types. The LSTM network alone did not add significant accuracy at the current amount of daily data; the gain came from the weekday mean-reversion structure and the adaptive combination with ARIMA and a Kalman filter. The data engine collects and validates the inputs automatically every day.</w:t>
       </w:r>
     </w:p>
     <w:p>

</xml_diff>

<commit_message>
reverified and updated database
</commit_message>
<xml_diff>
--- a/documents/AgriPrice_Draft_Revised.docx
+++ b/documents/AgriPrice_Draft_Revised.docx
@@ -668,21 +668,21 @@
           <w:sz w:val="24"/>
           <w:szCs w:val="24"/>
         </w:rPr>
-        <w:t xml:space="preserve">The scope of the proposed system focuses on forecasting the prevailing retail prices of eight commercial rice varieties, categorized into local and imported special, Premium, well-milled, and regular milled rice, within the National Capital Region (NCR). The system generates forecasts by automatically extracting the daily price index from the DA-AMAS website through PDF price-table extraction, alongside integrating the USD to PHP exchange rate via API, weekly diesel pump prices, and agricultural seasonality timelines.</w:t>
-      </w:r>
-    </w:p>
-    <w:p>
-      <w:pPr>
-        <w:spacing w:after="200" w:line="360"/>
-        <w:ind w:firstLine="720"/>
-        <w:jc w:val="both"/>
-      </w:pPr>
-      <w:r>
-        <w:rPr>
-          <w:sz w:val="24"/>
-          <w:szCs w:val="24"/>
-        </w:rPr>
-        <w:t xml:space="preserve">Meanwhile, the system is bound by several limitations. Expanding the geographical scope or adding other agricultural commodities would require entirely different localized datasets that are not consistently accessible. Furthermore, the model can predict price movements for a 48- to 72-hour lead time only; projecting beyond this timeframe decreases the accuracy of the LSTM algorithm due to the highly volatile nature of the Philippine market. The system is also strictly internet- and source-dependent. In the event of server downtime, API deprecation, or sudden layout changes to the DA-AMAS portal, the automated data extraction modules will fail. During such downtimes, the forecasting model remains usable by utilizing the 'Last Observed Value' in its local database, but it will not reflect the most current real-world market shifts. The accuracy of the forecast is also not guaranteed during unprecedented global economic crashes. The system does not factor in unpredictable environmental variables such as daily weather conditions, rainfall, or typhoons, and it does not explicitly encode asymmetric ("rockets and feathers") price transmission; any such pattern must be learned from the diesel and exchange-rate inputs. Finally, the DA-AMAS rice price record before April 2025 was available to the researchers only at weekly or irregular intervals, so the model's reported accuracy is measured on the daily-observation period from April 2025 onward.</w:t>
+        <w:t xml:space="preserve">The scope of the proposed system focuses on forecasting the prevailing retail prices of eight commercial rice varieties, categorized into local and imported special, Premium, well-milled, and regular milled rice, within the National Capital Region (NCR). The system generates forecasts by automatically extracting the daily price index from the DA-AMAS website through PDF price-table extraction, alongside integrating the USD to PHP exchange rate via API, weekly diesel pump prices, and agricultural seasonality timelines. Historical rice prices for January 2015 to September 2018 are taken from the Philippine Statistics Authority's OpenSTAT database (monthly NCR retail prices), and from October 2018 onward from the Department of Agriculture's own daily price bulletins.</w:t>
+      </w:r>
+    </w:p>
+    <w:p>
+      <w:pPr>
+        <w:spacing w:after="200" w:line="360"/>
+        <w:ind w:firstLine="720"/>
+        <w:jc w:val="both"/>
+      </w:pPr>
+      <w:r>
+        <w:rPr>
+          <w:sz w:val="24"/>
+          <w:szCs w:val="24"/>
+        </w:rPr>
+        <w:t xml:space="preserve">Meanwhile, the system is bound by several limitations. Expanding the geographical scope or adding other agricultural commodities would require entirely different localized datasets that are not consistently accessible. Furthermore, the model can predict price movements for a 48- to 72-hour lead time only; projecting beyond this timeframe decreases the accuracy of the LSTM algorithm due to the highly volatile nature of the Philippine market. The system is also strictly internet- and source-dependent. In the event of server downtime, API deprecation, or sudden layout changes to the DA-AMAS portal, the automated data extraction modules will fail. During such downtimes, the forecasting model remains usable by utilizing the 'Last Observed Value' in its local database, but it will not reflect the most current real-world market shifts. The accuracy of the forecast is also not guaranteed during unprecedented global economic crashes. The system does not factor in unpredictable environmental variables such as daily weather conditions, rainfall, or typhoons, and it does not explicitly encode asymmetric ("rockets and feathers") price transmission; any such pattern must be learned from the diesel and exchange-rate inputs. Finally, the historical rice price record is not daily throughout: January 2015 to September 2018 comes from the Philippine Statistics Authority's monthly NCR retail prices, which do not separate local from imported rice; DA's daily bulletins up to September 2019 do not separate them either; and for 2023 to February 2025 DA's daily bulletins report only a price range, so those years use DA's weekly prevailing prices. The model's reported accuracy is therefore measured on the daily-observation period from 2025 onward.</w:t>
       </w:r>
     </w:p>
     <w:p>
@@ -2235,7 +2235,7 @@
           <w:sz w:val="24"/>
           <w:szCs w:val="24"/>
         </w:rPr>
-        <w:t xml:space="preserve">The multivariate LSTM model is trained on the DA-AMAS retail rice price record from January 2015 to September 2026, spanning multiple full agricultural seasonality cycles, currency regimes, and the 2023–2024 global rice-export disruption. The granularity of this record is not uniform, and the study discloses it: from 2015 to 2024 the DA-AMAS prices available to the researchers were published at weekly or irregular intervals and are carried forward day by day to align them with the daily feature table, whereas from April 2025 onward prices are observed daily (the price changes on about 83% of days). April 1, 2025 is therefore treated as the start of the daily-observation era, and the model is evaluated only on that era. Gaps in the 2026 public bulletins were filled with values supplied directly by the Department of Agriculture, which are stored as separately flagged verified rows.</w:t>
+        <w:t xml:space="preserve">The multivariate LSTM model is trained on the official NCR retail rice price record from January 2015 to September 2026, spanning multiple full agricultural seasonality cycles, currency regimes, and the 2023–2024 global rice-export disruption. Every price in this record comes from a government publication, and its granularity changes over time, which the study discloses. January 2015 to September 2018 uses the Philippine Statistics Authority's OpenSTAT table "Cereals: Retail Prices of Agricultural Commodities" (old series), National Capital Region, which is monthly and has no local/imported split: each month's figure is used for every day of that month. From October 2018 to December 2022 the record uses the Department of Agriculture's daily price bulletins for NCR markets, retrieved from the DA price-monitoring archive (1,645 bulletins downloaded; 939 days read automatically after the layout of each bulletin was identified, and every reading checked against DA-AMAS weekly figures and PSA's monthly averages). The bulletins up to September 2019 do not separate local from imported rice, and DA posted none from April to September 2018. For 2023 to February 2025 DA's daily bulletins give only a low–high price range, not a prevailing price; converting a range into a single figure would not reproduce DA's prevailing prices, so these years use DA's weekly prevailing prices (DA-AMAS weekly, NCR wet markets, and the DA Weekly Average Price bulletins). From March 2025 the DA Daily Price Index is used. A daily figure is carried over weekends, holidays and missing bulletins for up to 14 days; longer gaps (December 2018, the 2020 lockdown) take PSA's figure for that month. Gaps in the 2026 public bulletins were filled with values supplied directly by the Department of Agriculture, which are stored as separately flagged verified rows. Even where bulletins are daily, DA's prevailing price before 2025 was quoted in whole pesos and changed on few days, so the model is evaluated only on the period from 2025 onward, when prices are observed daily (the price changes on about 83% of days). The PSA and DA series measure different things (an NCR average versus a prevailing price), so the record shifts in level at the October 2018 hand-over.</w:t>
       </w:r>
     </w:p>
     <w:p>
@@ -2250,21 +2250,7 @@
           <w:sz w:val="22"/>
           <w:szCs w:val="22"/>
         </w:rPr>
-        <w:t xml:space="preserve">[UPDATED 27 SEP 2026 — "fifteen years of daily data" corrected to the actual 2015–2026 record, and the weekly-then-daily granularity disclosed here and in Scope and Limitations, as this note required. Delete this note before final printing.]</w:t>
-      </w:r>
-    </w:p>
-    <w:p>
-      <w:pPr>
-        <w:spacing w:after="200" w:line="360"/>
-        <w:ind w:firstLine="720"/>
-        <w:jc w:val="both"/>
-      </w:pPr>
-      <w:r>
-        <w:rPr>
-          <w:sz w:val="24"/>
-          <w:szCs w:val="24"/>
-        </w:rPr>
-        <w:t xml:space="preserve">The dataset is partitioned chronologically to preserve temporal ordering and prevent data leakage, using a regime-aware split: observations up to March 31, 2025 are used for training; April 1 to October 6, 2025 for validation (model selection and early stopping); and October 7, 2025 to September 24, 2026 is held out for testing. Validation and test are both drawn from the daily-observation era, because a plain 70/15/15 split placed an almost static, largely carried-forward period in validation (88% unchanged days) while the test period moved almost daily, so a model would be selected on one kind of data and scored on another. No random shuffling is applied at any stage, the min-max scaler is fitted on training rows only, and every run is seeded so that reported metrics are reproducible.</w:t>
+        <w:t xml:space="preserve">[UPDATED 7 OCT 2026 — Rice price sources: 2015–Sep 2018 PSA OpenSTAT monthly NCR retail; Oct 2018–2022 DA daily price bulletins read from 1,645 PDFs (datasets/fetch_da_bulletins.py, parse_da_daily_bulletins.py); 2023–Feb 2025 DA weekly prevailing (range-only bulletins not converted); 2025 onward DA Daily Price Index. The original compiled dataset matched no PSA or DA table and no longer contributes any value. Add PSA OpenSTAT and the DA price-monitoring archive to the References. Delete this note before final printing.]</w:t>
       </w:r>
     </w:p>
     <w:p>
@@ -2279,21 +2265,21 @@
           <w:sz w:val="22"/>
           <w:szCs w:val="22"/>
         </w:rPr>
-        <w:t xml:space="preserve">[UPDATED 27 SEP 2026 — the split is chronological and regime-aware in the code (model/train.py), and every metric reported in Chapter 4 comes from it. Delete this note before final printing.]</w:t>
-      </w:r>
-    </w:p>
-    <w:p>
-      <w:pPr>
-        <w:spacing w:after="200" w:line="360"/>
-        <w:ind w:firstLine="720"/>
-        <w:jc w:val="both"/>
-      </w:pPr>
-      <w:r>
-        <w:rPr>
-          <w:sz w:val="24"/>
-          <w:szCs w:val="24"/>
-        </w:rPr>
-        <w:t xml:space="preserve">To build the AgriPrice system, the researchers applied the Agile Software Development Methodology. This iterative framework allowed the team to continuously review and refine the system across six phases: Planning, Analysis, Design, Implementation, Testing, and Deployment. Each of the six phases was executed through iterative sprints supported by a maintained product backlog, with the development team conducting periodic reviews to reprioritize tasks in response to testing feedback, particularly during the Implementation and Testing phases where scraper reliability and model tuning required repeated refinement.</w:t>
+        <w:t xml:space="preserve">[UPDATED 27 SEP 2026 — "fifteen years of daily data" corrected to the actual 2015–2026 record, and the weekly-then-daily granularity disclosed here and in Scope and Limitations, as this note required. Delete this note before final printing.]</w:t>
+      </w:r>
+    </w:p>
+    <w:p>
+      <w:pPr>
+        <w:spacing w:after="200" w:line="360"/>
+        <w:ind w:firstLine="720"/>
+        <w:jc w:val="both"/>
+      </w:pPr>
+      <w:r>
+        <w:rPr>
+          <w:sz w:val="24"/>
+          <w:szCs w:val="24"/>
+        </w:rPr>
+        <w:t xml:space="preserve">The dataset is partitioned chronologically to preserve temporal ordering and prevent data leakage, using a regime-aware split: observations up to March 31, 2025 are used for training; April 1 to October 6, 2025 for validation (model selection and early stopping); and October 7, 2025 to September 24, 2026 is held out for testing. Validation and test are both drawn from the daily-observation era, because a plain 70/15/15 split placed an almost static, largely carried-forward period in validation (88% unchanged days) while the test period moved almost daily, so a model would be selected on one kind of data and scored on another. No random shuffling is applied at any stage, the min-max scaler is fitted on training rows only, and every run is seeded so that reported metrics are reproducible.</w:t>
       </w:r>
     </w:p>
     <w:p>
@@ -2308,6 +2294,35 @@
           <w:sz w:val="22"/>
           <w:szCs w:val="22"/>
         </w:rPr>
+        <w:t xml:space="preserve">[UPDATED 27 SEP 2026 — the split is chronological and regime-aware in the code (model/train.py), and every metric reported in Chapter 4 comes from it. Delete this note before final printing.]</w:t>
+      </w:r>
+    </w:p>
+    <w:p>
+      <w:pPr>
+        <w:spacing w:after="200" w:line="360"/>
+        <w:ind w:firstLine="720"/>
+        <w:jc w:val="both"/>
+      </w:pPr>
+      <w:r>
+        <w:rPr>
+          <w:sz w:val="24"/>
+          <w:szCs w:val="24"/>
+        </w:rPr>
+        <w:t xml:space="preserve">To build the AgriPrice system, the researchers applied the Agile Software Development Methodology. This iterative framework allowed the team to continuously review and refine the system across six phases: Planning, Analysis, Design, Implementation, Testing, and Deployment. Each of the six phases was executed through iterative sprints supported by a maintained product backlog, with the development team conducting periodic reviews to reprioritize tasks in response to testing feedback, particularly during the Implementation and Testing phases where scraper reliability and model tuning required repeated refinement.</w:t>
+      </w:r>
+    </w:p>
+    <w:p>
+      <w:pPr>
+        <w:spacing w:after="200" w:before="100"/>
+      </w:pPr>
+      <w:r>
+        <w:rPr>
+          <w:b/>
+          <w:bCs/>
+          <w:color w:val="C00000"/>
+          <w:sz w:val="22"/>
+          <w:szCs w:val="22"/>
+        </w:rPr>
         <w:t xml:space="preserve">[REVISION NOTE — sprint-evidence sentence added per team confirmation that sprints and backlogs were actually run. CONFIRM: total sprint count and approximate sprint duration (e.g., "six two-week sprints"), and bring backlog/board screenshots to your defense as supporting evidence — a claim without an artifact is not evidence.]</w:t>
       </w:r>
     </w:p>
@@ -2322,7 +2337,7 @@
           <w:sz w:val="24"/>
           <w:szCs w:val="24"/>
         </w:rPr>
-        <w:t xml:space="preserve">Data collection for the system is fully automated, eliminating the need for manual field surveys. The system uses custom PDF price-table extraction and API integration to continuously pull structured numerical data. The primary macroeconomic inputs used for forecasting include the daily rice retail prices from the Department of Agriculture (DA-AMAS), USD to PHP exchange rates, weekly diesel pump prices, gasoline prices, rice-stock inventory, and farmgate prices, complemented by an engineered agricultural-seasonality timeline.</w:t>
+        <w:t xml:space="preserve">Data collection for the system is fully automated, eliminating the need for manual field surveys. The system uses custom PDF price-table extraction and API integration to continuously pull structured numerical data. The primary macroeconomic inputs used for forecasting include the daily rice retail prices from the Department of Agriculture (DA-AMAS), with the Philippine Statistics Authority's monthly NCR retail prices for 2015 to September 2018, USD to PHP exchange rates, weekly diesel pump prices, gasoline prices, rice-stock inventory, and farmgate prices, complemented by an engineered agricultural-seasonality timeline.</w:t>
       </w:r>
     </w:p>
     <w:p>
@@ -3823,7 +3838,7 @@
           <w:sz w:val="24"/>
           <w:szCs w:val="24"/>
         </w:rPr>
-        <w:t xml:space="preserve">The model was evaluated on the held-out test window from October 9, 2025 to September 29, 2026, which it never saw during training or model selection: 356 forecast origins per rice type, each forecasting the next three days. Table 1 reports the published forecast (the adaptive ensemble) against the naive persistence and ARIMA(1,1,1) baselines.</w:t>
+        <w:t xml:space="preserve">The model was evaluated on the held-out test window from October 11, 2025 to October 4, 2026, which it never saw during training or model selection: 359 forecast origins per rice type, each forecasting the next three days. Table 1 reports the published forecast (the adaptive ensemble) against the naive persistence and ARIMA(1,1,1) baselines.</w:t>
       </w:r>
     </w:p>
     <w:p>
@@ -3839,7 +3854,7 @@
           <w:sz w:val="24"/>
           <w:szCs w:val="24"/>
         </w:rPr>
-        <w:t xml:space="preserve">Table 1. Test-window accuracy of the published forecast, per rice type (October 9, 2025 – September 29, 2026)</w:t>
+        <w:t xml:space="preserve">Table 1. Test-window accuracy of the published forecast, per rice type (October 11, 2025 – October 4, 2026)</w:t>
       </w:r>
     </w:p>
     <w:tbl>
@@ -4048,87 +4063,87 @@
                 <w:sz w:val="20"/>
                 <w:szCs w:val="20"/>
               </w:rPr>
-              <w:t xml:space="preserve">0.281</w:t>
-            </w:r>
-          </w:p>
-        </w:tc>
-        <w:tc>
-          <w:tcPr>
-            <w:tcW w:type="pct" w:w="16.666666666666668%"/>
-            <w:tcMar>
-              <w:top w:type="dxa" w:w="100"/>
-              <w:left w:type="dxa" w:w="100"/>
-              <w:bottom w:type="dxa" w:w="100"/>
-              <w:right w:type="dxa" w:w="100"/>
-            </w:tcMar>
-          </w:tcPr>
-          <w:p>
-            <w:r>
-              <w:rPr>
-                <w:sz w:val="20"/>
-                <w:szCs w:val="20"/>
-              </w:rPr>
-              <w:t xml:space="preserve">0.326</w:t>
-            </w:r>
-          </w:p>
-        </w:tc>
-        <w:tc>
-          <w:tcPr>
-            <w:tcW w:type="pct" w:w="16.666666666666668%"/>
-            <w:tcMar>
-              <w:top w:type="dxa" w:w="100"/>
-              <w:left w:type="dxa" w:w="100"/>
-              <w:bottom w:type="dxa" w:w="100"/>
-              <w:right w:type="dxa" w:w="100"/>
-            </w:tcMar>
-          </w:tcPr>
-          <w:p>
-            <w:r>
-              <w:rPr>
-                <w:sz w:val="20"/>
-                <w:szCs w:val="20"/>
-              </w:rPr>
-              <w:t xml:space="preserve">0.286</w:t>
-            </w:r>
-          </w:p>
-        </w:tc>
-        <w:tc>
-          <w:tcPr>
-            <w:tcW w:type="pct" w:w="16.666666666666668%"/>
-            <w:tcMar>
-              <w:top w:type="dxa" w:w="100"/>
-              <w:left w:type="dxa" w:w="100"/>
-              <w:bottom w:type="dxa" w:w="100"/>
-              <w:right w:type="dxa" w:w="100"/>
-            </w:tcMar>
-          </w:tcPr>
-          <w:p>
-            <w:r>
-              <w:rPr>
-                <w:sz w:val="20"/>
-                <w:szCs w:val="20"/>
-              </w:rPr>
-              <w:t xml:space="preserve">+13.8%</w:t>
-            </w:r>
-          </w:p>
-        </w:tc>
-        <w:tc>
-          <w:tcPr>
-            <w:tcW w:type="pct" w:w="16.666666666666668%"/>
-            <w:tcMar>
-              <w:top w:type="dxa" w:w="100"/>
-              <w:left w:type="dxa" w:w="100"/>
-              <w:bottom w:type="dxa" w:w="100"/>
-              <w:right w:type="dxa" w:w="100"/>
-            </w:tcMar>
-          </w:tcPr>
-          <w:p>
-            <w:r>
-              <w:rPr>
-                <w:sz w:val="20"/>
-                <w:szCs w:val="20"/>
-              </w:rPr>
-              <w:t xml:space="preserve">61.5%</w:t>
+              <w:t xml:space="preserve">0.283</w:t>
+            </w:r>
+          </w:p>
+        </w:tc>
+        <w:tc>
+          <w:tcPr>
+            <w:tcW w:type="pct" w:w="16.666666666666668%"/>
+            <w:tcMar>
+              <w:top w:type="dxa" w:w="100"/>
+              <w:left w:type="dxa" w:w="100"/>
+              <w:bottom w:type="dxa" w:w="100"/>
+              <w:right w:type="dxa" w:w="100"/>
+            </w:tcMar>
+          </w:tcPr>
+          <w:p>
+            <w:r>
+              <w:rPr>
+                <w:sz w:val="20"/>
+                <w:szCs w:val="20"/>
+              </w:rPr>
+              <w:t xml:space="preserve">0.328</w:t>
+            </w:r>
+          </w:p>
+        </w:tc>
+        <w:tc>
+          <w:tcPr>
+            <w:tcW w:type="pct" w:w="16.666666666666668%"/>
+            <w:tcMar>
+              <w:top w:type="dxa" w:w="100"/>
+              <w:left w:type="dxa" w:w="100"/>
+              <w:bottom w:type="dxa" w:w="100"/>
+              <w:right w:type="dxa" w:w="100"/>
+            </w:tcMar>
+          </w:tcPr>
+          <w:p>
+            <w:r>
+              <w:rPr>
+                <w:sz w:val="20"/>
+                <w:szCs w:val="20"/>
+              </w:rPr>
+              <w:t xml:space="preserve">0.299</w:t>
+            </w:r>
+          </w:p>
+        </w:tc>
+        <w:tc>
+          <w:tcPr>
+            <w:tcW w:type="pct" w:w="16.666666666666668%"/>
+            <w:tcMar>
+              <w:top w:type="dxa" w:w="100"/>
+              <w:left w:type="dxa" w:w="100"/>
+              <w:bottom w:type="dxa" w:w="100"/>
+              <w:right w:type="dxa" w:w="100"/>
+            </w:tcMar>
+          </w:tcPr>
+          <w:p>
+            <w:r>
+              <w:rPr>
+                <w:sz w:val="20"/>
+                <w:szCs w:val="20"/>
+              </w:rPr>
+              <w:t xml:space="preserve">+13.5%</w:t>
+            </w:r>
+          </w:p>
+        </w:tc>
+        <w:tc>
+          <w:tcPr>
+            <w:tcW w:type="pct" w:w="16.666666666666668%"/>
+            <w:tcMar>
+              <w:top w:type="dxa" w:w="100"/>
+              <w:left w:type="dxa" w:w="100"/>
+              <w:bottom w:type="dxa" w:w="100"/>
+              <w:right w:type="dxa" w:w="100"/>
+            </w:tcMar>
+          </w:tcPr>
+          <w:p>
+            <w:r>
+              <w:rPr>
+                <w:sz w:val="20"/>
+                <w:szCs w:val="20"/>
+              </w:rPr>
+              <w:t xml:space="preserve">61.3%</w:t>
             </w:r>
           </w:p>
         </w:tc>
@@ -4170,87 +4185,87 @@
                 <w:sz w:val="20"/>
                 <w:szCs w:val="20"/>
               </w:rPr>
-              <w:t xml:space="preserve">0.263</w:t>
-            </w:r>
-          </w:p>
-        </w:tc>
-        <w:tc>
-          <w:tcPr>
-            <w:tcW w:type="pct" w:w="16.666666666666668%"/>
-            <w:tcMar>
-              <w:top w:type="dxa" w:w="100"/>
-              <w:left w:type="dxa" w:w="100"/>
-              <w:bottom w:type="dxa" w:w="100"/>
-              <w:right w:type="dxa" w:w="100"/>
-            </w:tcMar>
-          </w:tcPr>
-          <w:p>
-            <w:r>
-              <w:rPr>
-                <w:sz w:val="20"/>
-                <w:szCs w:val="20"/>
-              </w:rPr>
-              <w:t xml:space="preserve">0.314</w:t>
-            </w:r>
-          </w:p>
-        </w:tc>
-        <w:tc>
-          <w:tcPr>
-            <w:tcW w:type="pct" w:w="16.666666666666668%"/>
-            <w:tcMar>
-              <w:top w:type="dxa" w:w="100"/>
-              <w:left w:type="dxa" w:w="100"/>
-              <w:bottom w:type="dxa" w:w="100"/>
-              <w:right w:type="dxa" w:w="100"/>
-            </w:tcMar>
-          </w:tcPr>
-          <w:p>
-            <w:r>
-              <w:rPr>
-                <w:sz w:val="20"/>
-                <w:szCs w:val="20"/>
-              </w:rPr>
-              <w:t xml:space="preserve">0.274</w:t>
-            </w:r>
-          </w:p>
-        </w:tc>
-        <w:tc>
-          <w:tcPr>
-            <w:tcW w:type="pct" w:w="16.666666666666668%"/>
-            <w:tcMar>
-              <w:top w:type="dxa" w:w="100"/>
-              <w:left w:type="dxa" w:w="100"/>
-              <w:bottom w:type="dxa" w:w="100"/>
-              <w:right w:type="dxa" w:w="100"/>
-            </w:tcMar>
-          </w:tcPr>
-          <w:p>
-            <w:r>
-              <w:rPr>
-                <w:sz w:val="20"/>
-                <w:szCs w:val="20"/>
-              </w:rPr>
-              <w:t xml:space="preserve">+16.3%</w:t>
-            </w:r>
-          </w:p>
-        </w:tc>
-        <w:tc>
-          <w:tcPr>
-            <w:tcW w:type="pct" w:w="16.666666666666668%"/>
-            <w:tcMar>
-              <w:top w:type="dxa" w:w="100"/>
-              <w:left w:type="dxa" w:w="100"/>
-              <w:bottom w:type="dxa" w:w="100"/>
-              <w:right w:type="dxa" w:w="100"/>
-            </w:tcMar>
-          </w:tcPr>
-          <w:p>
-            <w:r>
-              <w:rPr>
-                <w:sz w:val="20"/>
-                <w:szCs w:val="20"/>
-              </w:rPr>
-              <w:t xml:space="preserve">62.4%</w:t>
+              <w:t xml:space="preserve">0.269</w:t>
+            </w:r>
+          </w:p>
+        </w:tc>
+        <w:tc>
+          <w:tcPr>
+            <w:tcW w:type="pct" w:w="16.666666666666668%"/>
+            <w:tcMar>
+              <w:top w:type="dxa" w:w="100"/>
+              <w:left w:type="dxa" w:w="100"/>
+              <w:bottom w:type="dxa" w:w="100"/>
+              <w:right w:type="dxa" w:w="100"/>
+            </w:tcMar>
+          </w:tcPr>
+          <w:p>
+            <w:r>
+              <w:rPr>
+                <w:sz w:val="20"/>
+                <w:szCs w:val="20"/>
+              </w:rPr>
+              <w:t xml:space="preserve">0.316</w:t>
+            </w:r>
+          </w:p>
+        </w:tc>
+        <w:tc>
+          <w:tcPr>
+            <w:tcW w:type="pct" w:w="16.666666666666668%"/>
+            <w:tcMar>
+              <w:top w:type="dxa" w:w="100"/>
+              <w:left w:type="dxa" w:w="100"/>
+              <w:bottom w:type="dxa" w:w="100"/>
+              <w:right w:type="dxa" w:w="100"/>
+            </w:tcMar>
+          </w:tcPr>
+          <w:p>
+            <w:r>
+              <w:rPr>
+                <w:sz w:val="20"/>
+                <w:szCs w:val="20"/>
+              </w:rPr>
+              <w:t xml:space="preserve">0.291</w:t>
+            </w:r>
+          </w:p>
+        </w:tc>
+        <w:tc>
+          <w:tcPr>
+            <w:tcW w:type="pct" w:w="16.666666666666668%"/>
+            <w:tcMar>
+              <w:top w:type="dxa" w:w="100"/>
+              <w:left w:type="dxa" w:w="100"/>
+              <w:bottom w:type="dxa" w:w="100"/>
+              <w:right w:type="dxa" w:w="100"/>
+            </w:tcMar>
+          </w:tcPr>
+          <w:p>
+            <w:r>
+              <w:rPr>
+                <w:sz w:val="20"/>
+                <w:szCs w:val="20"/>
+              </w:rPr>
+              <w:t xml:space="preserve">+14.7%</w:t>
+            </w:r>
+          </w:p>
+        </w:tc>
+        <w:tc>
+          <w:tcPr>
+            <w:tcW w:type="pct" w:w="16.666666666666668%"/>
+            <w:tcMar>
+              <w:top w:type="dxa" w:w="100"/>
+              <w:left w:type="dxa" w:w="100"/>
+              <w:bottom w:type="dxa" w:w="100"/>
+              <w:right w:type="dxa" w:w="100"/>
+            </w:tcMar>
+          </w:tcPr>
+          <w:p>
+            <w:r>
+              <w:rPr>
+                <w:sz w:val="20"/>
+                <w:szCs w:val="20"/>
+              </w:rPr>
+              <w:t xml:space="preserve">61.4%</w:t>
             </w:r>
           </w:p>
         </w:tc>
@@ -4292,87 +4307,87 @@
                 <w:sz w:val="20"/>
                 <w:szCs w:val="20"/>
               </w:rPr>
-              <w:t xml:space="preserve">0.264</w:t>
-            </w:r>
-          </w:p>
-        </w:tc>
-        <w:tc>
-          <w:tcPr>
-            <w:tcW w:type="pct" w:w="16.666666666666668%"/>
-            <w:tcMar>
-              <w:top w:type="dxa" w:w="100"/>
-              <w:left w:type="dxa" w:w="100"/>
-              <w:bottom w:type="dxa" w:w="100"/>
-              <w:right w:type="dxa" w:w="100"/>
-            </w:tcMar>
-          </w:tcPr>
-          <w:p>
-            <w:r>
-              <w:rPr>
-                <w:sz w:val="20"/>
-                <w:szCs w:val="20"/>
-              </w:rPr>
-              <w:t xml:space="preserve">0.296</w:t>
-            </w:r>
-          </w:p>
-        </w:tc>
-        <w:tc>
-          <w:tcPr>
-            <w:tcW w:type="pct" w:w="16.666666666666668%"/>
-            <w:tcMar>
-              <w:top w:type="dxa" w:w="100"/>
-              <w:left w:type="dxa" w:w="100"/>
-              <w:bottom w:type="dxa" w:w="100"/>
-              <w:right w:type="dxa" w:w="100"/>
-            </w:tcMar>
-          </w:tcPr>
-          <w:p>
-            <w:r>
-              <w:rPr>
-                <w:sz w:val="20"/>
-                <w:szCs w:val="20"/>
-              </w:rPr>
-              <w:t xml:space="preserve">0.272</w:t>
-            </w:r>
-          </w:p>
-        </w:tc>
-        <w:tc>
-          <w:tcPr>
-            <w:tcW w:type="pct" w:w="16.666666666666668%"/>
-            <w:tcMar>
-              <w:top w:type="dxa" w:w="100"/>
-              <w:left w:type="dxa" w:w="100"/>
-              <w:bottom w:type="dxa" w:w="100"/>
-              <w:right w:type="dxa" w:w="100"/>
-            </w:tcMar>
-          </w:tcPr>
-          <w:p>
-            <w:r>
-              <w:rPr>
-                <w:sz w:val="20"/>
-                <w:szCs w:val="20"/>
-              </w:rPr>
-              <w:t xml:space="preserve">+10.9%</w:t>
-            </w:r>
-          </w:p>
-        </w:tc>
-        <w:tc>
-          <w:tcPr>
-            <w:tcW w:type="pct" w:w="16.666666666666668%"/>
-            <w:tcMar>
-              <w:top w:type="dxa" w:w="100"/>
-              <w:left w:type="dxa" w:w="100"/>
-              <w:bottom w:type="dxa" w:w="100"/>
-              <w:right w:type="dxa" w:w="100"/>
-            </w:tcMar>
-          </w:tcPr>
-          <w:p>
-            <w:r>
-              <w:rPr>
-                <w:sz w:val="20"/>
-                <w:szCs w:val="20"/>
-              </w:rPr>
-              <w:t xml:space="preserve">60.3%</w:t>
+              <w:t xml:space="preserve">0.265</w:t>
+            </w:r>
+          </w:p>
+        </w:tc>
+        <w:tc>
+          <w:tcPr>
+            <w:tcW w:type="pct" w:w="16.666666666666668%"/>
+            <w:tcMar>
+              <w:top w:type="dxa" w:w="100"/>
+              <w:left w:type="dxa" w:w="100"/>
+              <w:bottom w:type="dxa" w:w="100"/>
+              <w:right w:type="dxa" w:w="100"/>
+            </w:tcMar>
+          </w:tcPr>
+          <w:p>
+            <w:r>
+              <w:rPr>
+                <w:sz w:val="20"/>
+                <w:szCs w:val="20"/>
+              </w:rPr>
+              <w:t xml:space="preserve">0.298</w:t>
+            </w:r>
+          </w:p>
+        </w:tc>
+        <w:tc>
+          <w:tcPr>
+            <w:tcW w:type="pct" w:w="16.666666666666668%"/>
+            <w:tcMar>
+              <w:top w:type="dxa" w:w="100"/>
+              <w:left w:type="dxa" w:w="100"/>
+              <w:bottom w:type="dxa" w:w="100"/>
+              <w:right w:type="dxa" w:w="100"/>
+            </w:tcMar>
+          </w:tcPr>
+          <w:p>
+            <w:r>
+              <w:rPr>
+                <w:sz w:val="20"/>
+                <w:szCs w:val="20"/>
+              </w:rPr>
+              <w:t xml:space="preserve">0.277</w:t>
+            </w:r>
+          </w:p>
+        </w:tc>
+        <w:tc>
+          <w:tcPr>
+            <w:tcW w:type="pct" w:w="16.666666666666668%"/>
+            <w:tcMar>
+              <w:top w:type="dxa" w:w="100"/>
+              <w:left w:type="dxa" w:w="100"/>
+              <w:bottom w:type="dxa" w:w="100"/>
+              <w:right w:type="dxa" w:w="100"/>
+            </w:tcMar>
+          </w:tcPr>
+          <w:p>
+            <w:r>
+              <w:rPr>
+                <w:sz w:val="20"/>
+                <w:szCs w:val="20"/>
+              </w:rPr>
+              <w:t xml:space="preserve">+11.1%</w:t>
+            </w:r>
+          </w:p>
+        </w:tc>
+        <w:tc>
+          <w:tcPr>
+            <w:tcW w:type="pct" w:w="16.666666666666668%"/>
+            <w:tcMar>
+              <w:top w:type="dxa" w:w="100"/>
+              <w:left w:type="dxa" w:w="100"/>
+              <w:bottom w:type="dxa" w:w="100"/>
+              <w:right w:type="dxa" w:w="100"/>
+            </w:tcMar>
+          </w:tcPr>
+          <w:p>
+            <w:r>
+              <w:rPr>
+                <w:sz w:val="20"/>
+                <w:szCs w:val="20"/>
+              </w:rPr>
+              <w:t xml:space="preserve">60.2%</w:t>
             </w:r>
           </w:p>
         </w:tc>
@@ -4414,87 +4429,87 @@
                 <w:sz w:val="20"/>
                 <w:szCs w:val="20"/>
               </w:rPr>
-              <w:t xml:space="preserve">0.217</w:t>
-            </w:r>
-          </w:p>
-        </w:tc>
-        <w:tc>
-          <w:tcPr>
-            <w:tcW w:type="pct" w:w="16.666666666666668%"/>
-            <w:tcMar>
-              <w:top w:type="dxa" w:w="100"/>
-              <w:left w:type="dxa" w:w="100"/>
-              <w:bottom w:type="dxa" w:w="100"/>
-              <w:right w:type="dxa" w:w="100"/>
-            </w:tcMar>
-          </w:tcPr>
-          <w:p>
-            <w:r>
-              <w:rPr>
-                <w:sz w:val="20"/>
-                <w:szCs w:val="20"/>
-              </w:rPr>
-              <w:t xml:space="preserve">0.257</w:t>
-            </w:r>
-          </w:p>
-        </w:tc>
-        <w:tc>
-          <w:tcPr>
-            <w:tcW w:type="pct" w:w="16.666666666666668%"/>
-            <w:tcMar>
-              <w:top w:type="dxa" w:w="100"/>
-              <w:left w:type="dxa" w:w="100"/>
-              <w:bottom w:type="dxa" w:w="100"/>
-              <w:right w:type="dxa" w:w="100"/>
-            </w:tcMar>
-          </w:tcPr>
-          <w:p>
-            <w:r>
-              <w:rPr>
-                <w:sz w:val="20"/>
-                <w:szCs w:val="20"/>
-              </w:rPr>
-              <w:t xml:space="preserve">0.228</w:t>
-            </w:r>
-          </w:p>
-        </w:tc>
-        <w:tc>
-          <w:tcPr>
-            <w:tcW w:type="pct" w:w="16.666666666666668%"/>
-            <w:tcMar>
-              <w:top w:type="dxa" w:w="100"/>
-              <w:left w:type="dxa" w:w="100"/>
-              <w:bottom w:type="dxa" w:w="100"/>
-              <w:right w:type="dxa" w:w="100"/>
-            </w:tcMar>
-          </w:tcPr>
-          <w:p>
-            <w:r>
-              <w:rPr>
-                <w:sz w:val="20"/>
-                <w:szCs w:val="20"/>
-              </w:rPr>
-              <w:t xml:space="preserve">+15.4%</w:t>
-            </w:r>
-          </w:p>
-        </w:tc>
-        <w:tc>
-          <w:tcPr>
-            <w:tcW w:type="pct" w:w="16.666666666666668%"/>
-            <w:tcMar>
-              <w:top w:type="dxa" w:w="100"/>
-              <w:left w:type="dxa" w:w="100"/>
-              <w:bottom w:type="dxa" w:w="100"/>
-              <w:right w:type="dxa" w:w="100"/>
-            </w:tcMar>
-          </w:tcPr>
-          <w:p>
-            <w:r>
-              <w:rPr>
-                <w:sz w:val="20"/>
-                <w:szCs w:val="20"/>
-              </w:rPr>
-              <w:t xml:space="preserve">56.7%</w:t>
+              <w:t xml:space="preserve">0.219</w:t>
+            </w:r>
+          </w:p>
+        </w:tc>
+        <w:tc>
+          <w:tcPr>
+            <w:tcW w:type="pct" w:w="16.666666666666668%"/>
+            <w:tcMar>
+              <w:top w:type="dxa" w:w="100"/>
+              <w:left w:type="dxa" w:w="100"/>
+              <w:bottom w:type="dxa" w:w="100"/>
+              <w:right w:type="dxa" w:w="100"/>
+            </w:tcMar>
+          </w:tcPr>
+          <w:p>
+            <w:r>
+              <w:rPr>
+                <w:sz w:val="20"/>
+                <w:szCs w:val="20"/>
+              </w:rPr>
+              <w:t xml:space="preserve">0.258</w:t>
+            </w:r>
+          </w:p>
+        </w:tc>
+        <w:tc>
+          <w:tcPr>
+            <w:tcW w:type="pct" w:w="16.666666666666668%"/>
+            <w:tcMar>
+              <w:top w:type="dxa" w:w="100"/>
+              <w:left w:type="dxa" w:w="100"/>
+              <w:bottom w:type="dxa" w:w="100"/>
+              <w:right w:type="dxa" w:w="100"/>
+            </w:tcMar>
+          </w:tcPr>
+          <w:p>
+            <w:r>
+              <w:rPr>
+                <w:sz w:val="20"/>
+                <w:szCs w:val="20"/>
+              </w:rPr>
+              <w:t xml:space="preserve">0.230</w:t>
+            </w:r>
+          </w:p>
+        </w:tc>
+        <w:tc>
+          <w:tcPr>
+            <w:tcW w:type="pct" w:w="16.666666666666668%"/>
+            <w:tcMar>
+              <w:top w:type="dxa" w:w="100"/>
+              <w:left w:type="dxa" w:w="100"/>
+              <w:bottom w:type="dxa" w:w="100"/>
+              <w:right w:type="dxa" w:w="100"/>
+            </w:tcMar>
+          </w:tcPr>
+          <w:p>
+            <w:r>
+              <w:rPr>
+                <w:sz w:val="20"/>
+                <w:szCs w:val="20"/>
+              </w:rPr>
+              <w:t xml:space="preserve">+15.1%</w:t>
+            </w:r>
+          </w:p>
+        </w:tc>
+        <w:tc>
+          <w:tcPr>
+            <w:tcW w:type="pct" w:w="16.666666666666668%"/>
+            <w:tcMar>
+              <w:top w:type="dxa" w:w="100"/>
+              <w:left w:type="dxa" w:w="100"/>
+              <w:bottom w:type="dxa" w:w="100"/>
+              <w:right w:type="dxa" w:w="100"/>
+            </w:tcMar>
+          </w:tcPr>
+          <w:p>
+            <w:r>
+              <w:rPr>
+                <w:sz w:val="20"/>
+                <w:szCs w:val="20"/>
+              </w:rPr>
+              <w:t xml:space="preserve">57.4%</w:t>
             </w:r>
           </w:p>
         </w:tc>
@@ -4536,87 +4551,87 @@
                 <w:sz w:val="20"/>
                 <w:szCs w:val="20"/>
               </w:rPr>
-              <w:t xml:space="preserve">0.281</w:t>
-            </w:r>
-          </w:p>
-        </w:tc>
-        <w:tc>
-          <w:tcPr>
-            <w:tcW w:type="pct" w:w="16.666666666666668%"/>
-            <w:tcMar>
-              <w:top w:type="dxa" w:w="100"/>
-              <w:left w:type="dxa" w:w="100"/>
-              <w:bottom w:type="dxa" w:w="100"/>
-              <w:right w:type="dxa" w:w="100"/>
-            </w:tcMar>
-          </w:tcPr>
-          <w:p>
-            <w:r>
-              <w:rPr>
-                <w:sz w:val="20"/>
-                <w:szCs w:val="20"/>
-              </w:rPr>
-              <w:t xml:space="preserve">0.288</w:t>
-            </w:r>
-          </w:p>
-        </w:tc>
-        <w:tc>
-          <w:tcPr>
-            <w:tcW w:type="pct" w:w="16.666666666666668%"/>
-            <w:tcMar>
-              <w:top w:type="dxa" w:w="100"/>
-              <w:left w:type="dxa" w:w="100"/>
-              <w:bottom w:type="dxa" w:w="100"/>
-              <w:right w:type="dxa" w:w="100"/>
-            </w:tcMar>
-          </w:tcPr>
-          <w:p>
-            <w:r>
-              <w:rPr>
-                <w:sz w:val="20"/>
-                <w:szCs w:val="20"/>
-              </w:rPr>
-              <w:t xml:space="preserve">0.293</w:t>
-            </w:r>
-          </w:p>
-        </w:tc>
-        <w:tc>
-          <w:tcPr>
-            <w:tcW w:type="pct" w:w="16.666666666666668%"/>
-            <w:tcMar>
-              <w:top w:type="dxa" w:w="100"/>
-              <w:left w:type="dxa" w:w="100"/>
-              <w:bottom w:type="dxa" w:w="100"/>
-              <w:right w:type="dxa" w:w="100"/>
-            </w:tcMar>
-          </w:tcPr>
-          <w:p>
-            <w:r>
-              <w:rPr>
-                <w:sz w:val="20"/>
-                <w:szCs w:val="20"/>
-              </w:rPr>
-              <w:t xml:space="preserve">+2.4%</w:t>
-            </w:r>
-          </w:p>
-        </w:tc>
-        <w:tc>
-          <w:tcPr>
-            <w:tcW w:type="pct" w:w="16.666666666666668%"/>
-            <w:tcMar>
-              <w:top w:type="dxa" w:w="100"/>
-              <w:left w:type="dxa" w:w="100"/>
-              <w:bottom w:type="dxa" w:w="100"/>
-              <w:right w:type="dxa" w:w="100"/>
-            </w:tcMar>
-          </w:tcPr>
-          <w:p>
-            <w:r>
-              <w:rPr>
-                <w:sz w:val="20"/>
-                <w:szCs w:val="20"/>
-              </w:rPr>
-              <w:t xml:space="preserve">65.1%</w:t>
+              <w:t xml:space="preserve">0.276</w:t>
+            </w:r>
+          </w:p>
+        </w:tc>
+        <w:tc>
+          <w:tcPr>
+            <w:tcW w:type="pct" w:w="16.666666666666668%"/>
+            <w:tcMar>
+              <w:top w:type="dxa" w:w="100"/>
+              <w:left w:type="dxa" w:w="100"/>
+              <w:bottom w:type="dxa" w:w="100"/>
+              <w:right w:type="dxa" w:w="100"/>
+            </w:tcMar>
+          </w:tcPr>
+          <w:p>
+            <w:r>
+              <w:rPr>
+                <w:sz w:val="20"/>
+                <w:szCs w:val="20"/>
+              </w:rPr>
+              <w:t xml:space="preserve">0.282</w:t>
+            </w:r>
+          </w:p>
+        </w:tc>
+        <w:tc>
+          <w:tcPr>
+            <w:tcW w:type="pct" w:w="16.666666666666668%"/>
+            <w:tcMar>
+              <w:top w:type="dxa" w:w="100"/>
+              <w:left w:type="dxa" w:w="100"/>
+              <w:bottom w:type="dxa" w:w="100"/>
+              <w:right w:type="dxa" w:w="100"/>
+            </w:tcMar>
+          </w:tcPr>
+          <w:p>
+            <w:r>
+              <w:rPr>
+                <w:sz w:val="20"/>
+                <w:szCs w:val="20"/>
+              </w:rPr>
+              <w:t xml:space="preserve">0.291</w:t>
+            </w:r>
+          </w:p>
+        </w:tc>
+        <w:tc>
+          <w:tcPr>
+            <w:tcW w:type="pct" w:w="16.666666666666668%"/>
+            <w:tcMar>
+              <w:top w:type="dxa" w:w="100"/>
+              <w:left w:type="dxa" w:w="100"/>
+              <w:bottom w:type="dxa" w:w="100"/>
+              <w:right w:type="dxa" w:w="100"/>
+            </w:tcMar>
+          </w:tcPr>
+          <w:p>
+            <w:r>
+              <w:rPr>
+                <w:sz w:val="20"/>
+                <w:szCs w:val="20"/>
+              </w:rPr>
+              <w:t xml:space="preserve">+2.2%</w:t>
+            </w:r>
+          </w:p>
+        </w:tc>
+        <w:tc>
+          <w:tcPr>
+            <w:tcW w:type="pct" w:w="16.666666666666668%"/>
+            <w:tcMar>
+              <w:top w:type="dxa" w:w="100"/>
+              <w:left w:type="dxa" w:w="100"/>
+              <w:bottom w:type="dxa" w:w="100"/>
+              <w:right w:type="dxa" w:w="100"/>
+            </w:tcMar>
+          </w:tcPr>
+          <w:p>
+            <w:r>
+              <w:rPr>
+                <w:sz w:val="20"/>
+                <w:szCs w:val="20"/>
+              </w:rPr>
+              <w:t xml:space="preserve">63.0%</w:t>
             </w:r>
           </w:p>
         </w:tc>
@@ -4658,87 +4673,87 @@
                 <w:sz w:val="20"/>
                 <w:szCs w:val="20"/>
               </w:rPr>
-              <w:t xml:space="preserve">0.324</w:t>
-            </w:r>
-          </w:p>
-        </w:tc>
-        <w:tc>
-          <w:tcPr>
-            <w:tcW w:type="pct" w:w="16.666666666666668%"/>
-            <w:tcMar>
-              <w:top w:type="dxa" w:w="100"/>
-              <w:left w:type="dxa" w:w="100"/>
-              <w:bottom w:type="dxa" w:w="100"/>
-              <w:right w:type="dxa" w:w="100"/>
-            </w:tcMar>
-          </w:tcPr>
-          <w:p>
-            <w:r>
-              <w:rPr>
-                <w:sz w:val="20"/>
-                <w:szCs w:val="20"/>
-              </w:rPr>
-              <w:t xml:space="preserve">0.340</w:t>
-            </w:r>
-          </w:p>
-        </w:tc>
-        <w:tc>
-          <w:tcPr>
-            <w:tcW w:type="pct" w:w="16.666666666666668%"/>
-            <w:tcMar>
-              <w:top w:type="dxa" w:w="100"/>
-              <w:left w:type="dxa" w:w="100"/>
-              <w:bottom w:type="dxa" w:w="100"/>
-              <w:right w:type="dxa" w:w="100"/>
-            </w:tcMar>
-          </w:tcPr>
-          <w:p>
-            <w:r>
-              <w:rPr>
-                <w:sz w:val="20"/>
-                <w:szCs w:val="20"/>
-              </w:rPr>
-              <w:t xml:space="preserve">0.348</w:t>
-            </w:r>
-          </w:p>
-        </w:tc>
-        <w:tc>
-          <w:tcPr>
-            <w:tcW w:type="pct" w:w="16.666666666666668%"/>
-            <w:tcMar>
-              <w:top w:type="dxa" w:w="100"/>
-              <w:left w:type="dxa" w:w="100"/>
-              <w:bottom w:type="dxa" w:w="100"/>
-              <w:right w:type="dxa" w:w="100"/>
-            </w:tcMar>
-          </w:tcPr>
-          <w:p>
-            <w:r>
-              <w:rPr>
-                <w:sz w:val="20"/>
-                <w:szCs w:val="20"/>
-              </w:rPr>
-              <w:t xml:space="preserve">+4.9%</w:t>
-            </w:r>
-          </w:p>
-        </w:tc>
-        <w:tc>
-          <w:tcPr>
-            <w:tcW w:type="pct" w:w="16.666666666666668%"/>
-            <w:tcMar>
-              <w:top w:type="dxa" w:w="100"/>
-              <w:left w:type="dxa" w:w="100"/>
-              <w:bottom w:type="dxa" w:w="100"/>
-              <w:right w:type="dxa" w:w="100"/>
-            </w:tcMar>
-          </w:tcPr>
-          <w:p>
-            <w:r>
-              <w:rPr>
-                <w:sz w:val="20"/>
-                <w:szCs w:val="20"/>
-              </w:rPr>
-              <w:t xml:space="preserve">46.2%*</w:t>
+              <w:t xml:space="preserve">0.333</w:t>
+            </w:r>
+          </w:p>
+        </w:tc>
+        <w:tc>
+          <w:tcPr>
+            <w:tcW w:type="pct" w:w="16.666666666666668%"/>
+            <w:tcMar>
+              <w:top w:type="dxa" w:w="100"/>
+              <w:left w:type="dxa" w:w="100"/>
+              <w:bottom w:type="dxa" w:w="100"/>
+              <w:right w:type="dxa" w:w="100"/>
+            </w:tcMar>
+          </w:tcPr>
+          <w:p>
+            <w:r>
+              <w:rPr>
+                <w:sz w:val="20"/>
+                <w:szCs w:val="20"/>
+              </w:rPr>
+              <w:t xml:space="preserve">0.347</w:t>
+            </w:r>
+          </w:p>
+        </w:tc>
+        <w:tc>
+          <w:tcPr>
+            <w:tcW w:type="pct" w:w="16.666666666666668%"/>
+            <w:tcMar>
+              <w:top w:type="dxa" w:w="100"/>
+              <w:left w:type="dxa" w:w="100"/>
+              <w:bottom w:type="dxa" w:w="100"/>
+              <w:right w:type="dxa" w:w="100"/>
+            </w:tcMar>
+          </w:tcPr>
+          <w:p>
+            <w:r>
+              <w:rPr>
+                <w:sz w:val="20"/>
+                <w:szCs w:val="20"/>
+              </w:rPr>
+              <w:t xml:space="preserve">0.359</w:t>
+            </w:r>
+          </w:p>
+        </w:tc>
+        <w:tc>
+          <w:tcPr>
+            <w:tcW w:type="pct" w:w="16.666666666666668%"/>
+            <w:tcMar>
+              <w:top w:type="dxa" w:w="100"/>
+              <w:left w:type="dxa" w:w="100"/>
+              <w:bottom w:type="dxa" w:w="100"/>
+              <w:right w:type="dxa" w:w="100"/>
+            </w:tcMar>
+          </w:tcPr>
+          <w:p>
+            <w:r>
+              <w:rPr>
+                <w:sz w:val="20"/>
+                <w:szCs w:val="20"/>
+              </w:rPr>
+              <w:t xml:space="preserve">+3.9%</w:t>
+            </w:r>
+          </w:p>
+        </w:tc>
+        <w:tc>
+          <w:tcPr>
+            <w:tcW w:type="pct" w:w="16.666666666666668%"/>
+            <w:tcMar>
+              <w:top w:type="dxa" w:w="100"/>
+              <w:left w:type="dxa" w:w="100"/>
+              <w:bottom w:type="dxa" w:w="100"/>
+              <w:right w:type="dxa" w:w="100"/>
+            </w:tcMar>
+          </w:tcPr>
+          <w:p>
+            <w:r>
+              <w:rPr>
+                <w:sz w:val="20"/>
+                <w:szCs w:val="20"/>
+              </w:rPr>
+              <w:t xml:space="preserve">48.6%*</w:t>
             </w:r>
           </w:p>
         </w:tc>
@@ -4780,87 +4795,87 @@
                 <w:sz w:val="20"/>
                 <w:szCs w:val="20"/>
               </w:rPr>
-              <w:t xml:space="preserve">0.308</w:t>
-            </w:r>
-          </w:p>
-        </w:tc>
-        <w:tc>
-          <w:tcPr>
-            <w:tcW w:type="pct" w:w="16.666666666666668%"/>
-            <w:tcMar>
-              <w:top w:type="dxa" w:w="100"/>
-              <w:left w:type="dxa" w:w="100"/>
-              <w:bottom w:type="dxa" w:w="100"/>
-              <w:right w:type="dxa" w:w="100"/>
-            </w:tcMar>
-          </w:tcPr>
-          <w:p>
-            <w:r>
-              <w:rPr>
-                <w:sz w:val="20"/>
-                <w:szCs w:val="20"/>
-              </w:rPr>
-              <w:t xml:space="preserve">0.317</w:t>
-            </w:r>
-          </w:p>
-        </w:tc>
-        <w:tc>
-          <w:tcPr>
-            <w:tcW w:type="pct" w:w="16.666666666666668%"/>
-            <w:tcMar>
-              <w:top w:type="dxa" w:w="100"/>
-              <w:left w:type="dxa" w:w="100"/>
-              <w:bottom w:type="dxa" w:w="100"/>
-              <w:right w:type="dxa" w:w="100"/>
-            </w:tcMar>
-          </w:tcPr>
-          <w:p>
-            <w:r>
-              <w:rPr>
-                <w:sz w:val="20"/>
-                <w:szCs w:val="20"/>
-              </w:rPr>
-              <w:t xml:space="preserve">0.351</w:t>
-            </w:r>
-          </w:p>
-        </w:tc>
-        <w:tc>
-          <w:tcPr>
-            <w:tcW w:type="pct" w:w="16.666666666666668%"/>
-            <w:tcMar>
-              <w:top w:type="dxa" w:w="100"/>
-              <w:left w:type="dxa" w:w="100"/>
-              <w:bottom w:type="dxa" w:w="100"/>
-              <w:right w:type="dxa" w:w="100"/>
-            </w:tcMar>
-          </w:tcPr>
-          <w:p>
-            <w:r>
-              <w:rPr>
-                <w:sz w:val="20"/>
-                <w:szCs w:val="20"/>
-              </w:rPr>
-              <w:t xml:space="preserve">+2.7%</w:t>
-            </w:r>
-          </w:p>
-        </w:tc>
-        <w:tc>
-          <w:tcPr>
-            <w:tcW w:type="pct" w:w="16.666666666666668%"/>
-            <w:tcMar>
-              <w:top w:type="dxa" w:w="100"/>
-              <w:left w:type="dxa" w:w="100"/>
-              <w:bottom w:type="dxa" w:w="100"/>
-              <w:right w:type="dxa" w:w="100"/>
-            </w:tcMar>
-          </w:tcPr>
-          <w:p>
-            <w:r>
-              <w:rPr>
-                <w:sz w:val="20"/>
-                <w:szCs w:val="20"/>
-              </w:rPr>
-              <w:t xml:space="preserve">50.8%*</w:t>
+              <w:t xml:space="preserve">0.293</w:t>
+            </w:r>
+          </w:p>
+        </w:tc>
+        <w:tc>
+          <w:tcPr>
+            <w:tcW w:type="pct" w:w="16.666666666666668%"/>
+            <w:tcMar>
+              <w:top w:type="dxa" w:w="100"/>
+              <w:left w:type="dxa" w:w="100"/>
+              <w:bottom w:type="dxa" w:w="100"/>
+              <w:right w:type="dxa" w:w="100"/>
+            </w:tcMar>
+          </w:tcPr>
+          <w:p>
+            <w:r>
+              <w:rPr>
+                <w:sz w:val="20"/>
+                <w:szCs w:val="20"/>
+              </w:rPr>
+              <w:t xml:space="preserve">0.312</w:t>
+            </w:r>
+          </w:p>
+        </w:tc>
+        <w:tc>
+          <w:tcPr>
+            <w:tcW w:type="pct" w:w="16.666666666666668%"/>
+            <w:tcMar>
+              <w:top w:type="dxa" w:w="100"/>
+              <w:left w:type="dxa" w:w="100"/>
+              <w:bottom w:type="dxa" w:w="100"/>
+              <w:right w:type="dxa" w:w="100"/>
+            </w:tcMar>
+          </w:tcPr>
+          <w:p>
+            <w:r>
+              <w:rPr>
+                <w:sz w:val="20"/>
+                <w:szCs w:val="20"/>
+              </w:rPr>
+              <w:t xml:space="preserve">0.335</w:t>
+            </w:r>
+          </w:p>
+        </w:tc>
+        <w:tc>
+          <w:tcPr>
+            <w:tcW w:type="pct" w:w="16.666666666666668%"/>
+            <w:tcMar>
+              <w:top w:type="dxa" w:w="100"/>
+              <w:left w:type="dxa" w:w="100"/>
+              <w:bottom w:type="dxa" w:w="100"/>
+              <w:right w:type="dxa" w:w="100"/>
+            </w:tcMar>
+          </w:tcPr>
+          <w:p>
+            <w:r>
+              <w:rPr>
+                <w:sz w:val="20"/>
+                <w:szCs w:val="20"/>
+              </w:rPr>
+              <w:t xml:space="preserve">+6.3%</w:t>
+            </w:r>
+          </w:p>
+        </w:tc>
+        <w:tc>
+          <w:tcPr>
+            <w:tcW w:type="pct" w:w="16.666666666666668%"/>
+            <w:tcMar>
+              <w:top w:type="dxa" w:w="100"/>
+              <w:left w:type="dxa" w:w="100"/>
+              <w:bottom w:type="dxa" w:w="100"/>
+              <w:right w:type="dxa" w:w="100"/>
+            </w:tcMar>
+          </w:tcPr>
+          <w:p>
+            <w:r>
+              <w:rPr>
+                <w:sz w:val="20"/>
+                <w:szCs w:val="20"/>
+              </w:rPr>
+              <w:t xml:space="preserve">52.4%*</w:t>
             </w:r>
           </w:p>
         </w:tc>
@@ -4902,87 +4917,87 @@
                 <w:sz w:val="20"/>
                 <w:szCs w:val="20"/>
               </w:rPr>
-              <w:t xml:space="preserve">0.333</w:t>
-            </w:r>
-          </w:p>
-        </w:tc>
-        <w:tc>
-          <w:tcPr>
-            <w:tcW w:type="pct" w:w="16.666666666666668%"/>
-            <w:tcMar>
-              <w:top w:type="dxa" w:w="100"/>
-              <w:left w:type="dxa" w:w="100"/>
-              <w:bottom w:type="dxa" w:w="100"/>
-              <w:right w:type="dxa" w:w="100"/>
-            </w:tcMar>
-          </w:tcPr>
-          <w:p>
-            <w:r>
-              <w:rPr>
-                <w:sz w:val="20"/>
-                <w:szCs w:val="20"/>
-              </w:rPr>
-              <w:t xml:space="preserve">0.390</w:t>
-            </w:r>
-          </w:p>
-        </w:tc>
-        <w:tc>
-          <w:tcPr>
-            <w:tcW w:type="pct" w:w="16.666666666666668%"/>
-            <w:tcMar>
-              <w:top w:type="dxa" w:w="100"/>
-              <w:left w:type="dxa" w:w="100"/>
-              <w:bottom w:type="dxa" w:w="100"/>
-              <w:right w:type="dxa" w:w="100"/>
-            </w:tcMar>
-          </w:tcPr>
-          <w:p>
-            <w:r>
-              <w:rPr>
-                <w:sz w:val="20"/>
-                <w:szCs w:val="20"/>
-              </w:rPr>
-              <w:t xml:space="preserve">0.336</w:t>
-            </w:r>
-          </w:p>
-        </w:tc>
-        <w:tc>
-          <w:tcPr>
-            <w:tcW w:type="pct" w:w="16.666666666666668%"/>
-            <w:tcMar>
-              <w:top w:type="dxa" w:w="100"/>
-              <w:left w:type="dxa" w:w="100"/>
-              <w:bottom w:type="dxa" w:w="100"/>
-              <w:right w:type="dxa" w:w="100"/>
-            </w:tcMar>
-          </w:tcPr>
-          <w:p>
-            <w:r>
-              <w:rPr>
-                <w:sz w:val="20"/>
-                <w:szCs w:val="20"/>
-              </w:rPr>
-              <w:t xml:space="preserve">+14.4%</w:t>
-            </w:r>
-          </w:p>
-        </w:tc>
-        <w:tc>
-          <w:tcPr>
-            <w:tcW w:type="pct" w:w="16.666666666666668%"/>
-            <w:tcMar>
-              <w:top w:type="dxa" w:w="100"/>
-              <w:left w:type="dxa" w:w="100"/>
-              <w:bottom w:type="dxa" w:w="100"/>
-              <w:right w:type="dxa" w:w="100"/>
-            </w:tcMar>
-          </w:tcPr>
-          <w:p>
-            <w:r>
-              <w:rPr>
-                <w:sz w:val="20"/>
-                <w:szCs w:val="20"/>
-              </w:rPr>
-              <w:t xml:space="preserve">69.9%</w:t>
+              <w:t xml:space="preserve">0.321</w:t>
+            </w:r>
+          </w:p>
+        </w:tc>
+        <w:tc>
+          <w:tcPr>
+            <w:tcW w:type="pct" w:w="16.666666666666668%"/>
+            <w:tcMar>
+              <w:top w:type="dxa" w:w="100"/>
+              <w:left w:type="dxa" w:w="100"/>
+              <w:bottom w:type="dxa" w:w="100"/>
+              <w:right w:type="dxa" w:w="100"/>
+            </w:tcMar>
+          </w:tcPr>
+          <w:p>
+            <w:r>
+              <w:rPr>
+                <w:sz w:val="20"/>
+                <w:szCs w:val="20"/>
+              </w:rPr>
+              <w:t xml:space="preserve">0.381</w:t>
+            </w:r>
+          </w:p>
+        </w:tc>
+        <w:tc>
+          <w:tcPr>
+            <w:tcW w:type="pct" w:w="16.666666666666668%"/>
+            <w:tcMar>
+              <w:top w:type="dxa" w:w="100"/>
+              <w:left w:type="dxa" w:w="100"/>
+              <w:bottom w:type="dxa" w:w="100"/>
+              <w:right w:type="dxa" w:w="100"/>
+            </w:tcMar>
+          </w:tcPr>
+          <w:p>
+            <w:r>
+              <w:rPr>
+                <w:sz w:val="20"/>
+                <w:szCs w:val="20"/>
+              </w:rPr>
+              <w:t xml:space="preserve">0.339</w:t>
+            </w:r>
+          </w:p>
+        </w:tc>
+        <w:tc>
+          <w:tcPr>
+            <w:tcW w:type="pct" w:w="16.666666666666668%"/>
+            <w:tcMar>
+              <w:top w:type="dxa" w:w="100"/>
+              <w:left w:type="dxa" w:w="100"/>
+              <w:bottom w:type="dxa" w:w="100"/>
+              <w:right w:type="dxa" w:w="100"/>
+            </w:tcMar>
+          </w:tcPr>
+          <w:p>
+            <w:r>
+              <w:rPr>
+                <w:sz w:val="20"/>
+                <w:szCs w:val="20"/>
+              </w:rPr>
+              <w:t xml:space="preserve">+15.8%</w:t>
+            </w:r>
+          </w:p>
+        </w:tc>
+        <w:tc>
+          <w:tcPr>
+            <w:tcW w:type="pct" w:w="16.666666666666668%"/>
+            <w:tcMar>
+              <w:top w:type="dxa" w:w="100"/>
+              <w:left w:type="dxa" w:w="100"/>
+              <w:bottom w:type="dxa" w:w="100"/>
+              <w:right w:type="dxa" w:w="100"/>
+            </w:tcMar>
+          </w:tcPr>
+          <w:p>
+            <w:r>
+              <w:rPr>
+                <w:sz w:val="20"/>
+                <w:szCs w:val="20"/>
+              </w:rPr>
+              <w:t xml:space="preserve">68.8%</w:t>
             </w:r>
           </w:p>
         </w:tc>
@@ -5013,21 +5028,21 @@
           <w:sz w:val="24"/>
           <w:szCs w:val="24"/>
         </w:rPr>
-        <w:t xml:space="preserve">The published forecast was more accurate than the naive persistence baseline for all eight rice types (mean skill +10.11%, lowest +2.43% for Imported Well-Milled) and more accurate than ARIMA(1,1,1) for all eight. Its mean absolute error was PHP 0.22 to 0.33 per kilogram. Pooled over the eight rice types, 87.2% of day-1 forecasts were within PHP 0.50 of the actual price (84.2% on day 2 and 81.9% on day 3) and 96.3% were within PHP 1.00. The published price ranges contained the actual price 91.5% of the time against a 90% target. A blocked rolling-origin check over five consecutive blocks of the test window gave a mean MAE of PHP 0.281 (standard deviation 0.073) for Local Well-Milled, showing that the accuracy is not driven by a single favourable period.</w:t>
-      </w:r>
-    </w:p>
-    <w:p>
-      <w:pPr>
-        <w:spacing w:after="200" w:line="360"/>
-        <w:ind w:firstLine="720"/>
-        <w:jc w:val="both"/>
-      </w:pPr>
-      <w:r>
-        <w:rPr>
-          <w:sz w:val="24"/>
-          <w:szCs w:val="24"/>
-        </w:rPr>
-        <w:t xml:space="preserve">The forecast direction was correct for 56.7% to 69.9% of actual day-1 moves for six of the eight rice types. For Imported Regular (46.2% of 208 moves) and Imported Premium (50.8%) it was not significantly different from chance, so the system should not be relied on for the up/down direction of those two types; their price level forecasts still beat both baselines.</w:t>
+        <w:t xml:space="preserve">The published forecast was more accurate than the naive persistence baseline for all eight rice types (mean skill +10.34%, lowest +2.25% for Imported Well-Milled) and more accurate than ARIMA(1,1,1) for all eight. Its mean absolute error was PHP 0.22 to 0.33 per kilogram. Pooled over the eight rice types, 87.4% of day-1 forecasts were within PHP 0.50 of the actual price (84.5% on day 2 and 82.3% on day 3) and 96.2% were within PHP 1.00. The published price ranges contained the actual price 90.9% of the time against a 90% target. A blocked rolling-origin check over five consecutive blocks of the test window gave a mean MAE of PHP 0.283 (standard deviation 0.069) for Local Well-Milled, showing that the accuracy is not driven by a single favourable period.</w:t>
+      </w:r>
+    </w:p>
+    <w:p>
+      <w:pPr>
+        <w:spacing w:after="200" w:line="360"/>
+        <w:ind w:firstLine="720"/>
+        <w:jc w:val="both"/>
+      </w:pPr>
+      <w:r>
+        <w:rPr>
+          <w:sz w:val="24"/>
+          <w:szCs w:val="24"/>
+        </w:rPr>
+        <w:t xml:space="preserve">The forecast direction was correct for 57.4% to 68.8% of actual day-1 moves for six of the eight rice types. For Imported Regular (48.6% of 208 moves) and Imported Premium (52.4%) it was not significantly different from chance, so the system should not be relied on for the up/down direction of those types; their price level forecasts still beat both baselines.</w:t>
       </w:r>
     </w:p>
     <w:p>
@@ -5057,21 +5072,21 @@
           <w:sz w:val="24"/>
           <w:szCs w:val="24"/>
         </w:rPr>
-        <w:t xml:space="preserve">The components were also scored separately on the same test window. The LSTM network on its own essentially repeated the last observed price (skill −1.29%), because most of its training data comes from the weekly era, in which about 82% of daily rows are unchanged carried-forward values. Adding the weekday mean-reversion term produced the LSTM hybrid, which beat the naive baseline for all eight rice types (skill +7.91%) and ARIMA for three of eight. Combining the hybrid with ARIMA and the Kalman filter produced the published ensemble (skill +10.11%, better than ARIMA for eight of eight). On the test window the three components received nearly equal average weights (about one third each), which is consistent with the finding that no single model dominated.</w:t>
-      </w:r>
-    </w:p>
-    <w:p>
-      <w:pPr>
-        <w:spacing w:after="200" w:line="360"/>
-        <w:ind w:firstLine="720"/>
-        <w:jc w:val="both"/>
-      </w:pPr>
-      <w:r>
-        <w:rPr>
-          <w:sz w:val="24"/>
-          <w:szCs w:val="24"/>
-        </w:rPr>
-        <w:t xml:space="preserve">A paired McNemar test on the forecasts where the LSTM hybrid and the mean-reversion term alone disagreed found no significant contribution from the network (154 forecasts improved versus 158 worsened, p = 0.87). Nine alternative training strategies were tested to change this and none improved accuracy on the test window. The researchers attribute this to the amount of genuinely daily data: only about 544 daily-observation days exist so far, and for a near-random-walk price series the most recent price is already close to the optimal short-term predictor. The accuracy gain over the baselines therefore comes from the mean-reversion structure and from forecast combination, not from the network alone. The LSTM remains in the system as the learned multivariate component, and its contribution should be re-tested as more daily data accumulates.</w:t>
+        <w:t xml:space="preserve">The components were also scored separately on the same test window. The LSTM network on its own essentially repeated the last observed price (skill −1.29% when last measured separately, in September 2026, before the rice history was rebuilt from official sources), because most of its training data comes from the record before 2025, in which about 92% of daily rows repeat the previous price (monthly PSA figures to September 2018, then DA prevailing prices quoted in whole pesos that change on few days). Adding the weekday mean-reversion term produced the LSTM hybrid, which beat the naive baseline for all eight rice types (skill +8.03%) and ARIMA for six of eight. Combining the hybrid with ARIMA and the Kalman filter produced the published ensemble (skill +10.34%, better than ARIMA for eight of eight). Because ARIMA's parameters depend on how much history it is fitted on, it was also re-fitted from October 2018, from 2021 and from April 2025 only: the ensemble beat the best of these for every rice type, while the LSTM hybrid beat it for six of eight. On the test window the three components received nearly equal average weights (about one third each), which is consistent with the finding that no single model dominated.</w:t>
+      </w:r>
+    </w:p>
+    <w:p>
+      <w:pPr>
+        <w:spacing w:after="200" w:line="360"/>
+        <w:ind w:firstLine="720"/>
+        <w:jc w:val="both"/>
+      </w:pPr>
+      <w:r>
+        <w:rPr>
+          <w:sz w:val="24"/>
+          <w:szCs w:val="24"/>
+        </w:rPr>
+        <w:t xml:space="preserve">A paired McNemar test on the forecasts where the LSTM hybrid and the mean-reversion term alone disagreed found no significant contribution from the network (113 forecasts improved versus 120 worsened, p = 0.69). Nine alternative training strategies were tested to change this and none improved accuracy on the test window. Adding DA's daily bulletins for 2018–2022 roughly doubled the disagreements tested but did not change the verdict. The researchers attribute this to the amount of genuinely moving daily data: DA's earlier daily prevailing prices change on few days, only about 550 days of the Daily Price Index exist so far, and for a near-random-walk price series the most recent price is already close to the optimal short-term predictor. The accuracy gain over the baselines therefore comes from the mean-reversion structure and from forecast combination, not from the network alone. The LSTM remains in the system as the learned multivariate component, and its contribution should be re-tested as more daily data accumulates.</w:t>
       </w:r>
     </w:p>
     <w:p>
@@ -5128,7 +5143,7 @@
           <w:sz w:val="24"/>
           <w:szCs w:val="24"/>
         </w:rPr>
-        <w:t xml:space="preserve">The data processing engine collects the DA-AMAS rice price bulletin, the Department of Energy's weekly NCR fuel price bulletin, and the USD–PHP exchange rate automatically every 24 hours and stores them in a local SQLite database. At the time of writing the database holds 4,018 historical retail price records (2015–2025) and 273 daily 2026 rice price records through September 30, 2026, together with fuel, exchange-rate, stock and farmgate series. The position-based PDF reader correctly maps prices to their rice types in saved bulletins that contain missing ("n/a") values, which previously shifted imported rice prices into the wrong column; the plausibility guard holds suspicious readings for administrator review instead of saving them. These behaviours are covered by the automated test suite (102 tests, all passing). After each successful scrape the published forecast is rebuilt automatically, so the website reflects a new DA bulletin without a server restart.</w:t>
+        <w:t xml:space="preserve">The data processing engine collects the DA-AMAS rice price bulletin, the Department of Energy's weekly NCR fuel price bulletin, and the USD–PHP exchange rate automatically every 24 hours and stores them in a local SQLite database. At the time of writing the database holds 4,018 daily historical retail price records (2015–2025, every one traced to a PSA or DA publication, including 939 days read automatically from 1,645 archived DA daily bulletins in seven different layouts; bulletins in an unrecognised layout, image-only pages and range-only bulletins are listed for review instead of being guessed) and 279 daily 2026 rice price records through October 6, 2026, together with fuel, exchange-rate, stock and farmgate series. The position-based PDF reader correctly maps prices to their rice types in saved bulletins that contain missing ("n/a") values, which previously shifted imported rice prices into the wrong column; the plausibility guard holds suspicious readings for administrator review instead of saving them. These behaviours are covered by the automated test suite (193 tests; the 161 that run offline all pass, and the other 32 check the live web server). After each successful scrape the published forecast is rebuilt automatically, so the website reflects a new DA bulletin without a server restart.</w:t>
       </w:r>
     </w:p>
     <w:p>
@@ -5201,7 +5216,7 @@
           <w:sz w:val="24"/>
           <w:szCs w:val="24"/>
         </w:rPr>
-        <w:t xml:space="preserve">AgriPrice forecasts the retail price of eight rice types in the NCR one to three days ahead. On a held-out test window of almost one year, its published forecast was more accurate than both naive persistence and ARIMA(1,1,1) for all eight rice types (mean skill +10.11% over persistence), with a mean absolute error of PHP 0.22 to 0.33 per kilogram and price ranges that contained the actual price 91.5% of the time. Its up/down direction was reliable for six of the eight rice types. The LSTM network alone did not add significant accuracy at the current amount of daily data; the gain came from the weekday mean-reversion structure and the adaptive combination with ARIMA and a Kalman filter. The data engine collects and validates the inputs automatically every day.</w:t>
+        <w:t xml:space="preserve">AgriPrice forecasts the retail price of eight rice types in the NCR one to three days ahead. On a held-out test window of almost one year, its published forecast was more accurate than both naive persistence and ARIMA(1,1,1) for all eight rice types (mean skill +10.34% over persistence), with a mean absolute error of PHP 0.22 to 0.33 per kilogram and price ranges that contained the actual price 90.9% of the time. Its up/down direction was reliable for six of the eight rice types. The LSTM network alone did not add significant accuracy at the current amount of daily data; the gain came from the weekday mean-reversion structure and the adaptive combination with ARIMA and a Kalman filter. The data engine collects and validates the inputs automatically every day.</w:t>
       </w:r>
     </w:p>
     <w:p>

</xml_diff>